<commit_message>
update: thesis 10/25 remove space
</commit_message>
<xml_diff>
--- a/docs/thesis/論文本文-楊宏傑.docx
+++ b/docs/thesis/論文本文-楊宏傑.docx
@@ -591,6 +591,7 @@
           <w:szCs w:val="40"/>
         </w:rPr>
       </w:pPr>
+      <w:proofErr w:type="gramStart"/>
       <w:r>
         <w:rPr>
           <w:rFonts w:ascii="Times New Roman" w:eastAsia="標楷體" w:hAnsi="Times New Roman" w:cs="Times New Roman"/>
@@ -600,7 +601,18 @@
           <w:szCs w:val="40"/>
         </w:rPr>
         <w:lastRenderedPageBreak/>
-        <w:t>誌謝</w:t>
+        <w:t>誌</w:t>
+      </w:r>
+      <w:proofErr w:type="gramEnd"/>
+      <w:r>
+        <w:rPr>
+          <w:rFonts w:ascii="Times New Roman" w:eastAsia="標楷體" w:hAnsi="Times New Roman" w:cs="Times New Roman"/>
+          <w:b/>
+          <w:bCs/>
+          <w:sz w:val="40"/>
+          <w:szCs w:val="40"/>
+        </w:rPr>
+        <w:t>謝</w:t>
       </w:r>
     </w:p>
     <w:p>
@@ -4133,7 +4145,7 @@
         <w:spacing w:line="360" w:lineRule="auto"/>
         <w:jc w:val="both"/>
         <w:rPr>
-          <w:rFonts w:ascii="Times New Roman" w:eastAsia="標楷體" w:hAnsi="Times New Roman" w:cs="Times New Roman" w:hint="eastAsia"/>
+          <w:rFonts w:ascii="Times New Roman" w:eastAsia="標楷體" w:hAnsi="Times New Roman" w:cs="Times New Roman"/>
           <w:sz w:val="24"/>
           <w:szCs w:val="24"/>
         </w:rPr>
@@ -4251,7 +4263,27 @@
           <w:sz w:val="24"/>
           <w:szCs w:val="24"/>
         </w:rPr>
-        <w:t>，降低人工規劃的介入並提升路線規劃效率。然而，啟發式方法通常易受初始設定影響，且在大規模或複雜限制條件下難以取得接近全域最優解。</w:t>
+        <w:t>，降低人工規劃的介入並提升路線規劃效率。然而，啟發式方法通常</w:t>
+      </w:r>
+      <w:proofErr w:type="gramStart"/>
+      <w:r>
+        <w:rPr>
+          <w:rFonts w:ascii="Times New Roman" w:eastAsia="標楷體" w:hAnsi="Times New Roman" w:cs="Times New Roman" w:hint="eastAsia"/>
+          <w:color w:val="00B0F0"/>
+          <w:sz w:val="24"/>
+          <w:szCs w:val="24"/>
+        </w:rPr>
+        <w:t>易受初始</w:t>
+      </w:r>
+      <w:proofErr w:type="gramEnd"/>
+      <w:r>
+        <w:rPr>
+          <w:rFonts w:ascii="Times New Roman" w:eastAsia="標楷體" w:hAnsi="Times New Roman" w:cs="Times New Roman" w:hint="eastAsia"/>
+          <w:color w:val="00B0F0"/>
+          <w:sz w:val="24"/>
+          <w:szCs w:val="24"/>
+        </w:rPr>
+        <w:t>設定影響，且在大規模或複雜限制條件下難以取得接近全域最優解。</w:t>
       </w:r>
     </w:p>
     <w:p>
@@ -4274,6 +4306,7 @@
         </w:rPr>
         <w:t>「</w:t>
       </w:r>
+      <w:proofErr w:type="gramStart"/>
       <w:r>
         <w:rPr>
           <w:rFonts w:ascii="Times New Roman" w:eastAsia="標楷體" w:hAnsi="Times New Roman" w:cs="Times New Roman"/>
@@ -4282,6 +4315,7 @@
         </w:rPr>
         <w:t>全台物流</w:t>
       </w:r>
+      <w:proofErr w:type="gramEnd"/>
       <w:r>
         <w:rPr>
           <w:rFonts w:ascii="Times New Roman" w:eastAsia="標楷體" w:hAnsi="Times New Roman" w:cs="Times New Roman" w:hint="eastAsia"/>
@@ -4304,39 +4338,43 @@
           <w:sz w:val="24"/>
           <w:szCs w:val="24"/>
         </w:rPr>
-        <w:t>店舖</w:t>
-      </w:r>
+        <w:t>店</w:t>
+      </w:r>
+      <w:proofErr w:type="gramStart"/>
       <w:r>
         <w:rPr>
           <w:rFonts w:ascii="Times New Roman" w:eastAsia="標楷體" w:hAnsi="Times New Roman" w:cs="Times New Roman"/>
           <w:sz w:val="24"/>
           <w:szCs w:val="24"/>
         </w:rPr>
-        <w:t>。全省分成七個物流中心，每個物流中心均負責所轄區域的配送作業。以林口物流中心</w:t>
-      </w:r>
+        <w:t>舖</w:t>
+      </w:r>
+      <w:proofErr w:type="gramEnd"/>
       <w:r>
         <w:rPr>
           <w:rFonts w:ascii="Times New Roman" w:eastAsia="標楷體" w:hAnsi="Times New Roman" w:cs="Times New Roman"/>
           <w:sz w:val="24"/>
           <w:szCs w:val="24"/>
         </w:rPr>
-        <w:t>(Delivery Center, DC)</w:t>
-      </w:r>
+        <w:t>。全省分成七個物流中心，每</w:t>
+      </w:r>
+      <w:proofErr w:type="gramStart"/>
       <w:r>
         <w:rPr>
           <w:rFonts w:ascii="Times New Roman" w:eastAsia="標楷體" w:hAnsi="Times New Roman" w:cs="Times New Roman"/>
           <w:sz w:val="24"/>
           <w:szCs w:val="24"/>
         </w:rPr>
-        <w:t>為例，每日</w:t>
-      </w:r>
-      <w:r>
-        <w:rPr>
-          <w:rFonts w:ascii="Times New Roman" w:eastAsia="標楷體" w:hAnsi="Times New Roman" w:cs="Times New Roman" w:hint="eastAsia"/>
+        <w:t>個</w:t>
+      </w:r>
+      <w:proofErr w:type="gramEnd"/>
+      <w:r>
+        <w:rPr>
+          <w:rFonts w:ascii="Times New Roman" w:eastAsia="標楷體" w:hAnsi="Times New Roman" w:cs="Times New Roman"/>
           <w:sz w:val="24"/>
           <w:szCs w:val="24"/>
         </w:rPr>
-        <w:t>需</w:t>
+        <w:t>物流中心均負責所轄區域的配送作業。以林口物流中心</w:t>
       </w:r>
       <w:r>
         <w:rPr>
@@ -4344,7 +4382,7 @@
           <w:sz w:val="24"/>
           <w:szCs w:val="24"/>
         </w:rPr>
-        <w:t>配送約</w:t>
+        <w:t>(Delivery Center, DC)</w:t>
       </w:r>
       <w:r>
         <w:rPr>
@@ -4352,15 +4390,15 @@
           <w:sz w:val="24"/>
           <w:szCs w:val="24"/>
         </w:rPr>
-        <w:t>800</w:t>
-      </w:r>
-      <w:r>
-        <w:rPr>
-          <w:rFonts w:ascii="Times New Roman" w:eastAsia="標楷體" w:hAnsi="Times New Roman" w:cs="Times New Roman"/>
+        <w:t>為例，每日</w:t>
+      </w:r>
+      <w:r>
+        <w:rPr>
+          <w:rFonts w:ascii="Times New Roman" w:eastAsia="標楷體" w:hAnsi="Times New Roman" w:cs="Times New Roman" w:hint="eastAsia"/>
           <w:sz w:val="24"/>
           <w:szCs w:val="24"/>
         </w:rPr>
-        <w:t>家</w:t>
+        <w:t>需</w:t>
       </w:r>
       <w:r>
         <w:rPr>
@@ -4368,7 +4406,7 @@
           <w:sz w:val="24"/>
           <w:szCs w:val="24"/>
         </w:rPr>
-        <w:t>店舖</w:t>
+        <w:t>配送約</w:t>
       </w:r>
       <w:r>
         <w:rPr>
@@ -4376,7 +4414,7 @@
           <w:sz w:val="24"/>
           <w:szCs w:val="24"/>
         </w:rPr>
-        <w:t>，所需規劃的配送路線約</w:t>
+        <w:t>800</w:t>
       </w:r>
       <w:r>
         <w:rPr>
@@ -4384,7 +4422,7 @@
           <w:sz w:val="24"/>
           <w:szCs w:val="24"/>
         </w:rPr>
-        <w:t>80</w:t>
+        <w:t>家</w:t>
       </w:r>
       <w:r>
         <w:rPr>
@@ -4392,23 +4430,25 @@
           <w:sz w:val="24"/>
           <w:szCs w:val="24"/>
         </w:rPr>
-        <w:t>條路線，每條路線涵蓋約</w:t>
-      </w:r>
+        <w:t>店</w:t>
+      </w:r>
+      <w:proofErr w:type="gramStart"/>
       <w:r>
         <w:rPr>
           <w:rFonts w:ascii="Times New Roman" w:eastAsia="標楷體" w:hAnsi="Times New Roman" w:cs="Times New Roman"/>
           <w:sz w:val="24"/>
           <w:szCs w:val="24"/>
         </w:rPr>
-        <w:t>10</w:t>
-      </w:r>
+        <w:t>舖</w:t>
+      </w:r>
+      <w:proofErr w:type="gramEnd"/>
       <w:r>
         <w:rPr>
           <w:rFonts w:ascii="Times New Roman" w:eastAsia="標楷體" w:hAnsi="Times New Roman" w:cs="Times New Roman"/>
           <w:sz w:val="24"/>
           <w:szCs w:val="24"/>
         </w:rPr>
-        <w:t>至</w:t>
+        <w:t>，所需規劃的配送路線約</w:t>
       </w:r>
       <w:r>
         <w:rPr>
@@ -4416,7 +4456,7 @@
           <w:sz w:val="24"/>
           <w:szCs w:val="24"/>
         </w:rPr>
-        <w:t>15</w:t>
+        <w:t>80</w:t>
       </w:r>
       <w:r>
         <w:rPr>
@@ -4424,7 +4464,7 @@
           <w:sz w:val="24"/>
           <w:szCs w:val="24"/>
         </w:rPr>
-        <w:t>家</w:t>
+        <w:t>條路線，每條路線涵蓋約</w:t>
       </w:r>
       <w:r>
         <w:rPr>
@@ -4432,8 +4472,50 @@
           <w:sz w:val="24"/>
           <w:szCs w:val="24"/>
         </w:rPr>
-        <w:t>店舖</w:t>
-      </w:r>
+        <w:t>10</w:t>
+      </w:r>
+      <w:r>
+        <w:rPr>
+          <w:rFonts w:ascii="Times New Roman" w:eastAsia="標楷體" w:hAnsi="Times New Roman" w:cs="Times New Roman"/>
+          <w:sz w:val="24"/>
+          <w:szCs w:val="24"/>
+        </w:rPr>
+        <w:t>至</w:t>
+      </w:r>
+      <w:r>
+        <w:rPr>
+          <w:rFonts w:ascii="Times New Roman" w:eastAsia="標楷體" w:hAnsi="Times New Roman" w:cs="Times New Roman"/>
+          <w:sz w:val="24"/>
+          <w:szCs w:val="24"/>
+        </w:rPr>
+        <w:t>15</w:t>
+      </w:r>
+      <w:r>
+        <w:rPr>
+          <w:rFonts w:ascii="Times New Roman" w:eastAsia="標楷體" w:hAnsi="Times New Roman" w:cs="Times New Roman"/>
+          <w:sz w:val="24"/>
+          <w:szCs w:val="24"/>
+        </w:rPr>
+        <w:t>家</w:t>
+      </w:r>
+      <w:r>
+        <w:rPr>
+          <w:rFonts w:ascii="Times New Roman" w:eastAsia="標楷體" w:hAnsi="Times New Roman" w:cs="Times New Roman"/>
+          <w:sz w:val="24"/>
+          <w:szCs w:val="24"/>
+        </w:rPr>
+        <w:t>店</w:t>
+      </w:r>
+      <w:proofErr w:type="gramStart"/>
+      <w:r>
+        <w:rPr>
+          <w:rFonts w:ascii="Times New Roman" w:eastAsia="標楷體" w:hAnsi="Times New Roman" w:cs="Times New Roman"/>
+          <w:sz w:val="24"/>
+          <w:szCs w:val="24"/>
+        </w:rPr>
+        <w:t>舖</w:t>
+      </w:r>
+      <w:proofErr w:type="gramEnd"/>
       <w:r>
         <w:rPr>
           <w:rFonts w:ascii="Times New Roman" w:eastAsia="標楷體" w:hAnsi="Times New Roman" w:cs="Times New Roman"/>
@@ -4466,7 +4548,7 @@
         <w:ind w:firstLine="480"/>
         <w:jc w:val="both"/>
         <w:rPr>
-          <w:rFonts w:ascii="Times New Roman" w:eastAsia="標楷體" w:hAnsi="Times New Roman" w:cs="Times New Roman" w:hint="eastAsia"/>
+          <w:rFonts w:ascii="Times New Roman" w:eastAsia="標楷體" w:hAnsi="Times New Roman" w:cs="Times New Roman"/>
           <w:sz w:val="24"/>
           <w:szCs w:val="24"/>
         </w:rPr>
@@ -4485,23 +4567,25 @@
           <w:sz w:val="24"/>
           <w:szCs w:val="24"/>
         </w:rPr>
-        <w:t>店舖</w:t>
-      </w:r>
+        <w:t>店</w:t>
+      </w:r>
+      <w:proofErr w:type="gramStart"/>
       <w:r>
         <w:rPr>
           <w:rFonts w:ascii="Times New Roman" w:eastAsia="標楷體" w:hAnsi="Times New Roman" w:cs="Times New Roman"/>
           <w:sz w:val="24"/>
           <w:szCs w:val="24"/>
         </w:rPr>
-        <w:t>。其</w:t>
-      </w:r>
+        <w:t>舖</w:t>
+      </w:r>
+      <w:proofErr w:type="gramEnd"/>
       <w:r>
         <w:rPr>
           <w:rFonts w:ascii="Times New Roman" w:eastAsia="標楷體" w:hAnsi="Times New Roman" w:cs="Times New Roman"/>
           <w:sz w:val="24"/>
           <w:szCs w:val="24"/>
         </w:rPr>
-        <w:t>店舖</w:t>
+        <w:t>。其</w:t>
       </w:r>
       <w:r>
         <w:rPr>
@@ -4509,23 +4593,25 @@
           <w:sz w:val="24"/>
           <w:szCs w:val="24"/>
         </w:rPr>
-        <w:t>包含訂定的配送貨物量、配送時間、地址、配送工時。但因</w:t>
-      </w:r>
+        <w:t>店</w:t>
+      </w:r>
+      <w:proofErr w:type="gramStart"/>
       <w:r>
         <w:rPr>
           <w:rFonts w:ascii="Times New Roman" w:eastAsia="標楷體" w:hAnsi="Times New Roman" w:cs="Times New Roman"/>
           <w:sz w:val="24"/>
           <w:szCs w:val="24"/>
         </w:rPr>
-        <w:t>店舖</w:t>
-      </w:r>
+        <w:t>舖</w:t>
+      </w:r>
+      <w:proofErr w:type="gramEnd"/>
       <w:r>
         <w:rPr>
           <w:rFonts w:ascii="Times New Roman" w:eastAsia="標楷體" w:hAnsi="Times New Roman" w:cs="Times New Roman"/>
           <w:sz w:val="24"/>
           <w:szCs w:val="24"/>
         </w:rPr>
-        <w:t>每日實際所需的配送貨量可能因各種因素而有所變動，因此當主線超過可承載的貨物量時，便需要額外規劃其他配送車進行配送，或者由其他配送車協助進行配送，再根據</w:t>
+        <w:t>包含訂定的配送貨物量、配送時間、地址、配送工時。但因</w:t>
       </w:r>
       <w:r>
         <w:rPr>
@@ -4533,14 +4619,50 @@
           <w:sz w:val="24"/>
           <w:szCs w:val="24"/>
         </w:rPr>
-        <w:t>店舖</w:t>
-      </w:r>
+        <w:t>店</w:t>
+      </w:r>
+      <w:proofErr w:type="gramStart"/>
       <w:r>
         <w:rPr>
           <w:rFonts w:ascii="Times New Roman" w:eastAsia="標楷體" w:hAnsi="Times New Roman" w:cs="Times New Roman"/>
           <w:sz w:val="24"/>
           <w:szCs w:val="24"/>
         </w:rPr>
+        <w:t>舖</w:t>
+      </w:r>
+      <w:proofErr w:type="gramEnd"/>
+      <w:r>
+        <w:rPr>
+          <w:rFonts w:ascii="Times New Roman" w:eastAsia="標楷體" w:hAnsi="Times New Roman" w:cs="Times New Roman"/>
+          <w:sz w:val="24"/>
+          <w:szCs w:val="24"/>
+        </w:rPr>
+        <w:t>每日實際所需的配送貨量可能因各種因素而有所變動，因此當主線超過可承載的貨物量時，便需要額外規劃其他配送車進行配送，或者由其他配送車協助進行配送，再根據</w:t>
+      </w:r>
+      <w:r>
+        <w:rPr>
+          <w:rFonts w:ascii="Times New Roman" w:eastAsia="標楷體" w:hAnsi="Times New Roman" w:cs="Times New Roman"/>
+          <w:sz w:val="24"/>
+          <w:szCs w:val="24"/>
+        </w:rPr>
+        <w:t>店</w:t>
+      </w:r>
+      <w:proofErr w:type="gramStart"/>
+      <w:r>
+        <w:rPr>
+          <w:rFonts w:ascii="Times New Roman" w:eastAsia="標楷體" w:hAnsi="Times New Roman" w:cs="Times New Roman"/>
+          <w:sz w:val="24"/>
+          <w:szCs w:val="24"/>
+        </w:rPr>
+        <w:t>舖</w:t>
+      </w:r>
+      <w:proofErr w:type="gramEnd"/>
+      <w:r>
+        <w:rPr>
+          <w:rFonts w:ascii="Times New Roman" w:eastAsia="標楷體" w:hAnsi="Times New Roman" w:cs="Times New Roman"/>
+          <w:sz w:val="24"/>
+          <w:szCs w:val="24"/>
+        </w:rPr>
         <w:t>所訂定的限制條件進行組合規劃。</w:t>
       </w:r>
     </w:p>
@@ -4549,7 +4671,7 @@
         <w:spacing w:line="360" w:lineRule="auto"/>
         <w:jc w:val="both"/>
         <w:rPr>
-          <w:rFonts w:ascii="Times New Roman" w:eastAsia="標楷體" w:hAnsi="Times New Roman" w:cs="Times New Roman" w:hint="eastAsia"/>
+          <w:rFonts w:ascii="Times New Roman" w:eastAsia="標楷體" w:hAnsi="Times New Roman" w:cs="Times New Roman"/>
           <w:color w:val="00B0F0"/>
         </w:rPr>
       </w:pPr>
@@ -4606,8 +4728,17 @@
           <w:rFonts w:ascii="Times New Roman" w:eastAsia="標楷體" w:hAnsi="Times New Roman" w:cs="Times New Roman" w:hint="eastAsia"/>
           <w:color w:val="00B0F0"/>
         </w:rPr>
-        <w:t>演算法，如蟻群演算法</w:t>
-      </w:r>
+        <w:t>演算法，</w:t>
+      </w:r>
+      <w:proofErr w:type="gramStart"/>
+      <w:r>
+        <w:rPr>
+          <w:rFonts w:ascii="Times New Roman" w:eastAsia="標楷體" w:hAnsi="Times New Roman" w:cs="Times New Roman" w:hint="eastAsia"/>
+          <w:color w:val="00B0F0"/>
+        </w:rPr>
+        <w:t>如蟻群演算法</w:t>
+      </w:r>
+      <w:proofErr w:type="gramEnd"/>
       <w:r>
         <w:rPr>
           <w:rFonts w:ascii="Times New Roman" w:eastAsia="標楷體" w:hAnsi="Times New Roman" w:cs="Times New Roman" w:hint="eastAsia"/>
@@ -5040,7 +5171,7 @@
         <w:rPr>
           <w:rFonts w:ascii="Times New Roman" w:eastAsia="標楷體" w:hAnsi="Times New Roman" w:cs="Times New Roman"/>
         </w:rPr>
-        <w:t xml:space="preserve"> (Vehicle Routing Problem, VRP)</w:t>
+        <w:t>(Vehicle Routing Problem, VRP)</w:t>
       </w:r>
       <w:r>
         <w:rPr>
@@ -5184,7 +5315,7 @@
         <w:rPr>
           <w:rFonts w:ascii="Times New Roman" w:eastAsia="標楷體" w:hAnsi="Times New Roman" w:cs="Times New Roman"/>
         </w:rPr>
-        <w:t xml:space="preserve"> (Vehicle Routing Problem with Time Windows</w:t>
+        <w:t>(Vehicle Routing Problem with Time Windows</w:t>
       </w:r>
       <w:r>
         <w:rPr>
@@ -5220,7 +5351,7 @@
         <w:rPr>
           <w:rFonts w:ascii="Times New Roman" w:eastAsia="標楷體" w:hAnsi="Times New Roman" w:cs="Times New Roman"/>
         </w:rPr>
-        <w:t xml:space="preserve"> (</w:t>
+        <w:t>(</w:t>
       </w:r>
       <w:r>
         <w:rPr>
@@ -5274,7 +5405,7 @@
         <w:rPr>
           <w:rFonts w:ascii="Times New Roman" w:eastAsia="標楷體" w:hAnsi="Times New Roman" w:cs="Times New Roman"/>
         </w:rPr>
-        <w:t xml:space="preserve"> (Multi-Depot </w:t>
+        <w:t xml:space="preserve">(Multi-Depot </w:t>
       </w:r>
       <w:r>
         <w:rPr>
@@ -5398,7 +5529,21 @@
         <w:rPr>
           <w:rFonts w:ascii="Times New Roman" w:eastAsia="標楷體" w:hAnsi="Times New Roman" w:cs="Times New Roman"/>
         </w:rPr>
-        <w:t>每個顧客僅允許被</w:t>
+        <w:t>每</w:t>
+      </w:r>
+      <w:proofErr w:type="gramStart"/>
+      <w:r>
+        <w:rPr>
+          <w:rFonts w:ascii="Times New Roman" w:eastAsia="標楷體" w:hAnsi="Times New Roman" w:cs="Times New Roman"/>
+        </w:rPr>
+        <w:t>個</w:t>
+      </w:r>
+      <w:proofErr w:type="gramEnd"/>
+      <w:r>
+        <w:rPr>
+          <w:rFonts w:ascii="Times New Roman" w:eastAsia="標楷體" w:hAnsi="Times New Roman" w:cs="Times New Roman"/>
+        </w:rPr>
+        <w:t>顧客僅允許被</w:t>
       </w:r>
       <w:r>
         <w:rPr>
@@ -5454,7 +5599,21 @@
         <w:rPr>
           <w:rFonts w:ascii="Times New Roman" w:eastAsia="標楷體" w:hAnsi="Times New Roman" w:cs="Times New Roman"/>
         </w:rPr>
-        <w:t>每個顧客都必須完成</w:t>
+        <w:t>每</w:t>
+      </w:r>
+      <w:proofErr w:type="gramStart"/>
+      <w:r>
+        <w:rPr>
+          <w:rFonts w:ascii="Times New Roman" w:eastAsia="標楷體" w:hAnsi="Times New Roman" w:cs="Times New Roman"/>
+        </w:rPr>
+        <w:t>個</w:t>
+      </w:r>
+      <w:proofErr w:type="gramEnd"/>
+      <w:r>
+        <w:rPr>
+          <w:rFonts w:ascii="Times New Roman" w:eastAsia="標楷體" w:hAnsi="Times New Roman" w:cs="Times New Roman"/>
+        </w:rPr>
+        <w:t>顧客都必須完成</w:t>
       </w:r>
       <w:r>
         <w:rPr>
@@ -5533,13 +5692,41 @@
         <w:rPr>
           <w:rFonts w:ascii="Times New Roman" w:eastAsia="標楷體" w:hAnsi="Times New Roman" w:cs="Times New Roman"/>
         </w:rPr>
-        <w:t>中最基本且最常見的變形之一。其核心目標是規劃一組同質車輛從配送中心出發，</w:t>
-      </w:r>
-      <w:r>
-        <w:rPr>
-          <w:rFonts w:ascii="Times New Roman" w:eastAsia="標楷體" w:hAnsi="Times New Roman" w:cs="Times New Roman"/>
-        </w:rPr>
-        <w:t>每輛車的最大載貨量為固定值，</w:t>
+        <w:t>中最基本且最常見的變形之</w:t>
+      </w:r>
+      <w:proofErr w:type="gramStart"/>
+      <w:r>
+        <w:rPr>
+          <w:rFonts w:ascii="Times New Roman" w:eastAsia="標楷體" w:hAnsi="Times New Roman" w:cs="Times New Roman"/>
+        </w:rPr>
+        <w:t>一</w:t>
+      </w:r>
+      <w:proofErr w:type="gramEnd"/>
+      <w:r>
+        <w:rPr>
+          <w:rFonts w:ascii="Times New Roman" w:eastAsia="標楷體" w:hAnsi="Times New Roman" w:cs="Times New Roman"/>
+        </w:rPr>
+        <w:t>。其核心目標是規劃一組同質車輛從配送中心出發，</w:t>
+      </w:r>
+      <w:r>
+        <w:rPr>
+          <w:rFonts w:ascii="Times New Roman" w:eastAsia="標楷體" w:hAnsi="Times New Roman" w:cs="Times New Roman"/>
+        </w:rPr>
+        <w:t>每輛車的最大載貨量為</w:t>
+      </w:r>
+      <w:proofErr w:type="gramStart"/>
+      <w:r>
+        <w:rPr>
+          <w:rFonts w:ascii="Times New Roman" w:eastAsia="標楷體" w:hAnsi="Times New Roman" w:cs="Times New Roman"/>
+        </w:rPr>
+        <w:t>固定值</w:t>
+      </w:r>
+      <w:proofErr w:type="gramEnd"/>
+      <w:r>
+        <w:rPr>
+          <w:rFonts w:ascii="Times New Roman" w:eastAsia="標楷體" w:hAnsi="Times New Roman" w:cs="Times New Roman"/>
+        </w:rPr>
+        <w:t>，</w:t>
       </w:r>
       <w:r>
         <w:rPr>
@@ -5809,17 +5996,25 @@
           <w:rFonts w:ascii="Times New Roman" w:eastAsia="標楷體" w:hAnsi="Times New Roman" w:cs="Times New Roman"/>
         </w:rPr>
       </w:pPr>
-      <w:r>
-        <w:rPr>
-          <w:rFonts w:ascii="Times New Roman" w:eastAsia="標楷體" w:hAnsi="Times New Roman" w:cs="Times New Roman"/>
-        </w:rPr>
-        <w:t>多目標蟻群最佳化演算法</w:t>
-      </w:r>
-      <w:r>
-        <w:rPr>
-          <w:rFonts w:ascii="Times New Roman" w:eastAsia="標楷體" w:hAnsi="Times New Roman" w:cs="Times New Roman"/>
-        </w:rPr>
-        <w:t xml:space="preserve"> (</w:t>
+      <w:proofErr w:type="gramStart"/>
+      <w:r>
+        <w:rPr>
+          <w:rFonts w:ascii="Times New Roman" w:eastAsia="標楷體" w:hAnsi="Times New Roman" w:cs="Times New Roman"/>
+        </w:rPr>
+        <w:t>多目標蟻群最佳化</w:t>
+      </w:r>
+      <w:proofErr w:type="gramEnd"/>
+      <w:r>
+        <w:rPr>
+          <w:rFonts w:ascii="Times New Roman" w:eastAsia="標楷體" w:hAnsi="Times New Roman" w:cs="Times New Roman"/>
+        </w:rPr>
+        <w:t>演算法</w:t>
+      </w:r>
+      <w:r>
+        <w:rPr>
+          <w:rFonts w:ascii="Times New Roman" w:eastAsia="標楷體" w:hAnsi="Times New Roman" w:cs="Times New Roman"/>
+        </w:rPr>
+        <w:t>(</w:t>
       </w:r>
       <w:r>
         <w:rPr>
@@ -5831,31 +6026,27 @@
         <w:rPr>
           <w:rFonts w:ascii="Times New Roman" w:eastAsia="標楷體" w:hAnsi="Times New Roman" w:cs="Times New Roman"/>
         </w:rPr>
-        <w:t xml:space="preserve">) </w:t>
-      </w:r>
-      <w:r>
-        <w:rPr>
-          <w:rFonts w:ascii="Times New Roman" w:eastAsia="標楷體" w:hAnsi="Times New Roman" w:cs="Times New Roman"/>
-        </w:rPr>
-        <w:t>是</w:t>
-      </w:r>
-      <w:r>
-        <w:rPr>
-          <w:rFonts w:ascii="Times New Roman" w:eastAsia="標楷體" w:hAnsi="Times New Roman" w:cs="Times New Roman"/>
-        </w:rPr>
-        <w:t xml:space="preserve"> </w:t>
-      </w:r>
-      <w:r>
-        <w:rPr>
-          <w:rFonts w:ascii="Times New Roman" w:eastAsia="標楷體" w:hAnsi="Times New Roman" w:cs="Times New Roman"/>
-        </w:rPr>
-        <w:t>蟻群最佳化演算法</w:t>
-      </w:r>
-      <w:r>
-        <w:rPr>
-          <w:rFonts w:ascii="Times New Roman" w:eastAsia="標楷體" w:hAnsi="Times New Roman" w:cs="Times New Roman"/>
-        </w:rPr>
-        <w:t xml:space="preserve"> (Ant Colony Optimization, ACO) </w:t>
+        <w:t>)</w:t>
+      </w:r>
+      <w:proofErr w:type="gramStart"/>
+      <w:r>
+        <w:rPr>
+          <w:rFonts w:ascii="Times New Roman" w:eastAsia="標楷體" w:hAnsi="Times New Roman" w:cs="Times New Roman"/>
+        </w:rPr>
+        <w:t>是蟻群最佳化</w:t>
+      </w:r>
+      <w:proofErr w:type="gramEnd"/>
+      <w:r>
+        <w:rPr>
+          <w:rFonts w:ascii="Times New Roman" w:eastAsia="標楷體" w:hAnsi="Times New Roman" w:cs="Times New Roman"/>
+        </w:rPr>
+        <w:t>演算法</w:t>
+      </w:r>
+      <w:r>
+        <w:rPr>
+          <w:rFonts w:ascii="Times New Roman" w:eastAsia="標楷體" w:hAnsi="Times New Roman" w:cs="Times New Roman"/>
+        </w:rPr>
+        <w:t>(Ant Colony Optimization, ACO)</w:t>
       </w:r>
       <w:r>
         <w:rPr>
@@ -5867,7 +6058,7 @@
         <w:rPr>
           <w:rFonts w:ascii="Times New Roman" w:eastAsia="標楷體" w:hAnsi="Times New Roman" w:cs="Times New Roman"/>
         </w:rPr>
-        <w:t xml:space="preserve"> (</w:t>
+        <w:t>(</w:t>
       </w:r>
       <w:r>
         <w:rPr>
@@ -6051,6 +6242,7 @@
           <w:rFonts w:ascii="Times New Roman" w:eastAsia="標楷體" w:hAnsi="Times New Roman" w:cs="Times New Roman"/>
         </w:rPr>
       </w:pPr>
+      <w:proofErr w:type="gramStart"/>
       <w:r>
         <w:rPr>
           <w:rFonts w:ascii="Times New Roman" w:eastAsia="標楷體" w:hAnsi="Times New Roman" w:cs="Times New Roman"/>
@@ -6063,6 +6255,7 @@
         </w:rPr>
         <w:t>最佳化</w:t>
       </w:r>
+      <w:proofErr w:type="gramEnd"/>
       <w:r>
         <w:rPr>
           <w:rFonts w:ascii="Times New Roman" w:eastAsia="標楷體" w:hAnsi="Times New Roman" w:cs="Times New Roman"/>
@@ -6073,7 +6266,7 @@
         <w:rPr>
           <w:rFonts w:ascii="Times New Roman" w:eastAsia="標楷體" w:hAnsi="Times New Roman" w:cs="Times New Roman"/>
         </w:rPr>
-        <w:t xml:space="preserve"> (Ant Colony Optimization, ACO) </w:t>
+        <w:t>(Ant Colony Optimization, ACO)</w:t>
       </w:r>
       <w:r>
         <w:rPr>
@@ -6085,7 +6278,7 @@
         <w:rPr>
           <w:rFonts w:ascii="Times New Roman" w:eastAsia="標楷體" w:hAnsi="Times New Roman" w:cs="Times New Roman"/>
         </w:rPr>
-        <w:t>Marco Dorigo []</w:t>
+        <w:t>Marco Dorigo[]</w:t>
       </w:r>
       <w:r>
         <w:rPr>
@@ -6119,21 +6312,9 @@
       </w:r>
       <w:r>
         <w:rPr>
-          <w:rFonts w:ascii="Times New Roman" w:eastAsia="標楷體" w:hAnsi="Times New Roman" w:cs="Times New Roman"/>
-        </w:rPr>
-        <w:t>X</w:t>
-      </w:r>
-      <w:r>
-        <w:rPr>
-          <w:rFonts w:ascii="Times New Roman" w:eastAsia="標楷體" w:hAnsi="Times New Roman" w:cs="Times New Roman" w:hint="eastAsia"/>
-        </w:rPr>
-        <w:t>.-L.</w:t>
-      </w:r>
-      <w:r>
-        <w:rPr>
-          <w:rFonts w:ascii="Times New Roman" w:eastAsia="標楷體" w:hAnsi="Times New Roman" w:cs="Times New Roman" w:hint="eastAsia"/>
-        </w:rPr>
-        <w:t xml:space="preserve"> Shi</w:t>
+          <w:rFonts w:ascii="Times New Roman" w:eastAsia="標楷體" w:hAnsi="Times New Roman" w:cs="Times New Roman" w:hint="eastAsia"/>
+        </w:rPr>
+        <w:t>Shi</w:t>
       </w:r>
       <w:r>
         <w:rPr>
@@ -6165,12 +6346,14 @@
         </w:rPr>
         <w:t>，提出</w:t>
       </w:r>
+      <w:proofErr w:type="gramStart"/>
       <w:r>
         <w:rPr>
           <w:rFonts w:ascii="Times New Roman" w:eastAsia="標楷體" w:hAnsi="Times New Roman" w:cs="Times New Roman"/>
         </w:rPr>
         <w:t>分散式蟻群系統</w:t>
       </w:r>
+      <w:proofErr w:type="gramEnd"/>
       <w:r>
         <w:rPr>
           <w:rFonts w:ascii="Times New Roman" w:eastAsia="標楷體" w:hAnsi="Times New Roman" w:cs="Times New Roman" w:hint="eastAsia"/>
@@ -6541,8 +6724,16 @@
         <w:rPr>
           <w:rFonts w:ascii="Times New Roman" w:eastAsia="標楷體" w:hAnsi="Times New Roman" w:cs="Times New Roman"/>
         </w:rPr>
-        <w:t>店舖</w:t>
-      </w:r>
+        <w:t>店</w:t>
+      </w:r>
+      <w:proofErr w:type="gramStart"/>
+      <w:r>
+        <w:rPr>
+          <w:rFonts w:ascii="Times New Roman" w:eastAsia="標楷體" w:hAnsi="Times New Roman" w:cs="Times New Roman"/>
+        </w:rPr>
+        <w:t>舖</w:t>
+      </w:r>
+      <w:proofErr w:type="gramEnd"/>
       <w:r>
         <w:rPr>
           <w:rFonts w:ascii="Times New Roman" w:eastAsia="標楷體" w:hAnsi="Times New Roman" w:cs="Times New Roman"/>
@@ -6571,8 +6762,16 @@
         <w:rPr>
           <w:rFonts w:ascii="Times New Roman" w:eastAsia="標楷體" w:hAnsi="Times New Roman" w:cs="Times New Roman"/>
         </w:rPr>
-        <w:t>店舖</w:t>
-      </w:r>
+        <w:t>店</w:t>
+      </w:r>
+      <w:proofErr w:type="gramStart"/>
+      <w:r>
+        <w:rPr>
+          <w:rFonts w:ascii="Times New Roman" w:eastAsia="標楷體" w:hAnsi="Times New Roman" w:cs="Times New Roman"/>
+        </w:rPr>
+        <w:t>舖</w:t>
+      </w:r>
+      <w:proofErr w:type="gramEnd"/>
       <w:r>
         <w:rPr>
           <w:rFonts w:ascii="Times New Roman" w:eastAsia="標楷體" w:hAnsi="Times New Roman" w:cs="Times New Roman"/>
@@ -6640,7 +6839,21 @@
         <w:rPr>
           <w:rFonts w:ascii="Times New Roman" w:eastAsia="標楷體" w:hAnsi="Times New Roman" w:cs="Times New Roman"/>
         </w:rPr>
-        <w:t>在不更動主線配送</w:t>
+        <w:t>在</w:t>
+      </w:r>
+      <w:proofErr w:type="gramStart"/>
+      <w:r>
+        <w:rPr>
+          <w:rFonts w:ascii="Times New Roman" w:eastAsia="標楷體" w:hAnsi="Times New Roman" w:cs="Times New Roman"/>
+        </w:rPr>
+        <w:t>不</w:t>
+      </w:r>
+      <w:proofErr w:type="gramEnd"/>
+      <w:r>
+        <w:rPr>
+          <w:rFonts w:ascii="Times New Roman" w:eastAsia="標楷體" w:hAnsi="Times New Roman" w:cs="Times New Roman"/>
+        </w:rPr>
+        <w:t>更動主線配送</w:t>
       </w:r>
       <w:r>
         <w:rPr>
@@ -6700,8 +6913,16 @@
         <w:rPr>
           <w:rFonts w:ascii="Times New Roman" w:eastAsia="標楷體" w:hAnsi="Times New Roman" w:cs="Times New Roman"/>
         </w:rPr>
-        <w:t>店舖</w:t>
-      </w:r>
+        <w:t>店</w:t>
+      </w:r>
+      <w:proofErr w:type="gramStart"/>
+      <w:r>
+        <w:rPr>
+          <w:rFonts w:ascii="Times New Roman" w:eastAsia="標楷體" w:hAnsi="Times New Roman" w:cs="Times New Roman"/>
+        </w:rPr>
+        <w:t>舖</w:t>
+      </w:r>
+      <w:proofErr w:type="gramEnd"/>
       <w:r>
         <w:rPr>
           <w:rFonts w:ascii="Times New Roman" w:eastAsia="標楷體" w:hAnsi="Times New Roman" w:cs="Times New Roman"/>
@@ -6817,8 +7038,16 @@
         <w:rPr>
           <w:rFonts w:ascii="Times New Roman" w:eastAsia="標楷體" w:hAnsi="Times New Roman" w:cs="Times New Roman"/>
         </w:rPr>
-        <w:t>在配送過程中，本研究根據「全台物流</w:t>
-      </w:r>
+        <w:t>在配送過程中，本研究根據「</w:t>
+      </w:r>
+      <w:proofErr w:type="gramStart"/>
+      <w:r>
+        <w:rPr>
+          <w:rFonts w:ascii="Times New Roman" w:eastAsia="標楷體" w:hAnsi="Times New Roman" w:cs="Times New Roman"/>
+        </w:rPr>
+        <w:t>全台物流</w:t>
+      </w:r>
+      <w:proofErr w:type="gramEnd"/>
       <w:r>
         <w:rPr>
           <w:rFonts w:ascii="Times New Roman" w:eastAsia="標楷體" w:hAnsi="Times New Roman" w:cs="Times New Roman" w:hint="eastAsia"/>
@@ -6867,13 +7096,35 @@
         <w:rPr>
           <w:rFonts w:ascii="Times New Roman" w:eastAsia="標楷體" w:hAnsi="Times New Roman" w:cs="Times New Roman"/>
         </w:rPr>
-        <w:t>店舖</w:t>
-      </w:r>
-      <w:r>
-        <w:rPr>
-          <w:rFonts w:ascii="Times New Roman" w:eastAsia="標楷體" w:hAnsi="Times New Roman" w:cs="Times New Roman"/>
-        </w:rPr>
-        <w:t>的貨物材積量來計算，總貨物材積量除以配送車最大裝載容量得到支援車數量</w:t>
+        <w:t>店</w:t>
+      </w:r>
+      <w:proofErr w:type="gramStart"/>
+      <w:r>
+        <w:rPr>
+          <w:rFonts w:ascii="Times New Roman" w:eastAsia="標楷體" w:hAnsi="Times New Roman" w:cs="Times New Roman"/>
+        </w:rPr>
+        <w:t>舖</w:t>
+      </w:r>
+      <w:proofErr w:type="gramEnd"/>
+      <w:r>
+        <w:rPr>
+          <w:rFonts w:ascii="Times New Roman" w:eastAsia="標楷體" w:hAnsi="Times New Roman" w:cs="Times New Roman"/>
+        </w:rPr>
+        <w:t>的貨物材積量來計算，總貨物</w:t>
+      </w:r>
+      <w:proofErr w:type="gramStart"/>
+      <w:r>
+        <w:rPr>
+          <w:rFonts w:ascii="Times New Roman" w:eastAsia="標楷體" w:hAnsi="Times New Roman" w:cs="Times New Roman"/>
+        </w:rPr>
+        <w:t>材積量除以</w:t>
+      </w:r>
+      <w:proofErr w:type="gramEnd"/>
+      <w:r>
+        <w:rPr>
+          <w:rFonts w:ascii="Times New Roman" w:eastAsia="標楷體" w:hAnsi="Times New Roman" w:cs="Times New Roman"/>
+        </w:rPr>
+        <w:t>配送車最大裝載容量得到支援車數量</w:t>
       </w:r>
       <w:r>
         <w:rPr>
@@ -6931,8 +7182,16 @@
         <w:rPr>
           <w:rFonts w:ascii="Times New Roman" w:eastAsia="標楷體" w:hAnsi="Times New Roman" w:cs="Times New Roman"/>
         </w:rPr>
-        <w:t>店舖</w:t>
-      </w:r>
+        <w:t>店</w:t>
+      </w:r>
+      <w:proofErr w:type="gramStart"/>
+      <w:r>
+        <w:rPr>
+          <w:rFonts w:ascii="Times New Roman" w:eastAsia="標楷體" w:hAnsi="Times New Roman" w:cs="Times New Roman"/>
+        </w:rPr>
+        <w:t>舖</w:t>
+      </w:r>
+      <w:proofErr w:type="gramEnd"/>
       <w:r>
         <w:rPr>
           <w:rFonts w:ascii="Times New Roman" w:eastAsia="標楷體" w:hAnsi="Times New Roman" w:cs="Times New Roman"/>
@@ -6955,8 +7214,16 @@
         <w:rPr>
           <w:rFonts w:ascii="Times New Roman" w:eastAsia="標楷體" w:hAnsi="Times New Roman" w:cs="Times New Roman"/>
         </w:rPr>
-        <w:t>，到店時間應於表定</w:t>
-      </w:r>
+        <w:t>，到店時間</w:t>
+      </w:r>
+      <w:proofErr w:type="gramStart"/>
+      <w:r>
+        <w:rPr>
+          <w:rFonts w:ascii="Times New Roman" w:eastAsia="標楷體" w:hAnsi="Times New Roman" w:cs="Times New Roman"/>
+        </w:rPr>
+        <w:t>應於表定</w:t>
+      </w:r>
+      <w:proofErr w:type="gramEnd"/>
       <w:r>
         <w:rPr>
           <w:rFonts w:ascii="Times New Roman" w:eastAsia="標楷體" w:hAnsi="Times New Roman" w:cs="Times New Roman"/>
@@ -7067,8 +7334,16 @@
         <w:rPr>
           <w:rFonts w:ascii="Times New Roman" w:eastAsia="標楷體" w:hAnsi="Times New Roman" w:cs="Times New Roman"/>
         </w:rPr>
-        <w:t>店舖</w:t>
-      </w:r>
+        <w:t>店</w:t>
+      </w:r>
+      <w:proofErr w:type="gramStart"/>
+      <w:r>
+        <w:rPr>
+          <w:rFonts w:ascii="Times New Roman" w:eastAsia="標楷體" w:hAnsi="Times New Roman" w:cs="Times New Roman"/>
+        </w:rPr>
+        <w:t>舖</w:t>
+      </w:r>
+      <w:proofErr w:type="gramEnd"/>
       <w:r>
         <w:rPr>
           <w:rFonts w:ascii="Times New Roman" w:eastAsia="標楷體" w:hAnsi="Times New Roman" w:cs="Times New Roman"/>
@@ -7079,8 +7354,16 @@
         <w:rPr>
           <w:rFonts w:ascii="Times New Roman" w:eastAsia="標楷體" w:hAnsi="Times New Roman" w:cs="Times New Roman"/>
         </w:rPr>
-        <w:t>店舖</w:t>
-      </w:r>
+        <w:t>店</w:t>
+      </w:r>
+      <w:proofErr w:type="gramStart"/>
+      <w:r>
+        <w:rPr>
+          <w:rFonts w:ascii="Times New Roman" w:eastAsia="標楷體" w:hAnsi="Times New Roman" w:cs="Times New Roman"/>
+        </w:rPr>
+        <w:t>舖</w:t>
+      </w:r>
+      <w:proofErr w:type="gramEnd"/>
       <w:r>
         <w:rPr>
           <w:rFonts w:ascii="Times New Roman" w:eastAsia="標楷體" w:hAnsi="Times New Roman" w:cs="Times New Roman"/>
@@ -7117,8 +7400,16 @@
         <w:rPr>
           <w:rFonts w:ascii="Times New Roman" w:eastAsia="標楷體" w:hAnsi="Times New Roman" w:cs="Times New Roman"/>
         </w:rPr>
-        <w:t>店舖</w:t>
-      </w:r>
+        <w:t>店</w:t>
+      </w:r>
+      <w:proofErr w:type="gramStart"/>
+      <w:r>
+        <w:rPr>
+          <w:rFonts w:ascii="Times New Roman" w:eastAsia="標楷體" w:hAnsi="Times New Roman" w:cs="Times New Roman"/>
+        </w:rPr>
+        <w:t>舖</w:t>
+      </w:r>
+      <w:proofErr w:type="gramEnd"/>
       <w:r>
         <w:rPr>
           <w:rFonts w:ascii="Times New Roman" w:eastAsia="標楷體" w:hAnsi="Times New Roman" w:cs="Times New Roman"/>
@@ -7149,38 +7440,76 @@
         <w:rPr>
           <w:rFonts w:ascii="Times New Roman" w:eastAsia="標楷體" w:hAnsi="Times New Roman" w:cs="Times New Roman"/>
         </w:rPr>
+        <w:t>店</w:t>
+      </w:r>
+      <w:proofErr w:type="gramStart"/>
+      <w:r>
+        <w:rPr>
+          <w:rFonts w:ascii="Times New Roman" w:eastAsia="標楷體" w:hAnsi="Times New Roman" w:cs="Times New Roman"/>
+        </w:rPr>
+        <w:t>舖</w:t>
+      </w:r>
+      <w:proofErr w:type="gramEnd"/>
+      <w:r>
+        <w:rPr>
+          <w:rFonts w:ascii="Times New Roman" w:eastAsia="標楷體" w:hAnsi="Times New Roman" w:cs="Times New Roman"/>
+        </w:rPr>
+        <w:t>分為近、中和</w:t>
+      </w:r>
+      <w:proofErr w:type="gramStart"/>
+      <w:r>
+        <w:rPr>
+          <w:rFonts w:ascii="Times New Roman" w:eastAsia="標楷體" w:hAnsi="Times New Roman" w:cs="Times New Roman"/>
+        </w:rPr>
+        <w:t>遠區</w:t>
+      </w:r>
+      <w:r>
+        <w:rPr>
+          <w:rFonts w:ascii="Times New Roman" w:eastAsia="標楷體" w:hAnsi="Times New Roman" w:cs="Times New Roman"/>
+        </w:rPr>
+        <w:t>，近區</w:t>
+      </w:r>
+      <w:proofErr w:type="gramEnd"/>
+      <w:r>
+        <w:rPr>
+          <w:rFonts w:ascii="Times New Roman" w:eastAsia="標楷體" w:hAnsi="Times New Roman" w:cs="Times New Roman"/>
+        </w:rPr>
+        <w:t>與中區</w:t>
+      </w:r>
+      <w:r>
+        <w:rPr>
+          <w:rFonts w:ascii="Times New Roman" w:eastAsia="標楷體" w:hAnsi="Times New Roman" w:cs="Times New Roman"/>
+        </w:rPr>
+        <w:t>店</w:t>
+      </w:r>
+      <w:proofErr w:type="gramStart"/>
+      <w:r>
+        <w:rPr>
+          <w:rFonts w:ascii="Times New Roman" w:eastAsia="標楷體" w:hAnsi="Times New Roman" w:cs="Times New Roman"/>
+        </w:rPr>
+        <w:t>舖</w:t>
+      </w:r>
+      <w:proofErr w:type="gramEnd"/>
+      <w:r>
+        <w:rPr>
+          <w:rFonts w:ascii="Times New Roman" w:eastAsia="標楷體" w:hAnsi="Times New Roman" w:cs="Times New Roman"/>
+        </w:rPr>
+        <w:t>無需考慮方向問題，</w:t>
+      </w:r>
+      <w:proofErr w:type="gramStart"/>
+      <w:r>
+        <w:rPr>
+          <w:rFonts w:ascii="Times New Roman" w:eastAsia="標楷體" w:hAnsi="Times New Roman" w:cs="Times New Roman"/>
+        </w:rPr>
+        <w:t>遠區</w:t>
+      </w:r>
+      <w:r>
+        <w:rPr>
+          <w:rFonts w:ascii="Times New Roman" w:eastAsia="標楷體" w:hAnsi="Times New Roman" w:cs="Times New Roman"/>
+        </w:rPr>
         <w:t>店舖</w:t>
       </w:r>
-      <w:r>
-        <w:rPr>
-          <w:rFonts w:ascii="Times New Roman" w:eastAsia="標楷體" w:hAnsi="Times New Roman" w:cs="Times New Roman"/>
-        </w:rPr>
-        <w:t>分為近、中和遠區</w:t>
-      </w:r>
-      <w:r>
-        <w:rPr>
-          <w:rFonts w:ascii="Times New Roman" w:eastAsia="標楷體" w:hAnsi="Times New Roman" w:cs="Times New Roman"/>
-        </w:rPr>
-        <w:t>，近區與中區</w:t>
-      </w:r>
-      <w:r>
-        <w:rPr>
-          <w:rFonts w:ascii="Times New Roman" w:eastAsia="標楷體" w:hAnsi="Times New Roman" w:cs="Times New Roman"/>
-        </w:rPr>
-        <w:t>店舖</w:t>
-      </w:r>
-      <w:r>
-        <w:rPr>
-          <w:rFonts w:ascii="Times New Roman" w:eastAsia="標楷體" w:hAnsi="Times New Roman" w:cs="Times New Roman"/>
-        </w:rPr>
-        <w:t>無需考慮方向問題，遠區</w:t>
-      </w:r>
-      <w:r>
-        <w:rPr>
-          <w:rFonts w:ascii="Times New Roman" w:eastAsia="標楷體" w:hAnsi="Times New Roman" w:cs="Times New Roman"/>
-        </w:rPr>
-        <w:t>店舖</w:t>
-      </w:r>
+      <w:proofErr w:type="gramEnd"/>
       <w:r>
         <w:rPr>
           <w:rFonts w:ascii="Times New Roman" w:eastAsia="標楷體" w:hAnsi="Times New Roman" w:cs="Times New Roman"/>
@@ -7191,8 +7520,16 @@
         <w:rPr>
           <w:rFonts w:ascii="Times New Roman" w:eastAsia="標楷體" w:hAnsi="Times New Roman" w:cs="Times New Roman"/>
         </w:rPr>
-        <w:t>店舖</w:t>
-      </w:r>
+        <w:t>店</w:t>
+      </w:r>
+      <w:proofErr w:type="gramStart"/>
+      <w:r>
+        <w:rPr>
+          <w:rFonts w:ascii="Times New Roman" w:eastAsia="標楷體" w:hAnsi="Times New Roman" w:cs="Times New Roman"/>
+        </w:rPr>
+        <w:t>舖</w:t>
+      </w:r>
+      <w:proofErr w:type="gramEnd"/>
       <w:r>
         <w:rPr>
           <w:rFonts w:ascii="Times New Roman" w:eastAsia="標楷體" w:hAnsi="Times New Roman" w:cs="Times New Roman"/>
@@ -7203,8 +7540,16 @@
         <w:rPr>
           <w:rFonts w:ascii="Times New Roman" w:eastAsia="標楷體" w:hAnsi="Times New Roman" w:cs="Times New Roman"/>
         </w:rPr>
-        <w:t>店舖</w:t>
-      </w:r>
+        <w:t>店</w:t>
+      </w:r>
+      <w:proofErr w:type="gramStart"/>
+      <w:r>
+        <w:rPr>
+          <w:rFonts w:ascii="Times New Roman" w:eastAsia="標楷體" w:hAnsi="Times New Roman" w:cs="Times New Roman"/>
+        </w:rPr>
+        <w:t>舖</w:t>
+      </w:r>
+      <w:proofErr w:type="gramEnd"/>
       <w:r>
         <w:rPr>
           <w:rFonts w:ascii="Times New Roman" w:eastAsia="標楷體" w:hAnsi="Times New Roman" w:cs="Times New Roman"/>
@@ -7215,8 +7560,16 @@
         <w:rPr>
           <w:rFonts w:ascii="Times New Roman" w:eastAsia="標楷體" w:hAnsi="Times New Roman" w:cs="Times New Roman"/>
         </w:rPr>
-        <w:t>店舖</w:t>
-      </w:r>
+        <w:t>店</w:t>
+      </w:r>
+      <w:proofErr w:type="gramStart"/>
+      <w:r>
+        <w:rPr>
+          <w:rFonts w:ascii="Times New Roman" w:eastAsia="標楷體" w:hAnsi="Times New Roman" w:cs="Times New Roman"/>
+        </w:rPr>
+        <w:t>舖</w:t>
+      </w:r>
+      <w:proofErr w:type="gramEnd"/>
       <w:r>
         <w:rPr>
           <w:rFonts w:ascii="Times New Roman" w:eastAsia="標楷體" w:hAnsi="Times New Roman" w:cs="Times New Roman"/>
@@ -7290,8 +7643,16 @@
         <w:rPr>
           <w:rFonts w:ascii="Times New Roman" w:eastAsia="標楷體" w:hAnsi="Times New Roman" w:cs="Times New Roman"/>
         </w:rPr>
-        <w:t>店舖</w:t>
-      </w:r>
+        <w:t>店</w:t>
+      </w:r>
+      <w:proofErr w:type="gramStart"/>
+      <w:r>
+        <w:rPr>
+          <w:rFonts w:ascii="Times New Roman" w:eastAsia="標楷體" w:hAnsi="Times New Roman" w:cs="Times New Roman"/>
+        </w:rPr>
+        <w:t>舖</w:t>
+      </w:r>
+      <w:proofErr w:type="gramEnd"/>
       <w:r>
         <w:rPr>
           <w:rFonts w:ascii="Times New Roman" w:eastAsia="標楷體" w:hAnsi="Times New Roman" w:cs="Times New Roman"/>
@@ -7323,8 +7684,16 @@
         <w:rPr>
           <w:rFonts w:ascii="Times New Roman" w:eastAsia="標楷體" w:hAnsi="Times New Roman" w:cs="Times New Roman"/>
         </w:rPr>
-        <w:t>店舖</w:t>
-      </w:r>
+        <w:t>店</w:t>
+      </w:r>
+      <w:proofErr w:type="gramStart"/>
+      <w:r>
+        <w:rPr>
+          <w:rFonts w:ascii="Times New Roman" w:eastAsia="標楷體" w:hAnsi="Times New Roman" w:cs="Times New Roman"/>
+        </w:rPr>
+        <w:t>舖</w:t>
+      </w:r>
+      <w:proofErr w:type="gramEnd"/>
       <w:r>
         <w:rPr>
           <w:rFonts w:ascii="Times New Roman" w:eastAsia="標楷體" w:hAnsi="Times New Roman" w:cs="Times New Roman"/>
@@ -7368,8 +7737,16 @@
         <w:rPr>
           <w:rFonts w:ascii="Times New Roman" w:eastAsia="標楷體" w:hAnsi="Times New Roman" w:cs="Times New Roman"/>
         </w:rPr>
-        <w:t>店舖</w:t>
-      </w:r>
+        <w:t>店</w:t>
+      </w:r>
+      <w:proofErr w:type="gramStart"/>
+      <w:r>
+        <w:rPr>
+          <w:rFonts w:ascii="Times New Roman" w:eastAsia="標楷體" w:hAnsi="Times New Roman" w:cs="Times New Roman"/>
+        </w:rPr>
+        <w:t>舖</w:t>
+      </w:r>
+      <w:proofErr w:type="gramEnd"/>
       <w:r>
         <w:rPr>
           <w:rFonts w:ascii="Times New Roman" w:eastAsia="標楷體" w:hAnsi="Times New Roman" w:cs="Times New Roman"/>
@@ -7380,8 +7757,16 @@
         <w:rPr>
           <w:rFonts w:ascii="Times New Roman" w:eastAsia="標楷體" w:hAnsi="Times New Roman" w:cs="Times New Roman"/>
         </w:rPr>
-        <w:t>店舖</w:t>
-      </w:r>
+        <w:t>店</w:t>
+      </w:r>
+      <w:proofErr w:type="gramStart"/>
+      <w:r>
+        <w:rPr>
+          <w:rFonts w:ascii="Times New Roman" w:eastAsia="標楷體" w:hAnsi="Times New Roman" w:cs="Times New Roman"/>
+        </w:rPr>
+        <w:t>舖</w:t>
+      </w:r>
+      <w:proofErr w:type="gramEnd"/>
       <w:r>
         <w:rPr>
           <w:rFonts w:ascii="Times New Roman" w:eastAsia="標楷體" w:hAnsi="Times New Roman" w:cs="Times New Roman"/>
@@ -7398,7 +7783,21 @@
         <w:rPr>
           <w:rFonts w:ascii="Times New Roman" w:eastAsia="標楷體" w:hAnsi="Times New Roman" w:cs="Times New Roman"/>
         </w:rPr>
-        <w:t>載重上限並向上取整。</w:t>
+        <w:t>載重上限並</w:t>
+      </w:r>
+      <w:proofErr w:type="gramStart"/>
+      <w:r>
+        <w:rPr>
+          <w:rFonts w:ascii="Times New Roman" w:eastAsia="標楷體" w:hAnsi="Times New Roman" w:cs="Times New Roman"/>
+        </w:rPr>
+        <w:t>向上取整</w:t>
+      </w:r>
+      <w:proofErr w:type="gramEnd"/>
+      <w:r>
+        <w:rPr>
+          <w:rFonts w:ascii="Times New Roman" w:eastAsia="標楷體" w:hAnsi="Times New Roman" w:cs="Times New Roman"/>
+        </w:rPr>
+        <w:t>。</w:t>
       </w:r>
     </w:p>
     <w:p>
@@ -7425,8 +7824,16 @@
         <w:rPr>
           <w:rFonts w:ascii="Times New Roman" w:eastAsia="標楷體" w:hAnsi="Times New Roman" w:cs="Times New Roman"/>
         </w:rPr>
-        <w:t>店舖</w:t>
-      </w:r>
+        <w:t>店</w:t>
+      </w:r>
+      <w:proofErr w:type="gramStart"/>
+      <w:r>
+        <w:rPr>
+          <w:rFonts w:ascii="Times New Roman" w:eastAsia="標楷體" w:hAnsi="Times New Roman" w:cs="Times New Roman"/>
+        </w:rPr>
+        <w:t>舖</w:t>
+      </w:r>
+      <w:proofErr w:type="gramEnd"/>
       <w:r>
         <w:rPr>
           <w:rFonts w:ascii="Times New Roman" w:eastAsia="標楷體" w:hAnsi="Times New Roman" w:cs="Times New Roman"/>
@@ -7449,8 +7856,16 @@
         <w:rPr>
           <w:rFonts w:ascii="Times New Roman" w:eastAsia="標楷體" w:hAnsi="Times New Roman" w:cs="Times New Roman"/>
         </w:rPr>
-        <w:t>店舖</w:t>
-      </w:r>
+        <w:t>店</w:t>
+      </w:r>
+      <w:proofErr w:type="gramStart"/>
+      <w:r>
+        <w:rPr>
+          <w:rFonts w:ascii="Times New Roman" w:eastAsia="標楷體" w:hAnsi="Times New Roman" w:cs="Times New Roman"/>
+        </w:rPr>
+        <w:t>舖</w:t>
+      </w:r>
+      <w:proofErr w:type="gramEnd"/>
       <w:r>
         <w:rPr>
           <w:rFonts w:ascii="Times New Roman" w:eastAsia="標楷體" w:hAnsi="Times New Roman" w:cs="Times New Roman"/>
@@ -7461,8 +7876,16 @@
         <w:rPr>
           <w:rFonts w:ascii="Times New Roman" w:eastAsia="標楷體" w:hAnsi="Times New Roman" w:cs="Times New Roman"/>
         </w:rPr>
-        <w:t>店舖</w:t>
-      </w:r>
+        <w:t>店</w:t>
+      </w:r>
+      <w:proofErr w:type="gramStart"/>
+      <w:r>
+        <w:rPr>
+          <w:rFonts w:ascii="Times New Roman" w:eastAsia="標楷體" w:hAnsi="Times New Roman" w:cs="Times New Roman"/>
+        </w:rPr>
+        <w:t>舖</w:t>
+      </w:r>
+      <w:proofErr w:type="gramEnd"/>
       <w:r>
         <w:rPr>
           <w:rFonts w:ascii="Times New Roman" w:eastAsia="標楷體" w:hAnsi="Times New Roman" w:cs="Times New Roman"/>
@@ -7494,32 +7917,92 @@
         <w:rPr>
           <w:rFonts w:ascii="Times New Roman" w:eastAsia="標楷體" w:hAnsi="Times New Roman" w:cs="Times New Roman"/>
         </w:rPr>
-        <w:t>店舖</w:t>
-      </w:r>
-      <w:r>
-        <w:rPr>
-          <w:rFonts w:ascii="Times New Roman" w:eastAsia="標楷體" w:hAnsi="Times New Roman" w:cs="Times New Roman"/>
-        </w:rPr>
-        <w:t>，則需額外規劃新的支援線，並根據其與物流中心的距離劃分為近區、中區與遠區</w:t>
-      </w:r>
+        <w:t>店</w:t>
+      </w:r>
+      <w:proofErr w:type="gramStart"/>
+      <w:r>
+        <w:rPr>
+          <w:rFonts w:ascii="Times New Roman" w:eastAsia="標楷體" w:hAnsi="Times New Roman" w:cs="Times New Roman"/>
+        </w:rPr>
+        <w:t>舖</w:t>
+      </w:r>
+      <w:proofErr w:type="gramEnd"/>
+      <w:r>
+        <w:rPr>
+          <w:rFonts w:ascii="Times New Roman" w:eastAsia="標楷體" w:hAnsi="Times New Roman" w:cs="Times New Roman"/>
+        </w:rPr>
+        <w:t>，則需額外規劃新的支援線，並根據其與物流中心的距離劃分</w:t>
+      </w:r>
+      <w:proofErr w:type="gramStart"/>
+      <w:r>
+        <w:rPr>
+          <w:rFonts w:ascii="Times New Roman" w:eastAsia="標楷體" w:hAnsi="Times New Roman" w:cs="Times New Roman"/>
+        </w:rPr>
+        <w:t>為近區</w:t>
+      </w:r>
+      <w:proofErr w:type="gramEnd"/>
+      <w:r>
+        <w:rPr>
+          <w:rFonts w:ascii="Times New Roman" w:eastAsia="標楷體" w:hAnsi="Times New Roman" w:cs="Times New Roman"/>
+        </w:rPr>
+        <w:t>、中區</w:t>
+      </w:r>
+      <w:proofErr w:type="gramStart"/>
+      <w:r>
+        <w:rPr>
+          <w:rFonts w:ascii="Times New Roman" w:eastAsia="標楷體" w:hAnsi="Times New Roman" w:cs="Times New Roman"/>
+        </w:rPr>
+        <w:t>與遠區</w:t>
+      </w:r>
+      <w:proofErr w:type="gramEnd"/>
       <w:r>
         <w:rPr>
           <w:rFonts w:ascii="Times New Roman" w:eastAsia="標楷體" w:hAnsi="Times New Roman" w:cs="Times New Roman"/>
         </w:rPr>
         <w:t>，</w:t>
       </w:r>
-      <w:r>
-        <w:rPr>
-          <w:rFonts w:ascii="Times New Roman" w:eastAsia="標楷體" w:hAnsi="Times New Roman" w:cs="Times New Roman"/>
-        </w:rPr>
-        <w:t>在近區與中區內規劃支援線時可不考慮方向一致性，而在遠區則需確保所有</w:t>
-      </w:r>
-      <w:r>
-        <w:rPr>
-          <w:rFonts w:ascii="Times New Roman" w:eastAsia="標楷體" w:hAnsi="Times New Roman" w:cs="Times New Roman"/>
-        </w:rPr>
-        <w:t>店舖</w:t>
-      </w:r>
+      <w:proofErr w:type="gramStart"/>
+      <w:r>
+        <w:rPr>
+          <w:rFonts w:ascii="Times New Roman" w:eastAsia="標楷體" w:hAnsi="Times New Roman" w:cs="Times New Roman"/>
+        </w:rPr>
+        <w:t>在近區與</w:t>
+      </w:r>
+      <w:proofErr w:type="gramEnd"/>
+      <w:r>
+        <w:rPr>
+          <w:rFonts w:ascii="Times New Roman" w:eastAsia="標楷體" w:hAnsi="Times New Roman" w:cs="Times New Roman"/>
+        </w:rPr>
+        <w:t>中區內規劃支援線時可不考慮方向一致性，而</w:t>
+      </w:r>
+      <w:proofErr w:type="gramStart"/>
+      <w:r>
+        <w:rPr>
+          <w:rFonts w:ascii="Times New Roman" w:eastAsia="標楷體" w:hAnsi="Times New Roman" w:cs="Times New Roman"/>
+        </w:rPr>
+        <w:t>在遠區則</w:t>
+      </w:r>
+      <w:proofErr w:type="gramEnd"/>
+      <w:r>
+        <w:rPr>
+          <w:rFonts w:ascii="Times New Roman" w:eastAsia="標楷體" w:hAnsi="Times New Roman" w:cs="Times New Roman"/>
+        </w:rPr>
+        <w:t>需確保所有</w:t>
+      </w:r>
+      <w:r>
+        <w:rPr>
+          <w:rFonts w:ascii="Times New Roman" w:eastAsia="標楷體" w:hAnsi="Times New Roman" w:cs="Times New Roman"/>
+        </w:rPr>
+        <w:t>店</w:t>
+      </w:r>
+      <w:proofErr w:type="gramStart"/>
+      <w:r>
+        <w:rPr>
+          <w:rFonts w:ascii="Times New Roman" w:eastAsia="標楷體" w:hAnsi="Times New Roman" w:cs="Times New Roman"/>
+        </w:rPr>
+        <w:t>舖</w:t>
+      </w:r>
+      <w:proofErr w:type="gramEnd"/>
       <w:r>
         <w:rPr>
           <w:rFonts w:ascii="Times New Roman" w:eastAsia="標楷體" w:hAnsi="Times New Roman" w:cs="Times New Roman"/>
@@ -7542,8 +8025,16 @@
         <w:rPr>
           <w:rFonts w:ascii="Times New Roman" w:eastAsia="標楷體" w:hAnsi="Times New Roman" w:cs="Times New Roman"/>
         </w:rPr>
-        <w:t>店舖</w:t>
-      </w:r>
+        <w:t>店</w:t>
+      </w:r>
+      <w:proofErr w:type="gramStart"/>
+      <w:r>
+        <w:rPr>
+          <w:rFonts w:ascii="Times New Roman" w:eastAsia="標楷體" w:hAnsi="Times New Roman" w:cs="Times New Roman"/>
+        </w:rPr>
+        <w:t>舖</w:t>
+      </w:r>
+      <w:proofErr w:type="gramEnd"/>
       <w:r>
         <w:rPr>
           <w:rFonts w:ascii="Times New Roman" w:eastAsia="標楷體" w:hAnsi="Times New Roman" w:cs="Times New Roman"/>
@@ -7632,8 +8123,16 @@
         <w:rPr>
           <w:rFonts w:ascii="Times New Roman" w:eastAsia="標楷體" w:hAnsi="Times New Roman" w:cs="Times New Roman"/>
         </w:rPr>
-        <w:t>店舖</w:t>
-      </w:r>
+        <w:t>店</w:t>
+      </w:r>
+      <w:proofErr w:type="gramStart"/>
+      <w:r>
+        <w:rPr>
+          <w:rFonts w:ascii="Times New Roman" w:eastAsia="標楷體" w:hAnsi="Times New Roman" w:cs="Times New Roman"/>
+        </w:rPr>
+        <w:t>舖</w:t>
+      </w:r>
+      <w:proofErr w:type="gramEnd"/>
       <w:r>
         <w:rPr>
           <w:rFonts w:ascii="Times New Roman" w:eastAsia="標楷體" w:hAnsi="Times New Roman" w:cs="Times New Roman"/>
@@ -7644,8 +8143,16 @@
         <w:rPr>
           <w:rFonts w:ascii="Times New Roman" w:eastAsia="標楷體" w:hAnsi="Times New Roman" w:cs="Times New Roman"/>
         </w:rPr>
-        <w:t>店舖</w:t>
-      </w:r>
+        <w:t>店</w:t>
+      </w:r>
+      <w:proofErr w:type="gramStart"/>
+      <w:r>
+        <w:rPr>
+          <w:rFonts w:ascii="Times New Roman" w:eastAsia="標楷體" w:hAnsi="Times New Roman" w:cs="Times New Roman"/>
+        </w:rPr>
+        <w:t>舖</w:t>
+      </w:r>
+      <w:proofErr w:type="gramEnd"/>
       <w:r>
         <w:rPr>
           <w:rFonts w:ascii="Times New Roman" w:eastAsia="標楷體" w:hAnsi="Times New Roman" w:cs="Times New Roman"/>
@@ -7781,6 +8288,7 @@
         </w:rPr>
         <w:t xml:space="preserve"> </w:t>
       </w:r>
+      <w:proofErr w:type="gramStart"/>
       <w:r>
         <w:rPr>
           <w:rFonts w:ascii="Times New Roman" w:eastAsia="標楷體" w:hAnsi="Times New Roman" w:cs="Times New Roman"/>
@@ -7790,6 +8298,7 @@
         <w:t>變量定義</w:t>
       </w:r>
       <w:bookmarkEnd w:id="31"/>
+      <w:proofErr w:type="gramEnd"/>
     </w:p>
     <w:tbl>
       <w:tblPr>
@@ -7956,8 +8465,16 @@
               <w:rPr>
                 <w:rFonts w:ascii="Times New Roman" w:eastAsia="標楷體" w:hAnsi="Times New Roman" w:cs="Times New Roman"/>
               </w:rPr>
-              <w:t>店舖</w:t>
-            </w:r>
+              <w:t>店</w:t>
+            </w:r>
+            <w:proofErr w:type="gramStart"/>
+            <w:r>
+              <w:rPr>
+                <w:rFonts w:ascii="Times New Roman" w:eastAsia="標楷體" w:hAnsi="Times New Roman" w:cs="Times New Roman"/>
+              </w:rPr>
+              <w:t>舖</w:t>
+            </w:r>
+            <w:proofErr w:type="gramEnd"/>
             <w:r>
               <w:rPr>
                 <w:rFonts w:ascii="Times New Roman" w:eastAsia="標楷體" w:hAnsi="Times New Roman" w:cs="Times New Roman"/>
@@ -8212,12 +8729,14 @@
               </w:rPr>
               <w:t>店鋪</w:t>
             </w:r>
+            <w:proofErr w:type="spellStart"/>
             <w:r>
               <w:rPr>
                 <w:rFonts w:ascii="Times New Roman" w:eastAsia="標楷體" w:hAnsi="Times New Roman" w:cs="Times New Roman" w:hint="eastAsia"/>
               </w:rPr>
               <w:t>i</w:t>
             </w:r>
+            <w:proofErr w:type="spellEnd"/>
             <w:r>
               <w:rPr>
                 <w:rFonts w:ascii="Times New Roman" w:eastAsia="標楷體" w:hAnsi="Times New Roman" w:cs="Times New Roman" w:hint="eastAsia"/>
@@ -8309,7 +8828,21 @@
               <w:rPr>
                 <w:rFonts w:ascii="Times New Roman" w:eastAsia="標楷體" w:hAnsi="Times New Roman" w:cs="Times New Roman"/>
               </w:rPr>
-              <w:t xml:space="preserve"> i </w:t>
+              <w:t xml:space="preserve"> </w:t>
+            </w:r>
+            <w:proofErr w:type="spellStart"/>
+            <w:r>
+              <w:rPr>
+                <w:rFonts w:ascii="Times New Roman" w:eastAsia="標楷體" w:hAnsi="Times New Roman" w:cs="Times New Roman"/>
+              </w:rPr>
+              <w:t>i</w:t>
+            </w:r>
+            <w:proofErr w:type="spellEnd"/>
+            <w:r>
+              <w:rPr>
+                <w:rFonts w:ascii="Times New Roman" w:eastAsia="標楷體" w:hAnsi="Times New Roman" w:cs="Times New Roman"/>
+              </w:rPr>
+              <w:t xml:space="preserve"> </w:t>
             </w:r>
             <w:r>
               <w:rPr>
@@ -8409,7 +8942,21 @@
               <w:rPr>
                 <w:rFonts w:ascii="Times New Roman" w:eastAsia="標楷體" w:hAnsi="Times New Roman" w:cs="Times New Roman"/>
               </w:rPr>
-              <w:t xml:space="preserve"> i </w:t>
+              <w:t xml:space="preserve"> </w:t>
+            </w:r>
+            <w:proofErr w:type="spellStart"/>
+            <w:r>
+              <w:rPr>
+                <w:rFonts w:ascii="Times New Roman" w:eastAsia="標楷體" w:hAnsi="Times New Roman" w:cs="Times New Roman"/>
+              </w:rPr>
+              <w:t>i</w:t>
+            </w:r>
+            <w:proofErr w:type="spellEnd"/>
+            <w:r>
+              <w:rPr>
+                <w:rFonts w:ascii="Times New Roman" w:eastAsia="標楷體" w:hAnsi="Times New Roman" w:cs="Times New Roman"/>
+              </w:rPr>
+              <w:t xml:space="preserve"> </w:t>
             </w:r>
             <w:r>
               <w:rPr>
@@ -8502,7 +9049,21 @@
               <w:rPr>
                 <w:rFonts w:ascii="Times New Roman" w:eastAsia="標楷體" w:hAnsi="Times New Roman" w:cs="Times New Roman"/>
               </w:rPr>
-              <w:t xml:space="preserve"> i </w:t>
+              <w:t xml:space="preserve"> </w:t>
+            </w:r>
+            <w:proofErr w:type="spellStart"/>
+            <w:r>
+              <w:rPr>
+                <w:rFonts w:ascii="Times New Roman" w:eastAsia="標楷體" w:hAnsi="Times New Roman" w:cs="Times New Roman"/>
+              </w:rPr>
+              <w:t>i</w:t>
+            </w:r>
+            <w:proofErr w:type="spellEnd"/>
+            <w:r>
+              <w:rPr>
+                <w:rFonts w:ascii="Times New Roman" w:eastAsia="標楷體" w:hAnsi="Times New Roman" w:cs="Times New Roman"/>
+              </w:rPr>
+              <w:t xml:space="preserve"> </w:t>
             </w:r>
             <w:r>
               <w:rPr>
@@ -8601,7 +9162,21 @@
               <w:rPr>
                 <w:rFonts w:ascii="Times New Roman" w:eastAsia="標楷體" w:hAnsi="Times New Roman" w:cs="Times New Roman"/>
               </w:rPr>
-              <w:t xml:space="preserve"> i </w:t>
+              <w:t xml:space="preserve"> </w:t>
+            </w:r>
+            <w:proofErr w:type="spellStart"/>
+            <w:r>
+              <w:rPr>
+                <w:rFonts w:ascii="Times New Roman" w:eastAsia="標楷體" w:hAnsi="Times New Roman" w:cs="Times New Roman"/>
+              </w:rPr>
+              <w:t>i</w:t>
+            </w:r>
+            <w:proofErr w:type="spellEnd"/>
+            <w:r>
+              <w:rPr>
+                <w:rFonts w:ascii="Times New Roman" w:eastAsia="標楷體" w:hAnsi="Times New Roman" w:cs="Times New Roman"/>
+              </w:rPr>
+              <w:t xml:space="preserve"> </w:t>
             </w:r>
             <w:r>
               <w:rPr>
@@ -8997,7 +9572,21 @@
               <w:rPr>
                 <w:rFonts w:ascii="Times New Roman" w:eastAsia="標楷體" w:hAnsi="Times New Roman" w:cs="Times New Roman"/>
               </w:rPr>
-              <w:t xml:space="preserve"> i </w:t>
+              <w:t xml:space="preserve"> </w:t>
+            </w:r>
+            <w:proofErr w:type="spellStart"/>
+            <w:r>
+              <w:rPr>
+                <w:rFonts w:ascii="Times New Roman" w:eastAsia="標楷體" w:hAnsi="Times New Roman" w:cs="Times New Roman"/>
+              </w:rPr>
+              <w:t>i</w:t>
+            </w:r>
+            <w:proofErr w:type="spellEnd"/>
+            <w:r>
+              <w:rPr>
+                <w:rFonts w:ascii="Times New Roman" w:eastAsia="標楷體" w:hAnsi="Times New Roman" w:cs="Times New Roman"/>
+              </w:rPr>
+              <w:t xml:space="preserve"> </w:t>
             </w:r>
             <w:r>
               <w:rPr>
@@ -9325,12 +9914,14 @@
                 <w:rFonts w:ascii="Times New Roman" w:eastAsia="標楷體" w:hAnsi="Times New Roman" w:cs="Times New Roman"/>
               </w:rPr>
             </w:pPr>
+            <w:proofErr w:type="gramStart"/>
             <w:r>
               <w:rPr>
                 <w:rFonts w:ascii="Times New Roman" w:eastAsia="標楷體" w:hAnsi="Times New Roman" w:cs="Times New Roman" w:hint="eastAsia"/>
               </w:rPr>
               <w:t>爆量線集合</w:t>
             </w:r>
+            <w:proofErr w:type="gramEnd"/>
           </w:p>
         </w:tc>
       </w:tr>
@@ -9388,7 +9979,21 @@
               <w:rPr>
                 <w:rFonts w:ascii="Times New Roman" w:eastAsia="標楷體" w:hAnsi="Times New Roman" w:cs="Times New Roman"/>
               </w:rPr>
-              <w:t>店舖集合</w:t>
+              <w:t>店</w:t>
+            </w:r>
+            <w:proofErr w:type="gramStart"/>
+            <w:r>
+              <w:rPr>
+                <w:rFonts w:ascii="Times New Roman" w:eastAsia="標楷體" w:hAnsi="Times New Roman" w:cs="Times New Roman"/>
+              </w:rPr>
+              <w:t>舖</w:t>
+            </w:r>
+            <w:proofErr w:type="gramEnd"/>
+            <w:r>
+              <w:rPr>
+                <w:rFonts w:ascii="Times New Roman" w:eastAsia="標楷體" w:hAnsi="Times New Roman" w:cs="Times New Roman"/>
+              </w:rPr>
+              <w:t>集合</w:t>
             </w:r>
           </w:p>
         </w:tc>
@@ -9457,18 +10062,28 @@
                 <w:bCs/>
               </w:rPr>
             </w:pPr>
+            <w:proofErr w:type="gramStart"/>
             <w:r>
               <w:rPr>
                 <w:rFonts w:ascii="Times New Roman" w:eastAsia="標楷體" w:hAnsi="Times New Roman" w:cs="Times New Roman"/>
               </w:rPr>
               <w:t>近區的</w:t>
             </w:r>
+            <w:proofErr w:type="gramEnd"/>
             <w:r>
               <w:rPr>
                 <w:rFonts w:ascii="Times New Roman" w:eastAsia="標楷體" w:hAnsi="Times New Roman" w:cs="Times New Roman"/>
               </w:rPr>
-              <w:t>店舖</w:t>
-            </w:r>
+              <w:t>店</w:t>
+            </w:r>
+            <w:proofErr w:type="gramStart"/>
+            <w:r>
+              <w:rPr>
+                <w:rFonts w:ascii="Times New Roman" w:eastAsia="標楷體" w:hAnsi="Times New Roman" w:cs="Times New Roman"/>
+              </w:rPr>
+              <w:t>舖</w:t>
+            </w:r>
+            <w:proofErr w:type="gramEnd"/>
             <w:r>
               <w:rPr>
                 <w:rFonts w:ascii="Times New Roman" w:eastAsia="標楷體" w:hAnsi="Times New Roman" w:cs="Times New Roman"/>
@@ -9550,8 +10165,16 @@
               <w:rPr>
                 <w:rFonts w:ascii="Times New Roman" w:eastAsia="標楷體" w:hAnsi="Times New Roman" w:cs="Times New Roman"/>
               </w:rPr>
-              <w:t>店舖</w:t>
-            </w:r>
+              <w:t>店</w:t>
+            </w:r>
+            <w:proofErr w:type="gramStart"/>
+            <w:r>
+              <w:rPr>
+                <w:rFonts w:ascii="Times New Roman" w:eastAsia="標楷體" w:hAnsi="Times New Roman" w:cs="Times New Roman"/>
+              </w:rPr>
+              <w:t>舖</w:t>
+            </w:r>
+            <w:proofErr w:type="gramEnd"/>
             <w:r>
               <w:rPr>
                 <w:rFonts w:ascii="Times New Roman" w:eastAsia="標楷體" w:hAnsi="Times New Roman" w:cs="Times New Roman"/>
@@ -9623,18 +10246,28 @@
                 <w:bCs/>
               </w:rPr>
             </w:pPr>
+            <w:proofErr w:type="gramStart"/>
             <w:r>
               <w:rPr>
                 <w:rFonts w:ascii="Times New Roman" w:eastAsia="標楷體" w:hAnsi="Times New Roman" w:cs="Times New Roman"/>
               </w:rPr>
               <w:t>遠區的</w:t>
             </w:r>
+            <w:proofErr w:type="gramEnd"/>
             <w:r>
               <w:rPr>
                 <w:rFonts w:ascii="Times New Roman" w:eastAsia="標楷體" w:hAnsi="Times New Roman" w:cs="Times New Roman"/>
               </w:rPr>
-              <w:t>店舖</w:t>
-            </w:r>
+              <w:t>店</w:t>
+            </w:r>
+            <w:proofErr w:type="gramStart"/>
+            <w:r>
+              <w:rPr>
+                <w:rFonts w:ascii="Times New Roman" w:eastAsia="標楷體" w:hAnsi="Times New Roman" w:cs="Times New Roman"/>
+              </w:rPr>
+              <w:t>舖</w:t>
+            </w:r>
+            <w:proofErr w:type="gramEnd"/>
             <w:r>
               <w:rPr>
                 <w:rFonts w:ascii="Times New Roman" w:eastAsia="標楷體" w:hAnsi="Times New Roman" w:cs="Times New Roman"/>
@@ -9743,8 +10376,16 @@
         <w:rPr>
           <w:rFonts w:ascii="Times New Roman" w:eastAsia="標楷體" w:hAnsi="Times New Roman" w:cs="Times New Roman"/>
         </w:rPr>
-        <w:t>店舖</w:t>
-      </w:r>
+        <w:t>店</w:t>
+      </w:r>
+      <w:proofErr w:type="gramStart"/>
+      <w:r>
+        <w:rPr>
+          <w:rFonts w:ascii="Times New Roman" w:eastAsia="標楷體" w:hAnsi="Times New Roman" w:cs="Times New Roman"/>
+        </w:rPr>
+        <w:t>舖</w:t>
+      </w:r>
+      <w:proofErr w:type="gramEnd"/>
       <w:r>
         <w:rPr>
           <w:rFonts w:ascii="Times New Roman" w:eastAsia="標楷體" w:hAnsi="Times New Roman" w:cs="Times New Roman"/>
@@ -9755,13 +10396,63 @@
         <w:rPr>
           <w:rFonts w:ascii="Times New Roman" w:eastAsia="標楷體" w:hAnsi="Times New Roman" w:cs="Times New Roman"/>
         </w:rPr>
-        <w:t>店舖</w:t>
-      </w:r>
-      <w:r>
-        <w:rPr>
-          <w:rFonts w:ascii="Times New Roman" w:eastAsia="標楷體" w:hAnsi="Times New Roman" w:cs="Times New Roman"/>
-        </w:rPr>
-        <w:t>劃分為近區、中區與遠區。近區代表距離物流中心三公里以內的區域；中區為距離三至五公里之間的區域；遠區則為距離超過五公里的區域。</w:t>
+        <w:t>店</w:t>
+      </w:r>
+      <w:proofErr w:type="gramStart"/>
+      <w:r>
+        <w:rPr>
+          <w:rFonts w:ascii="Times New Roman" w:eastAsia="標楷體" w:hAnsi="Times New Roman" w:cs="Times New Roman"/>
+        </w:rPr>
+        <w:t>舖</w:t>
+      </w:r>
+      <w:proofErr w:type="gramEnd"/>
+      <w:r>
+        <w:rPr>
+          <w:rFonts w:ascii="Times New Roman" w:eastAsia="標楷體" w:hAnsi="Times New Roman" w:cs="Times New Roman"/>
+        </w:rPr>
+        <w:t>劃分</w:t>
+      </w:r>
+      <w:proofErr w:type="gramStart"/>
+      <w:r>
+        <w:rPr>
+          <w:rFonts w:ascii="Times New Roman" w:eastAsia="標楷體" w:hAnsi="Times New Roman" w:cs="Times New Roman"/>
+        </w:rPr>
+        <w:t>為近區</w:t>
+      </w:r>
+      <w:proofErr w:type="gramEnd"/>
+      <w:r>
+        <w:rPr>
+          <w:rFonts w:ascii="Times New Roman" w:eastAsia="標楷體" w:hAnsi="Times New Roman" w:cs="Times New Roman"/>
+        </w:rPr>
+        <w:t>、中區</w:t>
+      </w:r>
+      <w:proofErr w:type="gramStart"/>
+      <w:r>
+        <w:rPr>
+          <w:rFonts w:ascii="Times New Roman" w:eastAsia="標楷體" w:hAnsi="Times New Roman" w:cs="Times New Roman"/>
+        </w:rPr>
+        <w:t>與遠區</w:t>
+      </w:r>
+      <w:proofErr w:type="gramEnd"/>
+      <w:r>
+        <w:rPr>
+          <w:rFonts w:ascii="Times New Roman" w:eastAsia="標楷體" w:hAnsi="Times New Roman" w:cs="Times New Roman"/>
+        </w:rPr>
+        <w:t>。近區代表距離物流中心三公里以內的區域；中區為距離三至五公里之間的區域；</w:t>
+      </w:r>
+      <w:proofErr w:type="gramStart"/>
+      <w:r>
+        <w:rPr>
+          <w:rFonts w:ascii="Times New Roman" w:eastAsia="標楷體" w:hAnsi="Times New Roman" w:cs="Times New Roman"/>
+        </w:rPr>
+        <w:t>遠區則</w:t>
+      </w:r>
+      <w:proofErr w:type="gramEnd"/>
+      <w:r>
+        <w:rPr>
+          <w:rFonts w:ascii="Times New Roman" w:eastAsia="標楷體" w:hAnsi="Times New Roman" w:cs="Times New Roman"/>
+        </w:rPr>
+        <w:t>為距離超過五公里的區域。</w:t>
       </w:r>
     </w:p>
     <w:p>
@@ -11549,8 +12240,16 @@
         <w:rPr>
           <w:rFonts w:ascii="Times New Roman" w:eastAsia="標楷體" w:hAnsi="Times New Roman" w:cs="Times New Roman" w:hint="eastAsia"/>
         </w:rPr>
-        <w:t>店舖</w:t>
-      </w:r>
+        <w:t>店</w:t>
+      </w:r>
+      <w:proofErr w:type="gramStart"/>
+      <w:r>
+        <w:rPr>
+          <w:rFonts w:ascii="Times New Roman" w:eastAsia="標楷體" w:hAnsi="Times New Roman" w:cs="Times New Roman" w:hint="eastAsia"/>
+        </w:rPr>
+        <w:t>舖</w:t>
+      </w:r>
+      <w:proofErr w:type="gramEnd"/>
       <w:r>
         <w:rPr>
           <w:rFonts w:ascii="Times New Roman" w:eastAsia="標楷體" w:hAnsi="Times New Roman" w:cs="Times New Roman" w:hint="eastAsia"/>
@@ -11579,8 +12278,16 @@
         <w:rPr>
           <w:rFonts w:ascii="Times New Roman" w:eastAsia="標楷體" w:hAnsi="Times New Roman" w:cs="Times New Roman"/>
         </w:rPr>
-        <w:t>店舖</w:t>
-      </w:r>
+        <w:t>店</w:t>
+      </w:r>
+      <w:proofErr w:type="gramStart"/>
+      <w:r>
+        <w:rPr>
+          <w:rFonts w:ascii="Times New Roman" w:eastAsia="標楷體" w:hAnsi="Times New Roman" w:cs="Times New Roman"/>
+        </w:rPr>
+        <w:t>舖</w:t>
+      </w:r>
+      <w:proofErr w:type="gramEnd"/>
       <w:r>
         <w:rPr>
           <w:rFonts w:ascii="Times New Roman" w:eastAsia="標楷體" w:hAnsi="Times New Roman" w:cs="Times New Roman"/>
@@ -11591,8 +12298,16 @@
         <w:rPr>
           <w:rFonts w:ascii="Times New Roman" w:eastAsia="標楷體" w:hAnsi="Times New Roman" w:cs="Times New Roman"/>
         </w:rPr>
-        <w:t>店舖</w:t>
-      </w:r>
+        <w:t>店</w:t>
+      </w:r>
+      <w:proofErr w:type="gramStart"/>
+      <w:r>
+        <w:rPr>
+          <w:rFonts w:ascii="Times New Roman" w:eastAsia="標楷體" w:hAnsi="Times New Roman" w:cs="Times New Roman"/>
+        </w:rPr>
+        <w:t>舖</w:t>
+      </w:r>
+      <w:proofErr w:type="gramEnd"/>
       <w:r>
         <w:rPr>
           <w:rFonts w:ascii="Times New Roman" w:eastAsia="標楷體" w:hAnsi="Times New Roman" w:cs="Times New Roman"/>
@@ -11615,8 +12330,16 @@
         <w:rPr>
           <w:rFonts w:ascii="Times New Roman" w:eastAsia="標楷體" w:hAnsi="Times New Roman" w:cs="Times New Roman" w:hint="eastAsia"/>
         </w:rPr>
-        <w:t>店舖</w:t>
-      </w:r>
+        <w:t>店</w:t>
+      </w:r>
+      <w:proofErr w:type="gramStart"/>
+      <w:r>
+        <w:rPr>
+          <w:rFonts w:ascii="Times New Roman" w:eastAsia="標楷體" w:hAnsi="Times New Roman" w:cs="Times New Roman" w:hint="eastAsia"/>
+        </w:rPr>
+        <w:t>舖</w:t>
+      </w:r>
+      <w:proofErr w:type="gramEnd"/>
       <w:r>
         <w:rPr>
           <w:rFonts w:ascii="Times New Roman" w:eastAsia="標楷體" w:hAnsi="Times New Roman" w:cs="Times New Roman" w:hint="eastAsia"/>
@@ -11672,8 +12395,16 @@
         <w:rPr>
           <w:rFonts w:ascii="Times New Roman" w:eastAsia="標楷體" w:hAnsi="Times New Roman" w:cs="Times New Roman"/>
         </w:rPr>
-        <w:t>店舖</w:t>
-      </w:r>
+        <w:t>店</w:t>
+      </w:r>
+      <w:proofErr w:type="gramStart"/>
+      <w:r>
+        <w:rPr>
+          <w:rFonts w:ascii="Times New Roman" w:eastAsia="標楷體" w:hAnsi="Times New Roman" w:cs="Times New Roman"/>
+        </w:rPr>
+        <w:t>舖</w:t>
+      </w:r>
+      <w:proofErr w:type="gramEnd"/>
       <w:r>
         <w:rPr>
           <w:rFonts w:ascii="Times New Roman" w:eastAsia="標楷體" w:hAnsi="Times New Roman" w:cs="Times New Roman"/>
@@ -14382,14 +15113,36 @@
         <w:rPr>
           <w:rFonts w:ascii="Times New Roman" w:eastAsia="標楷體" w:hAnsi="Times New Roman" w:cs="Times New Roman" w:hint="eastAsia"/>
         </w:rPr>
-        <w:t>本研究系統的原始配送路線資料包含路網資料、滯店時間、</w:t>
-      </w:r>
-      <w:r>
-        <w:rPr>
-          <w:rFonts w:ascii="Times New Roman" w:eastAsia="標楷體" w:hAnsi="Times New Roman" w:cs="Times New Roman" w:hint="eastAsia"/>
-        </w:rPr>
-        <w:t>店舖</w:t>
-      </w:r>
+        <w:t>本研究系統的原始配送路線資料包含路網資料、</w:t>
+      </w:r>
+      <w:proofErr w:type="gramStart"/>
+      <w:r>
+        <w:rPr>
+          <w:rFonts w:ascii="Times New Roman" w:eastAsia="標楷體" w:hAnsi="Times New Roman" w:cs="Times New Roman" w:hint="eastAsia"/>
+        </w:rPr>
+        <w:t>滯店時間</w:t>
+      </w:r>
+      <w:proofErr w:type="gramEnd"/>
+      <w:r>
+        <w:rPr>
+          <w:rFonts w:ascii="Times New Roman" w:eastAsia="標楷體" w:hAnsi="Times New Roman" w:cs="Times New Roman" w:hint="eastAsia"/>
+        </w:rPr>
+        <w:t>、</w:t>
+      </w:r>
+      <w:r>
+        <w:rPr>
+          <w:rFonts w:ascii="Times New Roman" w:eastAsia="標楷體" w:hAnsi="Times New Roman" w:cs="Times New Roman" w:hint="eastAsia"/>
+        </w:rPr>
+        <w:t>店</w:t>
+      </w:r>
+      <w:proofErr w:type="gramStart"/>
+      <w:r>
+        <w:rPr>
+          <w:rFonts w:ascii="Times New Roman" w:eastAsia="標楷體" w:hAnsi="Times New Roman" w:cs="Times New Roman" w:hint="eastAsia"/>
+        </w:rPr>
+        <w:t>舖</w:t>
+      </w:r>
+      <w:proofErr w:type="gramEnd"/>
       <w:r>
         <w:rPr>
           <w:rFonts w:ascii="Times New Roman" w:eastAsia="標楷體" w:hAnsi="Times New Roman" w:cs="Times New Roman" w:hint="eastAsia"/>
@@ -14400,8 +15153,16 @@
         <w:rPr>
           <w:rFonts w:ascii="Times New Roman" w:eastAsia="標楷體" w:hAnsi="Times New Roman" w:cs="Times New Roman" w:hint="eastAsia"/>
         </w:rPr>
-        <w:t>店舖</w:t>
-      </w:r>
+        <w:t>店</w:t>
+      </w:r>
+      <w:proofErr w:type="gramStart"/>
+      <w:r>
+        <w:rPr>
+          <w:rFonts w:ascii="Times New Roman" w:eastAsia="標楷體" w:hAnsi="Times New Roman" w:cs="Times New Roman" w:hint="eastAsia"/>
+        </w:rPr>
+        <w:t>舖</w:t>
+      </w:r>
+      <w:proofErr w:type="gramEnd"/>
       <w:r>
         <w:rPr>
           <w:rFonts w:ascii="Times New Roman" w:eastAsia="標楷體" w:hAnsi="Times New Roman" w:cs="Times New Roman" w:hint="eastAsia"/>
@@ -14420,18 +15181,34 @@
         </w:rPr>
         <w:t>平均行駛時間。</w:t>
       </w:r>
-      <w:r>
-        <w:rPr>
-          <w:rFonts w:ascii="Times New Roman" w:eastAsia="標楷體" w:hAnsi="Times New Roman" w:cs="Times New Roman"/>
-        </w:rPr>
-        <w:t>滯店時間表示車輛在各</w:t>
-      </w:r>
-      <w:r>
-        <w:rPr>
-          <w:rFonts w:ascii="Times New Roman" w:eastAsia="標楷體" w:hAnsi="Times New Roman" w:cs="Times New Roman"/>
-        </w:rPr>
-        <w:t>店舖</w:t>
-      </w:r>
+      <w:proofErr w:type="gramStart"/>
+      <w:r>
+        <w:rPr>
+          <w:rFonts w:ascii="Times New Roman" w:eastAsia="標楷體" w:hAnsi="Times New Roman" w:cs="Times New Roman"/>
+        </w:rPr>
+        <w:t>滯店時間</w:t>
+      </w:r>
+      <w:proofErr w:type="gramEnd"/>
+      <w:r>
+        <w:rPr>
+          <w:rFonts w:ascii="Times New Roman" w:eastAsia="標楷體" w:hAnsi="Times New Roman" w:cs="Times New Roman"/>
+        </w:rPr>
+        <w:t>表示車輛在各</w:t>
+      </w:r>
+      <w:r>
+        <w:rPr>
+          <w:rFonts w:ascii="Times New Roman" w:eastAsia="標楷體" w:hAnsi="Times New Roman" w:cs="Times New Roman"/>
+        </w:rPr>
+        <w:t>店</w:t>
+      </w:r>
+      <w:proofErr w:type="gramStart"/>
+      <w:r>
+        <w:rPr>
+          <w:rFonts w:ascii="Times New Roman" w:eastAsia="標楷體" w:hAnsi="Times New Roman" w:cs="Times New Roman"/>
+        </w:rPr>
+        <w:t>舖</w:t>
+      </w:r>
+      <w:proofErr w:type="gramEnd"/>
       <w:r>
         <w:rPr>
           <w:rFonts w:ascii="Times New Roman" w:eastAsia="標楷體" w:hAnsi="Times New Roman" w:cs="Times New Roman"/>
@@ -14448,8 +15225,16 @@
         <w:rPr>
           <w:rFonts w:ascii="Times New Roman" w:eastAsia="標楷體" w:hAnsi="Times New Roman" w:cs="Times New Roman" w:hint="eastAsia"/>
         </w:rPr>
-        <w:t>店舖</w:t>
-      </w:r>
+        <w:t>店</w:t>
+      </w:r>
+      <w:proofErr w:type="gramStart"/>
+      <w:r>
+        <w:rPr>
+          <w:rFonts w:ascii="Times New Roman" w:eastAsia="標楷體" w:hAnsi="Times New Roman" w:cs="Times New Roman" w:hint="eastAsia"/>
+        </w:rPr>
+        <w:t>舖</w:t>
+      </w:r>
+      <w:proofErr w:type="gramEnd"/>
       <w:r>
         <w:rPr>
           <w:rFonts w:ascii="Times New Roman" w:eastAsia="標楷體" w:hAnsi="Times New Roman" w:cs="Times New Roman" w:hint="eastAsia"/>
@@ -14460,8 +15245,16 @@
         <w:rPr>
           <w:rFonts w:ascii="Times New Roman" w:eastAsia="標楷體" w:hAnsi="Times New Roman" w:cs="Times New Roman" w:hint="eastAsia"/>
         </w:rPr>
-        <w:t>店舖</w:t>
-      </w:r>
+        <w:t>店</w:t>
+      </w:r>
+      <w:proofErr w:type="gramStart"/>
+      <w:r>
+        <w:rPr>
+          <w:rFonts w:ascii="Times New Roman" w:eastAsia="標楷體" w:hAnsi="Times New Roman" w:cs="Times New Roman" w:hint="eastAsia"/>
+        </w:rPr>
+        <w:t>舖</w:t>
+      </w:r>
+      <w:proofErr w:type="gramEnd"/>
       <w:r>
         <w:rPr>
           <w:rFonts w:ascii="Times New Roman" w:eastAsia="標楷體" w:hAnsi="Times New Roman" w:cs="Times New Roman" w:hint="eastAsia"/>
@@ -14472,8 +15265,16 @@
         <w:rPr>
           <w:rFonts w:ascii="Times New Roman" w:eastAsia="標楷體" w:hAnsi="Times New Roman" w:cs="Times New Roman" w:hint="eastAsia"/>
         </w:rPr>
-        <w:t>店舖</w:t>
-      </w:r>
+        <w:t>店</w:t>
+      </w:r>
+      <w:proofErr w:type="gramStart"/>
+      <w:r>
+        <w:rPr>
+          <w:rFonts w:ascii="Times New Roman" w:eastAsia="標楷體" w:hAnsi="Times New Roman" w:cs="Times New Roman" w:hint="eastAsia"/>
+        </w:rPr>
+        <w:t>舖</w:t>
+      </w:r>
+      <w:proofErr w:type="gramEnd"/>
       <w:r>
         <w:rPr>
           <w:rFonts w:ascii="Times New Roman" w:eastAsia="標楷體" w:hAnsi="Times New Roman" w:cs="Times New Roman" w:hint="eastAsia"/>
@@ -14490,8 +15291,16 @@
         <w:rPr>
           <w:rFonts w:ascii="Times New Roman" w:eastAsia="標楷體" w:hAnsi="Times New Roman" w:cs="Times New Roman" w:hint="eastAsia"/>
         </w:rPr>
-        <w:t>店舖</w:t>
-      </w:r>
+        <w:t>店</w:t>
+      </w:r>
+      <w:proofErr w:type="gramStart"/>
+      <w:r>
+        <w:rPr>
+          <w:rFonts w:ascii="Times New Roman" w:eastAsia="標楷體" w:hAnsi="Times New Roman" w:cs="Times New Roman" w:hint="eastAsia"/>
+        </w:rPr>
+        <w:t>舖</w:t>
+      </w:r>
+      <w:proofErr w:type="gramEnd"/>
       <w:r>
         <w:rPr>
           <w:rFonts w:ascii="Times New Roman" w:eastAsia="標楷體" w:hAnsi="Times New Roman" w:cs="Times New Roman" w:hint="eastAsia"/>
@@ -14508,8 +15317,16 @@
         <w:rPr>
           <w:rFonts w:ascii="Times New Roman" w:eastAsia="標楷體" w:hAnsi="Times New Roman" w:cs="Times New Roman" w:hint="eastAsia"/>
         </w:rPr>
-        <w:t>店舖</w:t>
-      </w:r>
+        <w:t>店</w:t>
+      </w:r>
+      <w:proofErr w:type="gramStart"/>
+      <w:r>
+        <w:rPr>
+          <w:rFonts w:ascii="Times New Roman" w:eastAsia="標楷體" w:hAnsi="Times New Roman" w:cs="Times New Roman" w:hint="eastAsia"/>
+        </w:rPr>
+        <w:t>舖</w:t>
+      </w:r>
+      <w:proofErr w:type="gramEnd"/>
       <w:r>
         <w:rPr>
           <w:rFonts w:ascii="Times New Roman" w:eastAsia="標楷體" w:hAnsi="Times New Roman" w:cs="Times New Roman" w:hint="eastAsia"/>
@@ -14682,8 +15499,16 @@
         <w:rPr>
           <w:rFonts w:ascii="Times New Roman" w:eastAsia="標楷體" w:hAnsi="Times New Roman" w:cs="Times New Roman"/>
         </w:rPr>
-        <w:t>店舖</w:t>
-      </w:r>
+        <w:t>店</w:t>
+      </w:r>
+      <w:proofErr w:type="gramStart"/>
+      <w:r>
+        <w:rPr>
+          <w:rFonts w:ascii="Times New Roman" w:eastAsia="標楷體" w:hAnsi="Times New Roman" w:cs="Times New Roman"/>
+        </w:rPr>
+        <w:t>舖</w:t>
+      </w:r>
+      <w:proofErr w:type="gramEnd"/>
       <w:r>
         <w:rPr>
           <w:rFonts w:ascii="Times New Roman" w:eastAsia="標楷體" w:hAnsi="Times New Roman" w:cs="Times New Roman" w:hint="eastAsia"/>
@@ -14790,8 +15615,16 @@
         <w:rPr>
           <w:rFonts w:ascii="Times New Roman" w:eastAsia="標楷體" w:hAnsi="Times New Roman" w:cs="Times New Roman" w:hint="eastAsia"/>
         </w:rPr>
-        <w:t>各車次以及其對應的店舖</w:t>
-      </w:r>
+        <w:t>各車次以及其對應的店</w:t>
+      </w:r>
+      <w:proofErr w:type="gramStart"/>
+      <w:r>
+        <w:rPr>
+          <w:rFonts w:ascii="Times New Roman" w:eastAsia="標楷體" w:hAnsi="Times New Roman" w:cs="Times New Roman" w:hint="eastAsia"/>
+        </w:rPr>
+        <w:t>舖</w:t>
+      </w:r>
+      <w:proofErr w:type="gramEnd"/>
       <w:r>
         <w:rPr>
           <w:rFonts w:ascii="Times New Roman" w:eastAsia="標楷體" w:hAnsi="Times New Roman" w:cs="Times New Roman" w:hint="eastAsia"/>
@@ -14889,18 +15722,40 @@
         <w:rPr>
           <w:rFonts w:eastAsia="標楷體"/>
         </w:rPr>
-        <w:t>資料整合主要將原始配送路線資料中的路網資料、滯店時間、</w:t>
-      </w:r>
+        <w:t>資料整合主要將原始配送路線資料中的路網資料、</w:t>
+      </w:r>
+      <w:proofErr w:type="gramStart"/>
       <w:r>
         <w:rPr>
           <w:rFonts w:eastAsia="標楷體"/>
         </w:rPr>
-        <w:t>店舖</w:t>
-      </w:r>
+        <w:t>滯店時間</w:t>
+      </w:r>
+      <w:proofErr w:type="gramEnd"/>
       <w:r>
         <w:rPr>
           <w:rFonts w:eastAsia="標楷體"/>
         </w:rPr>
+        <w:t>、</w:t>
+      </w:r>
+      <w:r>
+        <w:rPr>
+          <w:rFonts w:eastAsia="標楷體"/>
+        </w:rPr>
+        <w:t>店</w:t>
+      </w:r>
+      <w:proofErr w:type="gramStart"/>
+      <w:r>
+        <w:rPr>
+          <w:rFonts w:eastAsia="標楷體"/>
+        </w:rPr>
+        <w:t>舖</w:t>
+      </w:r>
+      <w:proofErr w:type="gramEnd"/>
+      <w:r>
+        <w:rPr>
+          <w:rFonts w:eastAsia="標楷體"/>
+        </w:rPr>
         <w:t>主檔以及原始路線資料</w:t>
       </w:r>
       <w:r>
@@ -14955,12 +15810,20 @@
         <w:rPr>
           <w:rFonts w:eastAsia="標楷體"/>
         </w:rPr>
-        <w:t>店舖</w:t>
-      </w:r>
+        <w:t>店</w:t>
+      </w:r>
+      <w:proofErr w:type="gramStart"/>
       <w:r>
         <w:rPr>
           <w:rFonts w:eastAsia="標楷體"/>
         </w:rPr>
+        <w:t>舖</w:t>
+      </w:r>
+      <w:proofErr w:type="gramEnd"/>
+      <w:r>
+        <w:rPr>
+          <w:rFonts w:eastAsia="標楷體"/>
+        </w:rPr>
         <w:t>及其對應車輛的材積量上限</w:t>
       </w:r>
       <w:r>
@@ -14973,12 +15836,20 @@
         <w:rPr>
           <w:rFonts w:eastAsia="標楷體" w:hint="eastAsia"/>
         </w:rPr>
-        <w:t>店舖</w:t>
-      </w:r>
+        <w:t>店</w:t>
+      </w:r>
+      <w:proofErr w:type="gramStart"/>
       <w:r>
         <w:rPr>
           <w:rFonts w:eastAsia="標楷體" w:hint="eastAsia"/>
         </w:rPr>
+        <w:t>舖</w:t>
+      </w:r>
+      <w:proofErr w:type="gramEnd"/>
+      <w:r>
+        <w:rPr>
+          <w:rFonts w:eastAsia="標楷體" w:hint="eastAsia"/>
+        </w:rPr>
         <w:t>的詳細資訊與限制</w:t>
       </w:r>
       <w:r>
@@ -14991,12 +15862,20 @@
         <w:rPr>
           <w:rFonts w:eastAsia="標楷體"/>
         </w:rPr>
-        <w:t>店舖</w:t>
-      </w:r>
+        <w:t>店</w:t>
+      </w:r>
+      <w:proofErr w:type="gramStart"/>
       <w:r>
         <w:rPr>
           <w:rFonts w:eastAsia="標楷體"/>
         </w:rPr>
+        <w:t>舖</w:t>
+      </w:r>
+      <w:proofErr w:type="gramEnd"/>
+      <w:r>
+        <w:rPr>
+          <w:rFonts w:eastAsia="標楷體"/>
+        </w:rPr>
         <w:t>地理位置、時間窗限制</w:t>
       </w:r>
       <w:r>
@@ -15027,13 +15906,27 @@
         <w:rPr>
           <w:rFonts w:eastAsia="標楷體"/>
         </w:rPr>
-        <w:t>店舖</w:t>
-      </w:r>
+        <w:t>店</w:t>
+      </w:r>
+      <w:proofErr w:type="gramStart"/>
       <w:r>
         <w:rPr>
           <w:rFonts w:eastAsia="標楷體"/>
         </w:rPr>
-        <w:t>間的行駛時間</w:t>
+        <w:t>舖</w:t>
+      </w:r>
+      <w:r>
+        <w:rPr>
+          <w:rFonts w:eastAsia="標楷體"/>
+        </w:rPr>
+        <w:t>間的</w:t>
+      </w:r>
+      <w:proofErr w:type="gramEnd"/>
+      <w:r>
+        <w:rPr>
+          <w:rFonts w:eastAsia="標楷體"/>
+        </w:rPr>
+        <w:t>行駛時間</w:t>
       </w:r>
       <w:r>
         <w:rPr>
@@ -15160,7 +16053,35 @@
         <w:rPr>
           <w:rFonts w:ascii="Times New Roman" w:eastAsia="標楷體" w:hAnsi="Times New Roman" w:cs="Times New Roman"/>
         </w:rPr>
-        <w:t>路線模組主要功能在於透過蟻群演算法與多目標蟻群演算法進行配送路線的檢查、調整與優化。整體</w:t>
+        <w:t>路線模組主要功能在於</w:t>
+      </w:r>
+      <w:proofErr w:type="gramStart"/>
+      <w:r>
+        <w:rPr>
+          <w:rFonts w:ascii="Times New Roman" w:eastAsia="標楷體" w:hAnsi="Times New Roman" w:cs="Times New Roman"/>
+        </w:rPr>
+        <w:t>透過蟻群演算法</w:t>
+      </w:r>
+      <w:proofErr w:type="gramEnd"/>
+      <w:r>
+        <w:rPr>
+          <w:rFonts w:ascii="Times New Roman" w:eastAsia="標楷體" w:hAnsi="Times New Roman" w:cs="Times New Roman"/>
+        </w:rPr>
+        <w:t>與</w:t>
+      </w:r>
+      <w:proofErr w:type="gramStart"/>
+      <w:r>
+        <w:rPr>
+          <w:rFonts w:ascii="Times New Roman" w:eastAsia="標楷體" w:hAnsi="Times New Roman" w:cs="Times New Roman"/>
+        </w:rPr>
+        <w:t>多目標蟻群演算法</w:t>
+      </w:r>
+      <w:proofErr w:type="gramEnd"/>
+      <w:r>
+        <w:rPr>
+          <w:rFonts w:ascii="Times New Roman" w:eastAsia="標楷體" w:hAnsi="Times New Roman" w:cs="Times New Roman"/>
+        </w:rPr>
+        <w:t>進行配送路線的檢查、調整與優化。整體</w:t>
       </w:r>
       <w:r>
         <w:rPr>
@@ -15178,8 +16099,16 @@
         <w:rPr>
           <w:rFonts w:ascii="Times New Roman" w:eastAsia="標楷體" w:hAnsi="Times New Roman" w:cs="Times New Roman"/>
         </w:rPr>
-        <w:t>店舖</w:t>
-      </w:r>
+        <w:t>店</w:t>
+      </w:r>
+      <w:proofErr w:type="gramStart"/>
+      <w:r>
+        <w:rPr>
+          <w:rFonts w:ascii="Times New Roman" w:eastAsia="標楷體" w:hAnsi="Times New Roman" w:cs="Times New Roman"/>
+        </w:rPr>
+        <w:t>舖</w:t>
+      </w:r>
+      <w:proofErr w:type="gramEnd"/>
       <w:r>
         <w:rPr>
           <w:rFonts w:ascii="Times New Roman" w:eastAsia="標楷體" w:hAnsi="Times New Roman" w:cs="Times New Roman"/>
@@ -15196,8 +16125,16 @@
         <w:rPr>
           <w:rFonts w:ascii="Times New Roman" w:eastAsia="標楷體" w:hAnsi="Times New Roman" w:cs="Times New Roman"/>
         </w:rPr>
-        <w:t>店舖</w:t>
-      </w:r>
+        <w:t>店</w:t>
+      </w:r>
+      <w:proofErr w:type="gramStart"/>
+      <w:r>
+        <w:rPr>
+          <w:rFonts w:ascii="Times New Roman" w:eastAsia="標楷體" w:hAnsi="Times New Roman" w:cs="Times New Roman"/>
+        </w:rPr>
+        <w:t>舖</w:t>
+      </w:r>
+      <w:proofErr w:type="gramEnd"/>
       <w:r>
         <w:rPr>
           <w:rFonts w:ascii="Times New Roman" w:eastAsia="標楷體" w:hAnsi="Times New Roman" w:cs="Times New Roman"/>
@@ -15220,8 +16157,16 @@
         <w:rPr>
           <w:rFonts w:ascii="Times New Roman" w:eastAsia="標楷體" w:hAnsi="Times New Roman" w:cs="Times New Roman" w:hint="eastAsia"/>
         </w:rPr>
-        <w:t>店舖</w:t>
-      </w:r>
+        <w:t>店</w:t>
+      </w:r>
+      <w:proofErr w:type="gramStart"/>
+      <w:r>
+        <w:rPr>
+          <w:rFonts w:ascii="Times New Roman" w:eastAsia="標楷體" w:hAnsi="Times New Roman" w:cs="Times New Roman" w:hint="eastAsia"/>
+        </w:rPr>
+        <w:t>舖</w:t>
+      </w:r>
+      <w:proofErr w:type="gramEnd"/>
       <w:r>
         <w:rPr>
           <w:rFonts w:ascii="Times New Roman" w:eastAsia="標楷體" w:hAnsi="Times New Roman" w:cs="Times New Roman" w:hint="eastAsia"/>
@@ -15238,8 +16183,16 @@
         <w:rPr>
           <w:rFonts w:ascii="Times New Roman" w:eastAsia="標楷體" w:hAnsi="Times New Roman" w:cs="Times New Roman" w:hint="eastAsia"/>
         </w:rPr>
-        <w:t>店舖</w:t>
-      </w:r>
+        <w:t>店</w:t>
+      </w:r>
+      <w:proofErr w:type="gramStart"/>
+      <w:r>
+        <w:rPr>
+          <w:rFonts w:ascii="Times New Roman" w:eastAsia="標楷體" w:hAnsi="Times New Roman" w:cs="Times New Roman" w:hint="eastAsia"/>
+        </w:rPr>
+        <w:t>舖</w:t>
+      </w:r>
+      <w:proofErr w:type="gramEnd"/>
       <w:r>
         <w:rPr>
           <w:rFonts w:ascii="Times New Roman" w:eastAsia="標楷體" w:hAnsi="Times New Roman" w:cs="Times New Roman" w:hint="eastAsia"/>
@@ -15311,8 +16264,9 @@
           <w:sz w:val="28"/>
           <w:szCs w:val="28"/>
         </w:rPr>
-        <w:t>店舖</w:t>
-      </w:r>
+        <w:t>店</w:t>
+      </w:r>
+      <w:proofErr w:type="gramStart"/>
       <w:r>
         <w:rPr>
           <w:rFonts w:ascii="Times New Roman" w:eastAsia="標楷體" w:hAnsi="Times New Roman" w:cs="Times New Roman" w:hint="eastAsia"/>
@@ -15321,8 +16275,9 @@
           <w:sz w:val="28"/>
           <w:szCs w:val="28"/>
         </w:rPr>
-        <w:t>抽取</w:t>
-      </w:r>
+        <w:t>舖</w:t>
+      </w:r>
+      <w:proofErr w:type="gramEnd"/>
       <w:r>
         <w:rPr>
           <w:rFonts w:ascii="Times New Roman" w:eastAsia="標楷體" w:hAnsi="Times New Roman" w:cs="Times New Roman" w:hint="eastAsia"/>
@@ -15331,7 +16286,7 @@
           <w:sz w:val="28"/>
           <w:szCs w:val="28"/>
         </w:rPr>
-        <w:t xml:space="preserve"> </w:t>
+        <w:t>抽取</w:t>
       </w:r>
       <w:r>
         <w:rPr>
@@ -15341,26 +16296,36 @@
           <w:sz w:val="28"/>
           <w:szCs w:val="28"/>
         </w:rPr>
-        <w:t xml:space="preserve">(Store </w:t>
-      </w:r>
-      <w:r>
-        <w:rPr>
-          <w:rFonts w:ascii="Times New Roman" w:eastAsia="標楷體" w:hAnsi="Times New Roman" w:cs="Times New Roman"/>
+        <w:t xml:space="preserve"> </w:t>
+      </w:r>
+      <w:r>
+        <w:rPr>
+          <w:rFonts w:ascii="Times New Roman" w:eastAsia="標楷體" w:hAnsi="Times New Roman" w:cs="Times New Roman" w:hint="eastAsia"/>
           <w:b/>
           <w:bCs/>
           <w:sz w:val="28"/>
           <w:szCs w:val="28"/>
         </w:rPr>
-        <w:t>Extraction</w:t>
-      </w:r>
-      <w:r>
-        <w:rPr>
-          <w:rFonts w:ascii="Times New Roman" w:eastAsia="標楷體" w:hAnsi="Times New Roman" w:cs="Times New Roman" w:hint="eastAsia"/>
+        <w:t xml:space="preserve">(Store </w:t>
+      </w:r>
+      <w:r>
+        <w:rPr>
+          <w:rFonts w:ascii="Times New Roman" w:eastAsia="標楷體" w:hAnsi="Times New Roman" w:cs="Times New Roman"/>
           <w:b/>
           <w:bCs/>
           <w:sz w:val="28"/>
           <w:szCs w:val="28"/>
         </w:rPr>
+        <w:t>Extraction</w:t>
+      </w:r>
+      <w:r>
+        <w:rPr>
+          <w:rFonts w:ascii="Times New Roman" w:eastAsia="標楷體" w:hAnsi="Times New Roman" w:cs="Times New Roman" w:hint="eastAsia"/>
+          <w:b/>
+          <w:bCs/>
+          <w:sz w:val="28"/>
+          <w:szCs w:val="28"/>
+        </w:rPr>
         <w:t>)</w:t>
       </w:r>
     </w:p>
@@ -15402,8 +16367,16 @@
         <w:rPr>
           <w:rFonts w:ascii="Times New Roman" w:eastAsia="標楷體" w:hAnsi="Times New Roman" w:cs="Times New Roman"/>
         </w:rPr>
-        <w:t>店舖</w:t>
-      </w:r>
+        <w:t>店</w:t>
+      </w:r>
+      <w:proofErr w:type="gramStart"/>
+      <w:r>
+        <w:rPr>
+          <w:rFonts w:ascii="Times New Roman" w:eastAsia="標楷體" w:hAnsi="Times New Roman" w:cs="Times New Roman"/>
+        </w:rPr>
+        <w:t>舖</w:t>
+      </w:r>
+      <w:proofErr w:type="gramEnd"/>
       <w:r>
         <w:rPr>
           <w:rFonts w:ascii="Times New Roman" w:eastAsia="標楷體" w:hAnsi="Times New Roman" w:cs="Times New Roman" w:hint="eastAsia"/>
@@ -15456,7 +16429,21 @@
         <w:rPr>
           <w:rFonts w:ascii="Times New Roman" w:eastAsia="標楷體" w:hAnsi="Times New Roman" w:cs="Times New Roman" w:hint="eastAsia"/>
         </w:rPr>
-        <w:t>則該路線需透過基因演算法進行店舖抽取。</w:t>
+        <w:t>則該路線需透過基因演算法進行店</w:t>
+      </w:r>
+      <w:proofErr w:type="gramStart"/>
+      <w:r>
+        <w:rPr>
+          <w:rFonts w:ascii="Times New Roman" w:eastAsia="標楷體" w:hAnsi="Times New Roman" w:cs="Times New Roman" w:hint="eastAsia"/>
+        </w:rPr>
+        <w:t>舖</w:t>
+      </w:r>
+      <w:proofErr w:type="gramEnd"/>
+      <w:r>
+        <w:rPr>
+          <w:rFonts w:ascii="Times New Roman" w:eastAsia="標楷體" w:hAnsi="Times New Roman" w:cs="Times New Roman" w:hint="eastAsia"/>
+        </w:rPr>
+        <w:t>抽取。</w:t>
       </w:r>
       <w:r>
         <w:rPr>
@@ -15480,7 +16467,21 @@
         <w:rPr>
           <w:rFonts w:ascii="Times New Roman" w:eastAsia="標楷體" w:hAnsi="Times New Roman" w:cs="Times New Roman" w:hint="eastAsia"/>
         </w:rPr>
-        <w:t>，再根據適配度選擇個體做為父代，</w:t>
+        <w:t>，再根據</w:t>
+      </w:r>
+      <w:proofErr w:type="gramStart"/>
+      <w:r>
+        <w:rPr>
+          <w:rFonts w:ascii="Times New Roman" w:eastAsia="標楷體" w:hAnsi="Times New Roman" w:cs="Times New Roman" w:hint="eastAsia"/>
+        </w:rPr>
+        <w:t>適配度選擇</w:t>
+      </w:r>
+      <w:proofErr w:type="gramEnd"/>
+      <w:r>
+        <w:rPr>
+          <w:rFonts w:ascii="Times New Roman" w:eastAsia="標楷體" w:hAnsi="Times New Roman" w:cs="Times New Roman" w:hint="eastAsia"/>
+        </w:rPr>
+        <w:t>個體做為父代，</w:t>
       </w:r>
       <w:r>
         <w:rPr>
@@ -15516,8 +16517,16 @@
         <w:rPr>
           <w:rFonts w:ascii="Times New Roman" w:eastAsia="標楷體" w:hAnsi="Times New Roman" w:cs="Times New Roman"/>
         </w:rPr>
-        <w:t>店舖</w:t>
-      </w:r>
+        <w:t>店</w:t>
+      </w:r>
+      <w:proofErr w:type="gramStart"/>
+      <w:r>
+        <w:rPr>
+          <w:rFonts w:ascii="Times New Roman" w:eastAsia="標楷體" w:hAnsi="Times New Roman" w:cs="Times New Roman"/>
+        </w:rPr>
+        <w:t>舖</w:t>
+      </w:r>
+      <w:proofErr w:type="gramEnd"/>
       <w:r>
         <w:rPr>
           <w:rFonts w:ascii="Times New Roman" w:eastAsia="標楷體" w:hAnsi="Times New Roman" w:cs="Times New Roman" w:hint="eastAsia"/>
@@ -15558,7 +16567,21 @@
         <w:rPr>
           <w:rFonts w:ascii="Times New Roman" w:eastAsia="標楷體" w:hAnsi="Times New Roman" w:cs="Times New Roman" w:hint="eastAsia"/>
         </w:rPr>
-        <w:t>以二進制向量表示的店舖在路線上的抽取結果</w:t>
+        <w:t>以二進制向量表示的店</w:t>
+      </w:r>
+      <w:proofErr w:type="gramStart"/>
+      <w:r>
+        <w:rPr>
+          <w:rFonts w:ascii="Times New Roman" w:eastAsia="標楷體" w:hAnsi="Times New Roman" w:cs="Times New Roman" w:hint="eastAsia"/>
+        </w:rPr>
+        <w:t>舖</w:t>
+      </w:r>
+      <w:proofErr w:type="gramEnd"/>
+      <w:r>
+        <w:rPr>
+          <w:rFonts w:ascii="Times New Roman" w:eastAsia="標楷體" w:hAnsi="Times New Roman" w:cs="Times New Roman" w:hint="eastAsia"/>
+        </w:rPr>
+        <w:t>在路線上的抽取結果</w:t>
       </w:r>
       <w:r>
         <w:rPr>
@@ -15612,7 +16635,21 @@
         <w:rPr>
           <w:rFonts w:ascii="Times New Roman" w:eastAsia="標楷體" w:hAnsi="Times New Roman" w:cs="Times New Roman" w:hint="eastAsia"/>
         </w:rPr>
-        <w:t>該值透過後續候選店舖再分配與支援線規劃結果評估</w:t>
+        <w:t>該值透過後續候選店</w:t>
+      </w:r>
+      <w:proofErr w:type="gramStart"/>
+      <w:r>
+        <w:rPr>
+          <w:rFonts w:ascii="Times New Roman" w:eastAsia="標楷體" w:hAnsi="Times New Roman" w:cs="Times New Roman" w:hint="eastAsia"/>
+        </w:rPr>
+        <w:t>舖</w:t>
+      </w:r>
+      <w:proofErr w:type="gramEnd"/>
+      <w:r>
+        <w:rPr>
+          <w:rFonts w:ascii="Times New Roman" w:eastAsia="標楷體" w:hAnsi="Times New Roman" w:cs="Times New Roman" w:hint="eastAsia"/>
+        </w:rPr>
+        <w:t>再分配與支援線規劃結果評估</w:t>
       </w:r>
       <w:r>
         <w:rPr>
@@ -16090,7 +17127,6 @@
         <w:spacing w:line="360" w:lineRule="auto"/>
         <w:rPr>
           <w:rFonts w:ascii="Times New Roman" w:eastAsia="標楷體" w:hAnsi="Times New Roman" w:cs="Times New Roman"/>
-          <w:color w:val="00B0F0"/>
         </w:rPr>
       </w:pPr>
       <m:oMathPara>
@@ -16104,7 +17140,6 @@
                 <w:rPr>
                   <w:rFonts w:ascii="Cambria Math" w:eastAsia="標楷體" w:hAnsi="Cambria Math" w:cs="Times New Roman"/>
                   <w:i/>
-                  <w:color w:val="00B0F0"/>
                 </w:rPr>
               </m:ctrlPr>
             </m:sSubPr>
@@ -16112,7 +17147,6 @@
               <m:r>
                 <w:rPr>
                   <w:rFonts w:ascii="Cambria Math" w:eastAsia="標楷體" w:hAnsi="Cambria Math" w:cs="Times New Roman"/>
-                  <w:color w:val="00B0F0"/>
                 </w:rPr>
                 <m:t>F</m:t>
               </m:r>
@@ -16121,7 +17155,6 @@
               <m:r>
                 <w:rPr>
                   <w:rFonts w:ascii="Cambria Math" w:eastAsia="標楷體" w:hAnsi="Cambria Math" w:cs="Times New Roman"/>
-                  <w:color w:val="00B0F0"/>
                 </w:rPr>
                 <m:t>i</m:t>
               </m:r>
@@ -16130,7 +17163,6 @@
           <m:r>
             <w:rPr>
               <w:rFonts w:ascii="Cambria Math" w:eastAsia="標楷體" w:hAnsi="Cambria Math" w:cs="Times New Roman"/>
-              <w:color w:val="00B0F0"/>
             </w:rPr>
             <m:t>=</m:t>
           </m:r>
@@ -16140,7 +17172,6 @@
                 <w:rPr>
                   <w:rFonts w:ascii="Cambria Math" w:eastAsia="標楷體" w:hAnsi="Cambria Math" w:cs="Times New Roman"/>
                   <w:i/>
-                  <w:color w:val="00B0F0"/>
                 </w:rPr>
               </m:ctrlPr>
             </m:fPr>
@@ -16148,7 +17179,6 @@
               <m:r>
                 <w:rPr>
                   <w:rFonts w:ascii="Cambria Math" w:eastAsia="標楷體" w:hAnsi="Cambria Math" w:cs="Times New Roman"/>
-                  <w:color w:val="00B0F0"/>
                 </w:rPr>
                 <m:t>1</m:t>
               </m:r>
@@ -16160,7 +17190,6 @@
                     <w:rPr>
                       <w:rFonts w:ascii="Cambria Math" w:eastAsia="標楷體" w:hAnsi="Cambria Math" w:cs="Times New Roman"/>
                       <w:i/>
-                      <w:color w:val="00B0F0"/>
                     </w:rPr>
                   </m:ctrlPr>
                 </m:sSubSupPr>
@@ -16168,7 +17197,6 @@
                   <m:r>
                     <w:rPr>
                       <w:rFonts w:ascii="Cambria Math" w:eastAsia="標楷體" w:hAnsi="Cambria Math" w:cs="Times New Roman"/>
-                      <w:color w:val="00B0F0"/>
                     </w:rPr>
                     <m:t>C</m:t>
                   </m:r>
@@ -16177,7 +17205,6 @@
                   <m:r>
                     <w:rPr>
                       <w:rFonts w:ascii="Cambria Math" w:eastAsia="標楷體" w:hAnsi="Cambria Math" w:cs="Times New Roman"/>
-                      <w:color w:val="00B0F0"/>
                     </w:rPr>
                     <m:t>alloc</m:t>
                   </m:r>
@@ -16186,7 +17213,6 @@
                   <m:r>
                     <w:rPr>
                       <w:rFonts w:ascii="Cambria Math" w:eastAsia="標楷體" w:hAnsi="Cambria Math" w:cs="Times New Roman"/>
-                      <w:color w:val="00B0F0"/>
                     </w:rPr>
                     <m:t>i</m:t>
                   </m:r>
@@ -16195,7 +17221,6 @@
               <m:r>
                 <w:rPr>
                   <w:rFonts w:ascii="Cambria Math" w:eastAsia="標楷體" w:hAnsi="Cambria Math" w:cs="Times New Roman"/>
-                  <w:color w:val="00B0F0"/>
                 </w:rPr>
                 <m:t>+</m:t>
               </m:r>
@@ -16205,7 +17230,6 @@
                     <w:rPr>
                       <w:rFonts w:ascii="Cambria Math" w:eastAsia="標楷體" w:hAnsi="Cambria Math" w:cs="Times New Roman"/>
                       <w:i/>
-                      <w:color w:val="00B0F0"/>
                     </w:rPr>
                   </m:ctrlPr>
                 </m:sSubSupPr>
@@ -16213,7 +17237,6 @@
                   <m:r>
                     <w:rPr>
                       <w:rFonts w:ascii="Cambria Math" w:eastAsia="標楷體" w:hAnsi="Cambria Math" w:cs="Times New Roman"/>
-                      <w:color w:val="00B0F0"/>
                     </w:rPr>
                     <m:t>C</m:t>
                   </m:r>
@@ -16222,7 +17245,6 @@
                   <m:r>
                     <w:rPr>
                       <w:rFonts w:ascii="Cambria Math" w:eastAsia="標楷體" w:hAnsi="Cambria Math" w:cs="Times New Roman"/>
-                      <w:color w:val="00B0F0"/>
                     </w:rPr>
                     <m:t>sup</m:t>
                   </m:r>
@@ -16231,7 +17253,6 @@
                   <m:r>
                     <w:rPr>
                       <w:rFonts w:ascii="Cambria Math" w:eastAsia="標楷體" w:hAnsi="Cambria Math" w:cs="Times New Roman"/>
-                      <w:color w:val="00B0F0"/>
                     </w:rPr>
                     <m:t>i</m:t>
                   </m:r>
@@ -16242,7 +17263,6 @@
           <m:r>
             <w:rPr>
               <w:rFonts w:ascii="Cambria Math" w:eastAsia="標楷體" w:hAnsi="Cambria Math" w:cs="Times New Roman"/>
-              <w:color w:val="00B0F0"/>
             </w:rPr>
             <m:t xml:space="preserve">                                                                                                                                   ()</m:t>
           </m:r>
@@ -16543,8 +17563,9 @@
           <w:sz w:val="28"/>
           <w:szCs w:val="28"/>
         </w:rPr>
-        <w:t>店舖</w:t>
-      </w:r>
+        <w:t>店</w:t>
+      </w:r>
+      <w:proofErr w:type="gramStart"/>
       <w:r>
         <w:rPr>
           <w:rFonts w:ascii="Times New Roman" w:eastAsia="標楷體" w:hAnsi="Times New Roman" w:cs="Times New Roman" w:hint="eastAsia"/>
@@ -16553,8 +17574,9 @@
           <w:sz w:val="28"/>
           <w:szCs w:val="28"/>
         </w:rPr>
-        <w:t>分配</w:t>
-      </w:r>
+        <w:t>舖</w:t>
+      </w:r>
+      <w:proofErr w:type="gramEnd"/>
       <w:r>
         <w:rPr>
           <w:rFonts w:ascii="Times New Roman" w:eastAsia="標楷體" w:hAnsi="Times New Roman" w:cs="Times New Roman" w:hint="eastAsia"/>
@@ -16563,7 +17585,7 @@
           <w:sz w:val="28"/>
           <w:szCs w:val="28"/>
         </w:rPr>
-        <w:t xml:space="preserve"> </w:t>
+        <w:t>分配</w:t>
       </w:r>
       <w:r>
         <w:rPr>
@@ -16573,7 +17595,7 @@
           <w:sz w:val="28"/>
           <w:szCs w:val="28"/>
         </w:rPr>
-        <w:t xml:space="preserve">(Store </w:t>
+        <w:t xml:space="preserve"> </w:t>
       </w:r>
       <w:r>
         <w:rPr>
@@ -16583,7 +17605,7 @@
           <w:sz w:val="28"/>
           <w:szCs w:val="28"/>
         </w:rPr>
-        <w:t>A</w:t>
+        <w:t xml:space="preserve">(Store </w:t>
       </w:r>
       <w:r>
         <w:rPr>
@@ -16593,7 +17615,7 @@
           <w:sz w:val="28"/>
           <w:szCs w:val="28"/>
         </w:rPr>
-        <w:t>llocation</w:t>
+        <w:t>A</w:t>
       </w:r>
       <w:r>
         <w:rPr>
@@ -16603,16 +17625,26 @@
           <w:sz w:val="28"/>
           <w:szCs w:val="28"/>
         </w:rPr>
-        <w:t>)</w:t>
-      </w:r>
-      <w:r>
-        <w:rPr>
-          <w:rFonts w:ascii="Times New Roman" w:eastAsia="標楷體" w:hAnsi="Times New Roman" w:cs="Times New Roman"/>
+        <w:t>llocation</w:t>
+      </w:r>
+      <w:r>
+        <w:rPr>
+          <w:rFonts w:ascii="Times New Roman" w:eastAsia="標楷體" w:hAnsi="Times New Roman" w:cs="Times New Roman" w:hint="eastAsia"/>
           <w:b/>
           <w:bCs/>
           <w:sz w:val="28"/>
           <w:szCs w:val="28"/>
         </w:rPr>
+        <w:t>)</w:t>
+      </w:r>
+      <w:r>
+        <w:rPr>
+          <w:rFonts w:ascii="Times New Roman" w:eastAsia="標楷體" w:hAnsi="Times New Roman" w:cs="Times New Roman"/>
+          <w:b/>
+          <w:bCs/>
+          <w:sz w:val="28"/>
+          <w:szCs w:val="28"/>
+        </w:rPr>
         <w:tab/>
       </w:r>
     </w:p>
@@ -16635,8 +17667,16 @@
         <w:rPr>
           <w:rFonts w:ascii="Times New Roman" w:eastAsia="標楷體" w:hAnsi="Times New Roman" w:cs="Times New Roman"/>
         </w:rPr>
-        <w:t>店舖</w:t>
-      </w:r>
+        <w:t>店</w:t>
+      </w:r>
+      <w:proofErr w:type="gramStart"/>
+      <w:r>
+        <w:rPr>
+          <w:rFonts w:ascii="Times New Roman" w:eastAsia="標楷體" w:hAnsi="Times New Roman" w:cs="Times New Roman"/>
+        </w:rPr>
+        <w:t>舖</w:t>
+      </w:r>
+      <w:proofErr w:type="gramEnd"/>
       <w:r>
         <w:rPr>
           <w:rFonts w:ascii="Times New Roman" w:eastAsia="標楷體" w:hAnsi="Times New Roman" w:cs="Times New Roman"/>
@@ -16653,8 +17693,16 @@
         <w:rPr>
           <w:rFonts w:ascii="Times New Roman" w:eastAsia="標楷體" w:hAnsi="Times New Roman" w:cs="Times New Roman"/>
         </w:rPr>
-        <w:t>店舖</w:t>
-      </w:r>
+        <w:t>店</w:t>
+      </w:r>
+      <w:proofErr w:type="gramStart"/>
+      <w:r>
+        <w:rPr>
+          <w:rFonts w:ascii="Times New Roman" w:eastAsia="標楷體" w:hAnsi="Times New Roman" w:cs="Times New Roman"/>
+        </w:rPr>
+        <w:t>舖</w:t>
+      </w:r>
+      <w:proofErr w:type="gramEnd"/>
       <w:r>
         <w:rPr>
           <w:rFonts w:ascii="Times New Roman" w:eastAsia="標楷體" w:hAnsi="Times New Roman" w:cs="Times New Roman"/>
@@ -16665,13 +17713,35 @@
         <w:rPr>
           <w:rFonts w:ascii="Times New Roman" w:eastAsia="標楷體" w:hAnsi="Times New Roman" w:cs="Times New Roman"/>
         </w:rPr>
-        <w:t>店舖</w:t>
-      </w:r>
-      <w:r>
-        <w:rPr>
-          <w:rFonts w:ascii="Times New Roman" w:eastAsia="標楷體" w:hAnsi="Times New Roman" w:cs="Times New Roman"/>
-        </w:rPr>
-        <w:t>重新指派至尚有剩餘容量的主線</w:t>
+        <w:t>店</w:t>
+      </w:r>
+      <w:proofErr w:type="gramStart"/>
+      <w:r>
+        <w:rPr>
+          <w:rFonts w:ascii="Times New Roman" w:eastAsia="標楷體" w:hAnsi="Times New Roman" w:cs="Times New Roman"/>
+        </w:rPr>
+        <w:t>舖</w:t>
+      </w:r>
+      <w:proofErr w:type="gramEnd"/>
+      <w:r>
+        <w:rPr>
+          <w:rFonts w:ascii="Times New Roman" w:eastAsia="標楷體" w:hAnsi="Times New Roman" w:cs="Times New Roman"/>
+        </w:rPr>
+        <w:t>重新</w:t>
+      </w:r>
+      <w:proofErr w:type="gramStart"/>
+      <w:r>
+        <w:rPr>
+          <w:rFonts w:ascii="Times New Roman" w:eastAsia="標楷體" w:hAnsi="Times New Roman" w:cs="Times New Roman"/>
+        </w:rPr>
+        <w:t>指派至尚有</w:t>
+      </w:r>
+      <w:proofErr w:type="gramEnd"/>
+      <w:r>
+        <w:rPr>
+          <w:rFonts w:ascii="Times New Roman" w:eastAsia="標楷體" w:hAnsi="Times New Roman" w:cs="Times New Roman"/>
+        </w:rPr>
+        <w:t>剩餘容量的主線</w:t>
       </w:r>
       <w:r>
         <w:rPr>
@@ -16707,8 +17777,16 @@
         <w:rPr>
           <w:rFonts w:ascii="Times New Roman" w:eastAsia="標楷體" w:hAnsi="Times New Roman" w:cs="Times New Roman" w:hint="eastAsia"/>
         </w:rPr>
-        <w:t>店舖</w:t>
-      </w:r>
+        <w:t>店</w:t>
+      </w:r>
+      <w:proofErr w:type="gramStart"/>
+      <w:r>
+        <w:rPr>
+          <w:rFonts w:ascii="Times New Roman" w:eastAsia="標楷體" w:hAnsi="Times New Roman" w:cs="Times New Roman" w:hint="eastAsia"/>
+        </w:rPr>
+        <w:t>舖</w:t>
+      </w:r>
+      <w:proofErr w:type="gramEnd"/>
       <w:r>
         <w:rPr>
           <w:rFonts w:ascii="Times New Roman" w:eastAsia="標楷體" w:hAnsi="Times New Roman" w:cs="Times New Roman"/>
@@ -16755,8 +17833,16 @@
         <w:rPr>
           <w:rFonts w:ascii="Times New Roman" w:eastAsia="標楷體" w:hAnsi="Times New Roman" w:cs="Times New Roman" w:hint="eastAsia"/>
         </w:rPr>
-        <w:t>店舖</w:t>
-      </w:r>
+        <w:t>店</w:t>
+      </w:r>
+      <w:proofErr w:type="gramStart"/>
+      <w:r>
+        <w:rPr>
+          <w:rFonts w:ascii="Times New Roman" w:eastAsia="標楷體" w:hAnsi="Times New Roman" w:cs="Times New Roman" w:hint="eastAsia"/>
+        </w:rPr>
+        <w:t>舖</w:t>
+      </w:r>
+      <w:proofErr w:type="gramEnd"/>
       <w:r>
         <w:rPr>
           <w:rFonts w:ascii="Times New Roman" w:eastAsia="標楷體" w:hAnsi="Times New Roman" w:cs="Times New Roman"/>
@@ -16779,8 +17865,16 @@
         <w:rPr>
           <w:rFonts w:ascii="Times New Roman" w:eastAsia="標楷體" w:hAnsi="Times New Roman" w:cs="Times New Roman" w:hint="eastAsia"/>
         </w:rPr>
-        <w:t>載上限，時間窗則透過</w:t>
-      </w:r>
+        <w:t>載上限，</w:t>
+      </w:r>
+      <w:proofErr w:type="gramStart"/>
+      <w:r>
+        <w:rPr>
+          <w:rFonts w:ascii="Times New Roman" w:eastAsia="標楷體" w:hAnsi="Times New Roman" w:cs="Times New Roman" w:hint="eastAsia"/>
+        </w:rPr>
+        <w:t>時間窗則透過</w:t>
+      </w:r>
+      <w:proofErr w:type="gramEnd"/>
       <w:r>
         <w:rPr>
           <w:rFonts w:ascii="Times New Roman" w:eastAsia="標楷體" w:hAnsi="Times New Roman" w:cs="Times New Roman"/>
@@ -16833,8 +17927,16 @@
         <w:rPr>
           <w:rFonts w:ascii="Times New Roman" w:eastAsia="標楷體" w:hAnsi="Times New Roman" w:cs="Times New Roman"/>
         </w:rPr>
-        <w:t>店舖</w:t>
-      </w:r>
+        <w:t>店</w:t>
+      </w:r>
+      <w:proofErr w:type="gramStart"/>
+      <w:r>
+        <w:rPr>
+          <w:rFonts w:ascii="Times New Roman" w:eastAsia="標楷體" w:hAnsi="Times New Roman" w:cs="Times New Roman"/>
+        </w:rPr>
+        <w:t>舖</w:t>
+      </w:r>
+      <w:proofErr w:type="gramEnd"/>
       <w:r>
         <w:rPr>
           <w:rFonts w:ascii="Times New Roman" w:eastAsia="標楷體" w:hAnsi="Times New Roman" w:cs="Times New Roman"/>
@@ -16966,8 +18068,16 @@
           <w:rFonts w:ascii="Times New Roman" w:eastAsia="標楷體" w:hAnsi="Times New Roman" w:cs="Times New Roman" w:hint="eastAsia"/>
         </w:rPr>
         <w:lastRenderedPageBreak/>
-        <w:t>店舖</w:t>
-      </w:r>
+        <w:t>店</w:t>
+      </w:r>
+      <w:proofErr w:type="gramStart"/>
+      <w:r>
+        <w:rPr>
+          <w:rFonts w:ascii="Times New Roman" w:eastAsia="標楷體" w:hAnsi="Times New Roman" w:cs="Times New Roman" w:hint="eastAsia"/>
+        </w:rPr>
+        <w:t>舖</w:t>
+      </w:r>
+      <w:proofErr w:type="gramEnd"/>
       <w:r>
         <w:rPr>
           <w:rFonts w:ascii="Times New Roman" w:eastAsia="標楷體" w:hAnsi="Times New Roman" w:cs="Times New Roman"/>
@@ -16984,7 +18094,35 @@
         <w:rPr>
           <w:rFonts w:ascii="Times New Roman" w:eastAsia="標楷體" w:hAnsi="Times New Roman" w:cs="Times New Roman"/>
         </w:rPr>
-        <w:t>店舖的服務後，經過兩點間的行駛時間才抵達下一節點。式</w:t>
+        <w:t>店</w:t>
+      </w:r>
+      <w:proofErr w:type="gramStart"/>
+      <w:r>
+        <w:rPr>
+          <w:rFonts w:ascii="Times New Roman" w:eastAsia="標楷體" w:hAnsi="Times New Roman" w:cs="Times New Roman"/>
+        </w:rPr>
+        <w:t>舖</w:t>
+      </w:r>
+      <w:proofErr w:type="gramEnd"/>
+      <w:r>
+        <w:rPr>
+          <w:rFonts w:ascii="Times New Roman" w:eastAsia="標楷體" w:hAnsi="Times New Roman" w:cs="Times New Roman"/>
+        </w:rPr>
+        <w:t>的服務後，經過</w:t>
+      </w:r>
+      <w:proofErr w:type="gramStart"/>
+      <w:r>
+        <w:rPr>
+          <w:rFonts w:ascii="Times New Roman" w:eastAsia="標楷體" w:hAnsi="Times New Roman" w:cs="Times New Roman"/>
+        </w:rPr>
+        <w:t>兩點間的行駛</w:t>
+      </w:r>
+      <w:proofErr w:type="gramEnd"/>
+      <w:r>
+        <w:rPr>
+          <w:rFonts w:ascii="Times New Roman" w:eastAsia="標楷體" w:hAnsi="Times New Roman" w:cs="Times New Roman"/>
+        </w:rPr>
+        <w:t>時間才抵達下一節點。式</w:t>
       </w:r>
       <w:r>
         <w:rPr>
@@ -17008,7 +18146,21 @@
         <w:rPr>
           <w:rFonts w:ascii="Times New Roman" w:eastAsia="標楷體" w:hAnsi="Times New Roman" w:cs="Times New Roman"/>
         </w:rPr>
-        <w:t>每家店舖的到達時間必須落在允許的服務時間範圍內，本研究設定為表定時間的前三十分鐘至後一小時</w:t>
+        <w:t>每家店</w:t>
+      </w:r>
+      <w:proofErr w:type="gramStart"/>
+      <w:r>
+        <w:rPr>
+          <w:rFonts w:ascii="Times New Roman" w:eastAsia="標楷體" w:hAnsi="Times New Roman" w:cs="Times New Roman"/>
+        </w:rPr>
+        <w:t>舖</w:t>
+      </w:r>
+      <w:proofErr w:type="gramEnd"/>
+      <w:r>
+        <w:rPr>
+          <w:rFonts w:ascii="Times New Roman" w:eastAsia="標楷體" w:hAnsi="Times New Roman" w:cs="Times New Roman"/>
+        </w:rPr>
+        <w:t>的到達時間必須落在允許的服務時間範圍內，本研究設定為表定時間的前三十分鐘至後一小時</w:t>
       </w:r>
       <w:r>
         <w:rPr>
@@ -17050,8 +18202,16 @@
         <w:rPr>
           <w:rFonts w:ascii="Times New Roman" w:eastAsia="標楷體" w:hAnsi="Times New Roman" w:cs="Times New Roman"/>
         </w:rPr>
-        <w:t>店舖</w:t>
-      </w:r>
+        <w:t>店</w:t>
+      </w:r>
+      <w:proofErr w:type="gramStart"/>
+      <w:r>
+        <w:rPr>
+          <w:rFonts w:ascii="Times New Roman" w:eastAsia="標楷體" w:hAnsi="Times New Roman" w:cs="Times New Roman"/>
+        </w:rPr>
+        <w:t>舖</w:t>
+      </w:r>
+      <w:proofErr w:type="gramEnd"/>
       <w:r>
         <w:rPr>
           <w:rFonts w:ascii="Times New Roman" w:eastAsia="標楷體" w:hAnsi="Times New Roman" w:cs="Times New Roman"/>
@@ -17086,8 +18246,16 @@
         <w:rPr>
           <w:rFonts w:ascii="Times New Roman" w:eastAsia="標楷體" w:hAnsi="Times New Roman" w:cs="Times New Roman"/>
         </w:rPr>
-        <w:t>每個</w:t>
-      </w:r>
+        <w:t>每</w:t>
+      </w:r>
+      <w:proofErr w:type="gramStart"/>
+      <w:r>
+        <w:rPr>
+          <w:rFonts w:ascii="Times New Roman" w:eastAsia="標楷體" w:hAnsi="Times New Roman" w:cs="Times New Roman"/>
+        </w:rPr>
+        <w:t>個</w:t>
+      </w:r>
+      <w:proofErr w:type="gramEnd"/>
       <w:r>
         <w:rPr>
           <w:rFonts w:ascii="Times New Roman" w:eastAsia="標楷體" w:hAnsi="Times New Roman" w:cs="Times New Roman" w:hint="eastAsia"/>
@@ -17098,8 +18266,16 @@
         <w:rPr>
           <w:rFonts w:ascii="Times New Roman" w:eastAsia="標楷體" w:hAnsi="Times New Roman" w:cs="Times New Roman"/>
         </w:rPr>
-        <w:t>店舖</w:t>
-      </w:r>
+        <w:t>店</w:t>
+      </w:r>
+      <w:proofErr w:type="gramStart"/>
+      <w:r>
+        <w:rPr>
+          <w:rFonts w:ascii="Times New Roman" w:eastAsia="標楷體" w:hAnsi="Times New Roman" w:cs="Times New Roman"/>
+        </w:rPr>
+        <w:t>舖</w:t>
+      </w:r>
+      <w:proofErr w:type="gramEnd"/>
       <w:r>
         <w:rPr>
           <w:rFonts w:ascii="Times New Roman" w:eastAsia="標楷體" w:hAnsi="Times New Roman" w:cs="Times New Roman" w:hint="eastAsia"/>
@@ -17144,7 +18320,6 @@
         <w:jc w:val="both"/>
         <w:rPr>
           <w:rFonts w:ascii="Times New Roman" w:eastAsia="標楷體" w:hAnsi="Times New Roman" w:cs="Times New Roman"/>
-          <w:color w:val="00B0F0"/>
         </w:rPr>
       </w:pPr>
       <m:oMathPara>
@@ -17158,7 +18333,6 @@
                 <w:rPr>
                   <w:rFonts w:ascii="Cambria Math" w:eastAsia="標楷體" w:hAnsi="Cambria Math" w:cs="Times New Roman"/>
                   <w:i/>
-                  <w:color w:val="00B0F0"/>
                 </w:rPr>
               </m:ctrlPr>
             </m:sSubPr>
@@ -17166,7 +18340,6 @@
               <m:r>
                 <w:rPr>
                   <w:rFonts w:ascii="Cambria Math" w:eastAsia="標楷體" w:hAnsi="Cambria Math" w:cs="Times New Roman" w:hint="eastAsia"/>
-                  <w:color w:val="00B0F0"/>
                 </w:rPr>
                 <m:t>C</m:t>
               </m:r>
@@ -17174,7 +18347,6 @@
                 <w:rPr>
                   <w:rFonts w:ascii="Cambria Math" w:eastAsia="標楷體" w:hAnsi="Cambria Math" w:cs="Times New Roman" w:hint="eastAsia"/>
                   <w:i/>
-                  <w:color w:val="00B0F0"/>
                 </w:rPr>
               </m:ctrlPr>
             </m:e>
@@ -17182,7 +18354,6 @@
               <m:r>
                 <w:rPr>
                   <w:rFonts w:ascii="Cambria Math" w:eastAsia="標楷體" w:hAnsi="Cambria Math" w:cs="Times New Roman"/>
-                  <w:color w:val="00B0F0"/>
                 </w:rPr>
                 <m:t>alloc</m:t>
               </m:r>
@@ -17191,7 +18362,6 @@
           <m:r>
             <w:rPr>
               <w:rFonts w:ascii="Cambria Math" w:eastAsia="標楷體" w:hAnsi="Cambria Math" w:cs="Times New Roman"/>
-              <w:color w:val="00B0F0"/>
             </w:rPr>
             <m:t>=</m:t>
           </m:r>
@@ -17202,7 +18372,6 @@
                 <w:rPr>
                   <w:rFonts w:ascii="Cambria Math" w:eastAsia="標楷體" w:hAnsi="Cambria Math" w:cs="Times New Roman"/>
                   <w:i/>
-                  <w:color w:val="00B0F0"/>
                 </w:rPr>
               </m:ctrlPr>
             </m:naryPr>
@@ -17210,7 +18379,6 @@
               <m:r>
                 <w:rPr>
                   <w:rFonts w:ascii="Cambria Math" w:eastAsia="標楷體" w:hAnsi="Cambria Math" w:cs="Times New Roman"/>
-                  <w:color w:val="00B0F0"/>
                 </w:rPr>
                 <m:t>i=1</m:t>
               </m:r>
@@ -17219,7 +18387,6 @@
               <m:r>
                 <w:rPr>
                   <w:rFonts w:ascii="Cambria Math" w:eastAsia="標楷體" w:hAnsi="Cambria Math" w:cs="Times New Roman"/>
-                  <w:color w:val="00B0F0"/>
                 </w:rPr>
                 <m:t>R</m:t>
               </m:r>
@@ -17232,7 +18399,6 @@
                     <w:rPr>
                       <w:rFonts w:ascii="Cambria Math" w:eastAsia="標楷體" w:hAnsi="Cambria Math" w:cs="Times New Roman"/>
                       <w:i/>
-                      <w:color w:val="00B0F0"/>
                     </w:rPr>
                   </m:ctrlPr>
                 </m:naryPr>
@@ -17240,7 +18406,6 @@
                   <m:r>
                     <w:rPr>
                       <w:rFonts w:ascii="Cambria Math" w:eastAsia="標楷體" w:hAnsi="Cambria Math" w:cs="Times New Roman"/>
-                      <w:color w:val="00B0F0"/>
                     </w:rPr>
                     <m:t>j=1</m:t>
                   </m:r>
@@ -17249,7 +18414,6 @@
                   <m:r>
                     <w:rPr>
                       <w:rFonts w:ascii="Cambria Math" w:eastAsia="標楷體" w:hAnsi="Cambria Math" w:cs="Times New Roman"/>
-                      <w:color w:val="00B0F0"/>
                     </w:rPr>
                     <m:t>N</m:t>
                   </m:r>
@@ -17261,7 +18425,6 @@
                         <w:rPr>
                           <w:rFonts w:ascii="Cambria Math" w:eastAsia="標楷體" w:hAnsi="Cambria Math" w:cs="Times New Roman"/>
                           <w:i/>
-                          <w:color w:val="00B0F0"/>
                         </w:rPr>
                       </m:ctrlPr>
                     </m:sSubPr>
@@ -17269,7 +18432,6 @@
                       <m:r>
                         <w:rPr>
                           <w:rFonts w:ascii="Cambria Math" w:eastAsia="標楷體" w:hAnsi="Cambria Math" w:cs="Times New Roman"/>
-                          <w:color w:val="00B0F0"/>
                         </w:rPr>
                         <m:t>C</m:t>
                       </m:r>
@@ -17278,7 +18440,6 @@
                       <m:r>
                         <w:rPr>
                           <w:rFonts w:ascii="Cambria Math" w:eastAsia="標楷體" w:hAnsi="Cambria Math" w:cs="Times New Roman"/>
-                          <w:color w:val="00B0F0"/>
                         </w:rPr>
                         <m:t>ij</m:t>
                       </m:r>
@@ -17287,7 +18448,6 @@
                   <m:r>
                     <w:rPr>
                       <w:rFonts w:ascii="Cambria Math" w:eastAsia="標楷體" w:hAnsi="Cambria Math" w:cs="Times New Roman"/>
-                      <w:color w:val="00B0F0"/>
                     </w:rPr>
                     <m:t>⋅</m:t>
                   </m:r>
@@ -17297,7 +18457,6 @@
                         <w:rPr>
                           <w:rFonts w:ascii="Cambria Math" w:eastAsia="標楷體" w:hAnsi="Cambria Math" w:cs="Times New Roman"/>
                           <w:i/>
-                          <w:color w:val="00B0F0"/>
                         </w:rPr>
                       </m:ctrlPr>
                     </m:sSubPr>
@@ -17305,7 +18464,6 @@
                       <m:r>
                         <w:rPr>
                           <w:rFonts w:ascii="Cambria Math" w:eastAsia="標楷體" w:hAnsi="Cambria Math" w:cs="Times New Roman"/>
-                          <w:color w:val="00B0F0"/>
                         </w:rPr>
                         <m:t>x</m:t>
                       </m:r>
@@ -17314,7 +18472,6 @@
                       <m:r>
                         <w:rPr>
                           <w:rFonts w:ascii="Cambria Math" w:eastAsia="標楷體" w:hAnsi="Cambria Math" w:cs="Times New Roman"/>
-                          <w:color w:val="00B0F0"/>
                         </w:rPr>
                         <m:t>ij</m:t>
                       </m:r>
@@ -17327,56 +18484,48 @@
           <m:r>
             <w:rPr>
               <w:rFonts w:ascii="Cambria Math" w:eastAsia="標楷體" w:hAnsi="Cambria Math" w:cs="Times New Roman"/>
-              <w:color w:val="00B0F0"/>
             </w:rPr>
             <m:t xml:space="preserve">                                                                  i∈R, j∈</m:t>
           </m:r>
           <m:r>
             <w:rPr>
               <w:rFonts w:ascii="Cambria Math" w:eastAsia="標楷體" w:hAnsi="Cambria Math" w:cs="Times New Roman" w:hint="eastAsia"/>
-              <w:color w:val="00B0F0"/>
             </w:rPr>
             <m:t>N</m:t>
           </m:r>
           <m:r>
             <w:rPr>
               <w:rFonts w:ascii="Cambria Math" w:eastAsia="標楷體" w:hAnsi="Cambria Math" w:cs="Times New Roman"/>
-              <w:color w:val="00B0F0"/>
             </w:rPr>
             <m:t xml:space="preserve">                 </m:t>
           </m:r>
           <m:r>
             <w:rPr>
               <w:rFonts w:ascii="Cambria Math" w:eastAsia="標楷體" w:hAnsi="Cambria Math" w:cs="Times New Roman" w:hint="eastAsia"/>
-              <w:color w:val="00B0F0"/>
             </w:rPr>
             <m:t xml:space="preserve"> </m:t>
           </m:r>
           <m:r>
             <w:rPr>
               <w:rFonts w:ascii="Cambria Math" w:eastAsia="標楷體" w:hAnsi="Cambria Math" w:cs="Times New Roman"/>
-              <w:color w:val="00B0F0"/>
             </w:rPr>
             <m:t xml:space="preserve">      </m:t>
           </m:r>
           <m:r>
             <w:rPr>
               <w:rFonts w:ascii="Cambria Math" w:eastAsia="標楷體" w:hAnsi="Cambria Math" w:cs="Times New Roman" w:hint="eastAsia"/>
-              <w:color w:val="00B0F0"/>
             </w:rPr>
             <m:t xml:space="preserve">  </m:t>
           </m:r>
           <m:r>
             <w:rPr>
               <w:rFonts w:ascii="Cambria Math" w:eastAsia="標楷體" w:hAnsi="Cambria Math" w:cs="Times New Roman"/>
-              <w:color w:val="00B0F0"/>
             </w:rPr>
             <m:t xml:space="preserve">        </m:t>
           </m:r>
           <m:r>
             <w:rPr>
               <w:rFonts w:ascii="Cambria Math" w:eastAsia="標楷體" w:hAnsi="Cambria Math" w:cs="Times New Roman" w:hint="eastAsia"/>
-              <w:color w:val="00B0F0"/>
             </w:rPr>
             <m:t>()</m:t>
           </m:r>
@@ -18647,8 +19796,16 @@
         <w:rPr>
           <w:rFonts w:ascii="Times New Roman" w:eastAsia="標楷體" w:hAnsi="Times New Roman" w:cs="Times New Roman"/>
         </w:rPr>
-        <w:t>店舖</w:t>
-      </w:r>
+        <w:t>店</w:t>
+      </w:r>
+      <w:proofErr w:type="gramStart"/>
+      <w:r>
+        <w:rPr>
+          <w:rFonts w:ascii="Times New Roman" w:eastAsia="標楷體" w:hAnsi="Times New Roman" w:cs="Times New Roman"/>
+        </w:rPr>
+        <w:t>舖</w:t>
+      </w:r>
+      <w:proofErr w:type="gramEnd"/>
       <w:r>
         <w:rPr>
           <w:rFonts w:ascii="Times New Roman" w:eastAsia="標楷體" w:hAnsi="Times New Roman" w:cs="Times New Roman"/>
@@ -18707,13 +19864,49 @@
         <w:rPr>
           <w:rFonts w:ascii="Times New Roman" w:eastAsia="標楷體" w:hAnsi="Times New Roman" w:cs="Times New Roman"/>
         </w:rPr>
-        <w:t>店舖</w:t>
-      </w:r>
-      <w:r>
-        <w:rPr>
-          <w:rFonts w:ascii="Times New Roman" w:eastAsia="標楷體" w:hAnsi="Times New Roman" w:cs="Times New Roman"/>
-        </w:rPr>
-        <w:t>與物流中心的地理位置，將路線劃分為近區、中區與遠區，以減少跨區配送所帶來的效率</w:t>
+        <w:t>店</w:t>
+      </w:r>
+      <w:proofErr w:type="gramStart"/>
+      <w:r>
+        <w:rPr>
+          <w:rFonts w:ascii="Times New Roman" w:eastAsia="標楷體" w:hAnsi="Times New Roman" w:cs="Times New Roman"/>
+        </w:rPr>
+        <w:t>舖</w:t>
+      </w:r>
+      <w:proofErr w:type="gramEnd"/>
+      <w:r>
+        <w:rPr>
+          <w:rFonts w:ascii="Times New Roman" w:eastAsia="標楷體" w:hAnsi="Times New Roman" w:cs="Times New Roman"/>
+        </w:rPr>
+        <w:t>與物流中心的地理位置，將路線劃分</w:t>
+      </w:r>
+      <w:proofErr w:type="gramStart"/>
+      <w:r>
+        <w:rPr>
+          <w:rFonts w:ascii="Times New Roman" w:eastAsia="標楷體" w:hAnsi="Times New Roman" w:cs="Times New Roman"/>
+        </w:rPr>
+        <w:t>為近區</w:t>
+      </w:r>
+      <w:proofErr w:type="gramEnd"/>
+      <w:r>
+        <w:rPr>
+          <w:rFonts w:ascii="Times New Roman" w:eastAsia="標楷體" w:hAnsi="Times New Roman" w:cs="Times New Roman"/>
+        </w:rPr>
+        <w:t>、中區</w:t>
+      </w:r>
+      <w:proofErr w:type="gramStart"/>
+      <w:r>
+        <w:rPr>
+          <w:rFonts w:ascii="Times New Roman" w:eastAsia="標楷體" w:hAnsi="Times New Roman" w:cs="Times New Roman"/>
+        </w:rPr>
+        <w:t>與遠區</w:t>
+      </w:r>
+      <w:proofErr w:type="gramEnd"/>
+      <w:r>
+        <w:rPr>
+          <w:rFonts w:ascii="Times New Roman" w:eastAsia="標楷體" w:hAnsi="Times New Roman" w:cs="Times New Roman"/>
+        </w:rPr>
+        <w:t>，以減少跨區配送所帶來的效率</w:t>
       </w:r>
       <w:r>
         <w:rPr>
@@ -18725,7 +19918,35 @@
         <w:rPr>
           <w:rFonts w:ascii="Times New Roman" w:eastAsia="標楷體" w:hAnsi="Times New Roman" w:cs="Times New Roman"/>
         </w:rPr>
-        <w:t>。此外，所有生成的支援線均需遵守五小時以內的行駛時間</w:t>
+        <w:t>。</w:t>
+      </w:r>
+      <w:proofErr w:type="gramStart"/>
+      <w:r>
+        <w:rPr>
+          <w:rFonts w:ascii="Times New Roman" w:eastAsia="標楷體" w:hAnsi="Times New Roman" w:cs="Times New Roman"/>
+        </w:rPr>
+        <w:t>此外，</w:t>
+      </w:r>
+      <w:proofErr w:type="gramEnd"/>
+      <w:r>
+        <w:rPr>
+          <w:rFonts w:ascii="Times New Roman" w:eastAsia="標楷體" w:hAnsi="Times New Roman" w:cs="Times New Roman"/>
+        </w:rPr>
+        <w:t>所有生成的支援</w:t>
+      </w:r>
+      <w:proofErr w:type="gramStart"/>
+      <w:r>
+        <w:rPr>
+          <w:rFonts w:ascii="Times New Roman" w:eastAsia="標楷體" w:hAnsi="Times New Roman" w:cs="Times New Roman"/>
+        </w:rPr>
+        <w:t>線均需遵守</w:t>
+      </w:r>
+      <w:proofErr w:type="gramEnd"/>
+      <w:r>
+        <w:rPr>
+          <w:rFonts w:ascii="Times New Roman" w:eastAsia="標楷體" w:hAnsi="Times New Roman" w:cs="Times New Roman"/>
+        </w:rPr>
+        <w:t>五小時以內的行駛時間</w:t>
       </w:r>
       <w:r>
         <w:rPr>
@@ -18780,7 +20001,21 @@
         <w:rPr>
           <w:rFonts w:ascii="Times New Roman" w:eastAsia="標楷體" w:hAnsi="Times New Roman" w:cs="Times New Roman" w:hint="eastAsia"/>
         </w:rPr>
-        <w:t>店舖的預定到達時間，</w:t>
+        <w:t>店</w:t>
+      </w:r>
+      <w:proofErr w:type="gramStart"/>
+      <w:r>
+        <w:rPr>
+          <w:rFonts w:ascii="Times New Roman" w:eastAsia="標楷體" w:hAnsi="Times New Roman" w:cs="Times New Roman" w:hint="eastAsia"/>
+        </w:rPr>
+        <w:t>舖</w:t>
+      </w:r>
+      <w:proofErr w:type="gramEnd"/>
+      <w:r>
+        <w:rPr>
+          <w:rFonts w:ascii="Times New Roman" w:eastAsia="標楷體" w:hAnsi="Times New Roman" w:cs="Times New Roman" w:hint="eastAsia"/>
+        </w:rPr>
+        <w:t>的預定到達時間，</w:t>
       </w:r>
       <w:r>
         <w:rPr>
@@ -18798,8 +20033,16 @@
         <w:rPr>
           <w:rFonts w:ascii="Times New Roman" w:eastAsia="標楷體" w:hAnsi="Times New Roman" w:cs="Times New Roman"/>
         </w:rPr>
-        <w:t>店舖</w:t>
-      </w:r>
+        <w:t>店</w:t>
+      </w:r>
+      <w:proofErr w:type="gramStart"/>
+      <w:r>
+        <w:rPr>
+          <w:rFonts w:ascii="Times New Roman" w:eastAsia="標楷體" w:hAnsi="Times New Roman" w:cs="Times New Roman"/>
+        </w:rPr>
+        <w:t>舖</w:t>
+      </w:r>
+      <w:proofErr w:type="gramEnd"/>
       <w:r>
         <w:rPr>
           <w:rFonts w:ascii="Times New Roman" w:eastAsia="標楷體" w:hAnsi="Times New Roman" w:cs="Times New Roman"/>
@@ -19002,8 +20245,16 @@
         <w:rPr>
           <w:rFonts w:ascii="Times New Roman" w:eastAsia="標楷體" w:hAnsi="Times New Roman" w:cs="Times New Roman"/>
         </w:rPr>
-        <w:t>店舖</w:t>
-      </w:r>
+        <w:t>店</w:t>
+      </w:r>
+      <w:proofErr w:type="gramStart"/>
+      <w:r>
+        <w:rPr>
+          <w:rFonts w:ascii="Times New Roman" w:eastAsia="標楷體" w:hAnsi="Times New Roman" w:cs="Times New Roman"/>
+        </w:rPr>
+        <w:t>舖</w:t>
+      </w:r>
+      <w:proofErr w:type="gramEnd"/>
       <w:r>
         <w:rPr>
           <w:rFonts w:ascii="Times New Roman" w:eastAsia="標楷體" w:hAnsi="Times New Roman" w:cs="Times New Roman"/>
@@ -19026,8 +20277,16 @@
         <w:rPr>
           <w:rFonts w:ascii="Times New Roman" w:eastAsia="標楷體" w:hAnsi="Times New Roman" w:cs="Times New Roman"/>
         </w:rPr>
-        <w:t>店舖</w:t>
-      </w:r>
+        <w:t>店</w:t>
+      </w:r>
+      <w:proofErr w:type="gramStart"/>
+      <w:r>
+        <w:rPr>
+          <w:rFonts w:ascii="Times New Roman" w:eastAsia="標楷體" w:hAnsi="Times New Roman" w:cs="Times New Roman"/>
+        </w:rPr>
+        <w:t>舖</w:t>
+      </w:r>
+      <w:proofErr w:type="gramEnd"/>
       <w:r>
         <w:rPr>
           <w:rFonts w:ascii="Times New Roman" w:eastAsia="標楷體" w:hAnsi="Times New Roman" w:cs="Times New Roman"/>
@@ -19050,8 +20309,16 @@
         <w:rPr>
           <w:rFonts w:ascii="Times New Roman" w:eastAsia="標楷體" w:hAnsi="Times New Roman" w:cs="Times New Roman"/>
         </w:rPr>
-        <w:t>店舖</w:t>
-      </w:r>
+        <w:t>店</w:t>
+      </w:r>
+      <w:proofErr w:type="gramStart"/>
+      <w:r>
+        <w:rPr>
+          <w:rFonts w:ascii="Times New Roman" w:eastAsia="標楷體" w:hAnsi="Times New Roman" w:cs="Times New Roman"/>
+        </w:rPr>
+        <w:t>舖</w:t>
+      </w:r>
+      <w:proofErr w:type="gramEnd"/>
       <w:r>
         <w:rPr>
           <w:rFonts w:ascii="Times New Roman" w:eastAsia="標楷體" w:hAnsi="Times New Roman" w:cs="Times New Roman"/>
@@ -19068,7 +20335,6 @@
           <w:rFonts w:ascii="Times New Roman" w:eastAsia="標楷體" w:hAnsi="Times New Roman" w:cs="Times New Roman"/>
           <w:b/>
           <w:bCs/>
-          <w:color w:val="00B0F0"/>
           <w:sz w:val="28"/>
           <w:szCs w:val="28"/>
         </w:rPr>
@@ -19078,7 +20344,6 @@
           <w:rFonts w:ascii="Times New Roman" w:eastAsia="標楷體" w:hAnsi="Times New Roman" w:cs="Times New Roman"/>
           <w:b/>
           <w:bCs/>
-          <w:color w:val="00B0F0"/>
           <w:sz w:val="28"/>
           <w:szCs w:val="28"/>
         </w:rPr>
@@ -19089,7 +20354,6 @@
           <w:rFonts w:ascii="Times New Roman" w:eastAsia="標楷體" w:hAnsi="Times New Roman" w:cs="Times New Roman" w:hint="eastAsia"/>
           <w:b/>
           <w:bCs/>
-          <w:color w:val="00B0F0"/>
           <w:sz w:val="28"/>
           <w:szCs w:val="28"/>
         </w:rPr>
@@ -19100,7 +20364,6 @@
           <w:rFonts w:ascii="Times New Roman" w:eastAsia="標楷體" w:hAnsi="Times New Roman" w:cs="Times New Roman"/>
           <w:b/>
           <w:bCs/>
-          <w:color w:val="00B0F0"/>
           <w:sz w:val="28"/>
           <w:szCs w:val="28"/>
         </w:rPr>
@@ -19111,7 +20374,6 @@
           <w:rFonts w:ascii="Times New Roman" w:eastAsia="標楷體" w:hAnsi="Times New Roman" w:cs="Times New Roman" w:hint="eastAsia"/>
           <w:b/>
           <w:bCs/>
-          <w:color w:val="00B0F0"/>
           <w:sz w:val="28"/>
           <w:szCs w:val="28"/>
         </w:rPr>
@@ -19122,7 +20384,6 @@
           <w:rFonts w:ascii="Times New Roman" w:eastAsia="標楷體" w:hAnsi="Times New Roman" w:cs="Times New Roman"/>
           <w:b/>
           <w:bCs/>
-          <w:color w:val="00B0F0"/>
           <w:sz w:val="28"/>
           <w:szCs w:val="28"/>
         </w:rPr>
@@ -19133,7 +20394,6 @@
           <w:rFonts w:ascii="Times New Roman" w:eastAsia="標楷體" w:hAnsi="Times New Roman" w:cs="Times New Roman" w:hint="eastAsia"/>
           <w:b/>
           <w:bCs/>
-          <w:color w:val="00B0F0"/>
           <w:sz w:val="28"/>
           <w:szCs w:val="28"/>
         </w:rPr>
@@ -19144,7 +20404,6 @@
           <w:rFonts w:ascii="Times New Roman" w:eastAsia="標楷體" w:hAnsi="Times New Roman" w:cs="Times New Roman"/>
           <w:b/>
           <w:bCs/>
-          <w:color w:val="00B0F0"/>
           <w:sz w:val="28"/>
           <w:szCs w:val="28"/>
         </w:rPr>
@@ -19155,7 +20414,6 @@
           <w:rFonts w:ascii="Times New Roman" w:eastAsia="標楷體" w:hAnsi="Times New Roman" w:cs="Times New Roman" w:hint="eastAsia"/>
           <w:b/>
           <w:bCs/>
-          <w:color w:val="00B0F0"/>
           <w:sz w:val="28"/>
           <w:szCs w:val="28"/>
         </w:rPr>
@@ -19170,195 +20428,181 @@
         <w:jc w:val="both"/>
         <w:rPr>
           <w:rFonts w:ascii="Times New Roman" w:eastAsia="標楷體" w:hAnsi="Times New Roman" w:cs="Times New Roman"/>
-          <w:color w:val="00B0F0"/>
-        </w:rPr>
-      </w:pPr>
-      <w:r>
-        <w:rPr>
-          <w:rFonts w:ascii="Times New Roman" w:eastAsia="標楷體" w:hAnsi="Times New Roman" w:cs="Times New Roman" w:hint="eastAsia"/>
-          <w:color w:val="00B0F0"/>
+        </w:rPr>
+      </w:pPr>
+      <w:r>
+        <w:rPr>
+          <w:rFonts w:ascii="Times New Roman" w:eastAsia="標楷體" w:hAnsi="Times New Roman" w:cs="Times New Roman" w:hint="eastAsia"/>
         </w:rPr>
         <w:t>Google Maps Routes API</w:t>
       </w:r>
       <w:r>
         <w:rPr>
           <w:rFonts w:ascii="Times New Roman" w:eastAsia="標楷體" w:hAnsi="Times New Roman" w:cs="Times New Roman" w:hint="eastAsia"/>
-          <w:color w:val="00B0F0"/>
         </w:rPr>
         <w:t>為</w:t>
       </w:r>
       <w:r>
         <w:rPr>
           <w:rFonts w:ascii="Times New Roman" w:eastAsia="標楷體" w:hAnsi="Times New Roman" w:cs="Times New Roman" w:hint="eastAsia"/>
-          <w:color w:val="00B0F0"/>
         </w:rPr>
         <w:t>Google Maps</w:t>
       </w:r>
       <w:r>
         <w:rPr>
           <w:rFonts w:ascii="Times New Roman" w:eastAsia="標楷體" w:hAnsi="Times New Roman" w:cs="Times New Roman" w:hint="eastAsia"/>
-          <w:color w:val="00B0F0"/>
         </w:rPr>
         <w:t>平台所提供的</w:t>
       </w:r>
       <w:r>
         <w:rPr>
           <w:rFonts w:ascii="Times New Roman" w:eastAsia="標楷體" w:hAnsi="Times New Roman" w:cs="Times New Roman" w:hint="eastAsia"/>
-          <w:color w:val="00B0F0"/>
         </w:rPr>
         <w:t>新</w:t>
       </w:r>
       <w:r>
         <w:rPr>
           <w:rFonts w:ascii="Times New Roman" w:eastAsia="標楷體" w:hAnsi="Times New Roman" w:cs="Times New Roman" w:hint="eastAsia"/>
-          <w:color w:val="00B0F0"/>
         </w:rPr>
         <w:t>服務之一</w:t>
       </w:r>
       <w:r>
         <w:rPr>
           <w:rFonts w:ascii="Times New Roman" w:eastAsia="標楷體" w:hAnsi="Times New Roman" w:cs="Times New Roman" w:hint="eastAsia"/>
-          <w:color w:val="00B0F0"/>
         </w:rPr>
         <w:t>，整合原有</w:t>
       </w:r>
       <w:r>
         <w:rPr>
           <w:rFonts w:ascii="Times New Roman" w:eastAsia="標楷體" w:hAnsi="Times New Roman" w:cs="Times New Roman" w:hint="eastAsia"/>
-          <w:color w:val="00B0F0"/>
         </w:rPr>
         <w:t>Directions API</w:t>
       </w:r>
       <w:r>
         <w:rPr>
           <w:rFonts w:ascii="Times New Roman" w:eastAsia="標楷體" w:hAnsi="Times New Roman" w:cs="Times New Roman" w:hint="eastAsia"/>
-          <w:color w:val="00B0F0"/>
         </w:rPr>
         <w:t>和</w:t>
       </w:r>
       <w:r>
         <w:rPr>
           <w:rFonts w:ascii="Times New Roman" w:eastAsia="標楷體" w:hAnsi="Times New Roman" w:cs="Times New Roman" w:hint="eastAsia"/>
-          <w:color w:val="00B0F0"/>
         </w:rPr>
         <w:t>Distance Matrix API</w:t>
       </w:r>
       <w:r>
         <w:rPr>
           <w:rFonts w:ascii="Times New Roman" w:eastAsia="標楷體" w:hAnsi="Times New Roman" w:cs="Times New Roman" w:hint="eastAsia"/>
-          <w:color w:val="00B0F0"/>
         </w:rPr>
         <w:t>的功能</w:t>
       </w:r>
       <w:r>
         <w:rPr>
           <w:rFonts w:ascii="Times New Roman" w:eastAsia="標楷體" w:hAnsi="Times New Roman" w:cs="Times New Roman" w:hint="eastAsia"/>
-          <w:color w:val="00B0F0"/>
         </w:rPr>
         <w:t>。主要功能在於計算兩個或多個地點之間的最佳路徑，並回傳逐步導航指示、距離與</w:t>
       </w:r>
       <w:r>
         <w:rPr>
           <w:rFonts w:ascii="Times New Roman" w:eastAsia="標楷體" w:hAnsi="Times New Roman" w:cs="Times New Roman" w:hint="eastAsia"/>
-          <w:color w:val="00B0F0"/>
         </w:rPr>
         <w:t>預估</w:t>
       </w:r>
       <w:r>
         <w:rPr>
           <w:rFonts w:ascii="Times New Roman" w:eastAsia="標楷體" w:hAnsi="Times New Roman" w:cs="Times New Roman" w:hint="eastAsia"/>
-          <w:color w:val="00B0F0"/>
         </w:rPr>
         <w:t>行駛時間。</w:t>
       </w:r>
       <w:r>
         <w:rPr>
           <w:rFonts w:ascii="Times New Roman" w:eastAsia="標楷體" w:hAnsi="Times New Roman" w:cs="Times New Roman" w:hint="eastAsia"/>
-          <w:color w:val="00B0F0"/>
         </w:rPr>
         <w:t>Google Maps Routes API</w:t>
       </w:r>
       <w:r>
         <w:rPr>
           <w:rFonts w:ascii="Times New Roman" w:eastAsia="標楷體" w:hAnsi="Times New Roman" w:cs="Times New Roman" w:hint="eastAsia"/>
-          <w:color w:val="00B0F0"/>
         </w:rPr>
         <w:t>支援多種運輸模式，包括駕車、步行、自行車與大眾運輸，並可以結合即時交通資料估算行駛時間。本研究</w:t>
       </w:r>
       <w:r>
         <w:rPr>
           <w:rFonts w:ascii="Times New Roman" w:eastAsia="標楷體" w:hAnsi="Times New Roman" w:cs="Times New Roman" w:hint="eastAsia"/>
-          <w:color w:val="00B0F0"/>
         </w:rPr>
         <w:t>以</w:t>
       </w:r>
       <w:r>
         <w:rPr>
           <w:rFonts w:ascii="Times New Roman" w:eastAsia="標楷體" w:hAnsi="Times New Roman" w:cs="Times New Roman" w:hint="eastAsia"/>
-          <w:color w:val="00B0F0"/>
         </w:rPr>
         <w:t>Google Maps Routes API</w:t>
       </w:r>
       <w:r>
         <w:rPr>
           <w:rFonts w:ascii="Times New Roman" w:eastAsia="標楷體" w:hAnsi="Times New Roman" w:cs="Times New Roman" w:hint="eastAsia"/>
-          <w:color w:val="00B0F0"/>
         </w:rPr>
         <w:t>作為路線選擇</w:t>
       </w:r>
       <w:r>
         <w:rPr>
           <w:rFonts w:ascii="Times New Roman" w:eastAsia="標楷體" w:hAnsi="Times New Roman" w:cs="Times New Roman" w:hint="eastAsia"/>
-          <w:color w:val="00B0F0"/>
         </w:rPr>
         <w:t>與配送規劃</w:t>
       </w:r>
       <w:r>
         <w:rPr>
           <w:rFonts w:ascii="Times New Roman" w:eastAsia="標楷體" w:hAnsi="Times New Roman" w:cs="Times New Roman" w:hint="eastAsia"/>
-          <w:color w:val="00B0F0"/>
         </w:rPr>
         <w:t>的基礎</w:t>
       </w:r>
       <w:r>
         <w:rPr>
           <w:rFonts w:ascii="Times New Roman" w:eastAsia="標楷體" w:hAnsi="Times New Roman" w:cs="Times New Roman" w:hint="eastAsia"/>
-          <w:color w:val="00B0F0"/>
         </w:rPr>
         <w:t>工具</w:t>
       </w:r>
       <w:r>
         <w:rPr>
           <w:rFonts w:ascii="Times New Roman" w:eastAsia="標楷體" w:hAnsi="Times New Roman" w:cs="Times New Roman" w:hint="eastAsia"/>
-          <w:color w:val="00B0F0"/>
         </w:rPr>
         <w:t>，</w:t>
       </w:r>
       <w:r>
         <w:rPr>
           <w:rFonts w:ascii="Times New Roman" w:eastAsia="標楷體" w:hAnsi="Times New Roman" w:cs="Times New Roman" w:hint="eastAsia"/>
-          <w:color w:val="00B0F0"/>
         </w:rPr>
         <w:t>首</w:t>
       </w:r>
       <w:r>
         <w:rPr>
           <w:rFonts w:ascii="Times New Roman" w:eastAsia="標楷體" w:hAnsi="Times New Roman" w:cs="Times New Roman" w:hint="eastAsia"/>
-          <w:color w:val="00B0F0"/>
-        </w:rPr>
-        <w:t>先根據實際行駛時間完成店舖分配，最終再取得完整配送路線，用於</w:t>
-      </w:r>
-      <w:r>
-        <w:rPr>
-          <w:rFonts w:ascii="Times New Roman" w:eastAsia="標楷體" w:hAnsi="Times New Roman" w:cs="Times New Roman" w:hint="eastAsia"/>
-          <w:color w:val="00B0F0"/>
+        </w:rPr>
+        <w:t>先根據實際行駛時間完成店</w:t>
+      </w:r>
+      <w:proofErr w:type="gramStart"/>
+      <w:r>
+        <w:rPr>
+          <w:rFonts w:ascii="Times New Roman" w:eastAsia="標楷體" w:hAnsi="Times New Roman" w:cs="Times New Roman" w:hint="eastAsia"/>
+        </w:rPr>
+        <w:t>舖</w:t>
+      </w:r>
+      <w:proofErr w:type="gramEnd"/>
+      <w:r>
+        <w:rPr>
+          <w:rFonts w:ascii="Times New Roman" w:eastAsia="標楷體" w:hAnsi="Times New Roman" w:cs="Times New Roman" w:hint="eastAsia"/>
+        </w:rPr>
+        <w:t>分配，最終再取得完整配送路線，用於</w:t>
+      </w:r>
+      <w:r>
+        <w:rPr>
+          <w:rFonts w:ascii="Times New Roman" w:eastAsia="標楷體" w:hAnsi="Times New Roman" w:cs="Times New Roman" w:hint="eastAsia"/>
         </w:rPr>
         <w:t>後續</w:t>
       </w:r>
       <w:r>
         <w:rPr>
           <w:rFonts w:ascii="Times New Roman" w:eastAsia="標楷體" w:hAnsi="Times New Roman" w:cs="Times New Roman" w:hint="eastAsia"/>
-          <w:color w:val="00B0F0"/>
         </w:rPr>
         <w:t>實際路線呈現與分析。</w:t>
       </w:r>
@@ -19474,8 +20718,16 @@
         <w:rPr>
           <w:rFonts w:ascii="Times New Roman" w:eastAsia="標楷體" w:hAnsi="Times New Roman" w:cs="Times New Roman" w:hint="eastAsia"/>
         </w:rPr>
-        <w:t>店舖</w:t>
-      </w:r>
+        <w:t>店</w:t>
+      </w:r>
+      <w:proofErr w:type="gramStart"/>
+      <w:r>
+        <w:rPr>
+          <w:rFonts w:ascii="Times New Roman" w:eastAsia="標楷體" w:hAnsi="Times New Roman" w:cs="Times New Roman" w:hint="eastAsia"/>
+        </w:rPr>
+        <w:t>舖</w:t>
+      </w:r>
+      <w:proofErr w:type="gramEnd"/>
       <w:r>
         <w:rPr>
           <w:rFonts w:ascii="Times New Roman" w:eastAsia="標楷體" w:hAnsi="Times New Roman" w:cs="Times New Roman" w:hint="eastAsia"/>
@@ -19643,8 +20895,16 @@
         <w:rPr>
           <w:rFonts w:ascii="Times New Roman" w:eastAsia="標楷體" w:hAnsi="Times New Roman" w:cs="Times New Roman"/>
         </w:rPr>
-        <w:t>本研究採用多目標蟻群演算法</w:t>
-      </w:r>
+        <w:t>本研究採用</w:t>
+      </w:r>
+      <w:proofErr w:type="gramStart"/>
+      <w:r>
+        <w:rPr>
+          <w:rFonts w:ascii="Times New Roman" w:eastAsia="標楷體" w:hAnsi="Times New Roman" w:cs="Times New Roman"/>
+        </w:rPr>
+        <w:t>多目標蟻群演算法</w:t>
+      </w:r>
+      <w:proofErr w:type="gramEnd"/>
       <w:r>
         <w:rPr>
           <w:rFonts w:ascii="Times New Roman" w:eastAsia="標楷體" w:hAnsi="Times New Roman" w:cs="Times New Roman" w:hint="eastAsia"/>
@@ -19679,7 +20939,21 @@
         <w:rPr>
           <w:rFonts w:ascii="Times New Roman" w:eastAsia="標楷體" w:hAnsi="Times New Roman" w:cs="Times New Roman"/>
         </w:rPr>
-        <w:t>針對每個目標分別建立獨立的費洛蒙矩陣，並在完成更新後對其進行正規化與融合，以</w:t>
+        <w:t>針對每</w:t>
+      </w:r>
+      <w:proofErr w:type="gramStart"/>
+      <w:r>
+        <w:rPr>
+          <w:rFonts w:ascii="Times New Roman" w:eastAsia="標楷體" w:hAnsi="Times New Roman" w:cs="Times New Roman"/>
+        </w:rPr>
+        <w:t>個</w:t>
+      </w:r>
+      <w:proofErr w:type="gramEnd"/>
+      <w:r>
+        <w:rPr>
+          <w:rFonts w:ascii="Times New Roman" w:eastAsia="標楷體" w:hAnsi="Times New Roman" w:cs="Times New Roman"/>
+        </w:rPr>
+        <w:t>目標分別建立獨立的費洛蒙矩陣，並在完成更新後對其進行正規化與融合，以</w:t>
       </w:r>
       <w:r>
         <w:rPr>
@@ -19687,11 +20961,19 @@
         </w:rPr>
         <w:t>使</w:t>
       </w:r>
-      <w:r>
-        <w:rPr>
-          <w:rFonts w:ascii="Times New Roman" w:eastAsia="標楷體" w:hAnsi="Times New Roman" w:cs="Times New Roman"/>
-        </w:rPr>
-        <w:t>多目標間的資訊共享，從而得到兼顧各目標平衡性的最佳解。</w:t>
+      <w:proofErr w:type="gramStart"/>
+      <w:r>
+        <w:rPr>
+          <w:rFonts w:ascii="Times New Roman" w:eastAsia="標楷體" w:hAnsi="Times New Roman" w:cs="Times New Roman"/>
+        </w:rPr>
+        <w:t>多目標間的資訊</w:t>
+      </w:r>
+      <w:proofErr w:type="gramEnd"/>
+      <w:r>
+        <w:rPr>
+          <w:rFonts w:ascii="Times New Roman" w:eastAsia="標楷體" w:hAnsi="Times New Roman" w:cs="Times New Roman"/>
+        </w:rPr>
+        <w:t>共享，從而得到兼顧各目標平衡性的最佳解。</w:t>
       </w:r>
     </w:p>
     <w:p>
@@ -20363,7 +21645,21 @@
               <w:rPr>
                 <w:rFonts w:ascii="Times New Roman" w:eastAsia="標楷體" w:hAnsi="Times New Roman" w:cs="Times New Roman"/>
               </w:rPr>
-              <w:t>控制貪婪演算法與隨機比例的閾值</w:t>
+              <w:t>控制貪婪演算法與隨機比例的</w:t>
+            </w:r>
+            <w:proofErr w:type="gramStart"/>
+            <w:r>
+              <w:rPr>
+                <w:rFonts w:ascii="Times New Roman" w:eastAsia="標楷體" w:hAnsi="Times New Roman" w:cs="Times New Roman"/>
+              </w:rPr>
+              <w:t>閾</w:t>
+            </w:r>
+            <w:proofErr w:type="gramEnd"/>
+            <w:r>
+              <w:rPr>
+                <w:rFonts w:ascii="Times New Roman" w:eastAsia="標楷體" w:hAnsi="Times New Roman" w:cs="Times New Roman"/>
+              </w:rPr>
+              <w:t>值</w:t>
             </w:r>
           </w:p>
         </w:tc>
@@ -20463,6 +21759,7 @@
         </w:rPr>
         <w:t xml:space="preserve"> </w:t>
       </w:r>
+      <w:proofErr w:type="gramStart"/>
       <w:r>
         <w:rPr>
           <w:rFonts w:ascii="Times New Roman" w:eastAsia="標楷體" w:hAnsi="Times New Roman" w:cs="Times New Roman"/>
@@ -20471,6 +21768,7 @@
         </w:rPr>
         <w:t>變量定義</w:t>
       </w:r>
+      <w:proofErr w:type="gramEnd"/>
     </w:p>
     <w:tbl>
       <w:tblPr>
@@ -20602,7 +21900,21 @@
               <w:rPr>
                 <w:rFonts w:ascii="Times New Roman" w:eastAsia="標楷體" w:hAnsi="Times New Roman" w:cs="Times New Roman"/>
               </w:rPr>
-              <w:t xml:space="preserve"> i </w:t>
+              <w:t xml:space="preserve"> </w:t>
+            </w:r>
+            <w:proofErr w:type="spellStart"/>
+            <w:r>
+              <w:rPr>
+                <w:rFonts w:ascii="Times New Roman" w:eastAsia="標楷體" w:hAnsi="Times New Roman" w:cs="Times New Roman"/>
+              </w:rPr>
+              <w:t>i</w:t>
+            </w:r>
+            <w:proofErr w:type="spellEnd"/>
+            <w:r>
+              <w:rPr>
+                <w:rFonts w:ascii="Times New Roman" w:eastAsia="標楷體" w:hAnsi="Times New Roman" w:cs="Times New Roman"/>
+              </w:rPr>
+              <w:t xml:space="preserve"> </w:t>
             </w:r>
             <w:r>
               <w:rPr>
@@ -20764,8 +22076,16 @@
               <w:rPr>
                 <w:rFonts w:ascii="Times New Roman" w:eastAsia="標楷體" w:hAnsi="Times New Roman" w:cs="Times New Roman"/>
               </w:rPr>
-              <w:t>店舖</w:t>
-            </w:r>
+              <w:t>店</w:t>
+            </w:r>
+            <w:proofErr w:type="gramStart"/>
+            <w:r>
+              <w:rPr>
+                <w:rFonts w:ascii="Times New Roman" w:eastAsia="標楷體" w:hAnsi="Times New Roman" w:cs="Times New Roman"/>
+              </w:rPr>
+              <w:t>舖</w:t>
+            </w:r>
+            <w:proofErr w:type="gramEnd"/>
             <w:r>
               <w:rPr>
                 <w:rFonts w:ascii="Times New Roman" w:eastAsia="標楷體" w:hAnsi="Times New Roman" w:cs="Times New Roman"/>
@@ -20842,7 +22162,21 @@
               <w:rPr>
                 <w:rFonts w:ascii="Times New Roman" w:eastAsia="標楷體" w:hAnsi="Times New Roman" w:cs="Times New Roman"/>
               </w:rPr>
-              <w:t xml:space="preserve"> i </w:t>
+              <w:t xml:space="preserve"> </w:t>
+            </w:r>
+            <w:proofErr w:type="spellStart"/>
+            <w:r>
+              <w:rPr>
+                <w:rFonts w:ascii="Times New Roman" w:eastAsia="標楷體" w:hAnsi="Times New Roman" w:cs="Times New Roman"/>
+              </w:rPr>
+              <w:t>i</w:t>
+            </w:r>
+            <w:proofErr w:type="spellEnd"/>
+            <w:r>
+              <w:rPr>
+                <w:rFonts w:ascii="Times New Roman" w:eastAsia="標楷體" w:hAnsi="Times New Roman" w:cs="Times New Roman"/>
+              </w:rPr>
+              <w:t xml:space="preserve"> </w:t>
             </w:r>
             <w:r>
               <w:rPr>
@@ -21153,8 +22487,16 @@
         <w:rPr>
           <w:rFonts w:ascii="Times New Roman" w:eastAsia="標楷體" w:hAnsi="Times New Roman" w:cs="Times New Roman"/>
         </w:rPr>
-        <w:t>在店鋪選擇與路線構建過程中，螞蟻根據費洛蒙濃度、距離啟發值等因素，計算每個</w:t>
-      </w:r>
+        <w:t>在店鋪選擇與路線構建過程中，螞蟻根據費洛蒙濃度、距離啟發值等因素，計算每</w:t>
+      </w:r>
+      <w:proofErr w:type="gramStart"/>
+      <w:r>
+        <w:rPr>
+          <w:rFonts w:ascii="Times New Roman" w:eastAsia="標楷體" w:hAnsi="Times New Roman" w:cs="Times New Roman"/>
+        </w:rPr>
+        <w:t>個</w:t>
+      </w:r>
+      <w:proofErr w:type="gramEnd"/>
       <w:r>
         <w:rPr>
           <w:rFonts w:ascii="Times New Roman" w:eastAsia="標楷體" w:hAnsi="Times New Roman" w:cs="Times New Roman" w:hint="eastAsia"/>
@@ -21203,11 +22545,19 @@
         </w:rPr>
         <w:t>或等於預設</w:t>
       </w:r>
-      <w:r>
-        <w:rPr>
-          <w:rFonts w:ascii="Times New Roman" w:eastAsia="標楷體" w:hAnsi="Times New Roman" w:cs="Times New Roman"/>
-        </w:rPr>
-        <w:t>閾值</w:t>
+      <w:proofErr w:type="gramStart"/>
+      <w:r>
+        <w:rPr>
+          <w:rFonts w:ascii="Times New Roman" w:eastAsia="標楷體" w:hAnsi="Times New Roman" w:cs="Times New Roman"/>
+        </w:rPr>
+        <w:t>閾</w:t>
+      </w:r>
+      <w:proofErr w:type="gramEnd"/>
+      <w:r>
+        <w:rPr>
+          <w:rFonts w:ascii="Times New Roman" w:eastAsia="標楷體" w:hAnsi="Times New Roman" w:cs="Times New Roman"/>
+        </w:rPr>
+        <w:t>值</w:t>
       </w:r>
       <w:r>
         <w:rPr>
@@ -21251,11 +22601,19 @@
         </w:rPr>
         <w:t>若隨機數大於</w:t>
       </w:r>
-      <w:r>
-        <w:rPr>
-          <w:rFonts w:ascii="Times New Roman" w:eastAsia="標楷體" w:hAnsi="Times New Roman" w:cs="Times New Roman"/>
-        </w:rPr>
-        <w:t>閾值</w:t>
+      <w:proofErr w:type="gramStart"/>
+      <w:r>
+        <w:rPr>
+          <w:rFonts w:ascii="Times New Roman" w:eastAsia="標楷體" w:hAnsi="Times New Roman" w:cs="Times New Roman"/>
+        </w:rPr>
+        <w:t>閾</w:t>
+      </w:r>
+      <w:proofErr w:type="gramEnd"/>
+      <w:r>
+        <w:rPr>
+          <w:rFonts w:ascii="Times New Roman" w:eastAsia="標楷體" w:hAnsi="Times New Roman" w:cs="Times New Roman"/>
+        </w:rPr>
+        <w:t>值</w:t>
       </w:r>
       <w:r>
         <w:rPr>
@@ -23201,7 +24559,21 @@
         <w:rPr>
           <w:rFonts w:ascii="Times New Roman" w:eastAsia="標楷體" w:hAnsi="Times New Roman" w:cs="Times New Roman" w:hint="eastAsia"/>
         </w:rPr>
-        <w:t>為使螞蟻在搜尋過程中依據不同的目標進行</w:t>
+        <w:t>為</w:t>
+      </w:r>
+      <w:proofErr w:type="gramStart"/>
+      <w:r>
+        <w:rPr>
+          <w:rFonts w:ascii="Times New Roman" w:eastAsia="標楷體" w:hAnsi="Times New Roman" w:cs="Times New Roman" w:hint="eastAsia"/>
+        </w:rPr>
+        <w:t>使螞蟻</w:t>
+      </w:r>
+      <w:proofErr w:type="gramEnd"/>
+      <w:r>
+        <w:rPr>
+          <w:rFonts w:ascii="Times New Roman" w:eastAsia="標楷體" w:hAnsi="Times New Roman" w:cs="Times New Roman" w:hint="eastAsia"/>
+        </w:rPr>
+        <w:t>在搜尋過程中依據不同的目標進行</w:t>
       </w:r>
       <w:r>
         <w:rPr>
@@ -24326,7 +25698,29 @@
           <w:sz w:val="32"/>
           <w:szCs w:val="32"/>
         </w:rPr>
-        <w:t>費洛蒙正規化與融合</w:t>
+        <w:t>費洛蒙正</w:t>
+      </w:r>
+      <w:proofErr w:type="gramStart"/>
+      <w:r>
+        <w:rPr>
+          <w:rFonts w:ascii="Times New Roman" w:eastAsia="標楷體" w:hAnsi="Times New Roman" w:cs="Times New Roman"/>
+          <w:b/>
+          <w:bCs/>
+          <w:sz w:val="32"/>
+          <w:szCs w:val="32"/>
+        </w:rPr>
+        <w:t>規</w:t>
+      </w:r>
+      <w:proofErr w:type="gramEnd"/>
+      <w:r>
+        <w:rPr>
+          <w:rFonts w:ascii="Times New Roman" w:eastAsia="標楷體" w:hAnsi="Times New Roman" w:cs="Times New Roman"/>
+          <w:b/>
+          <w:bCs/>
+          <w:sz w:val="32"/>
+          <w:szCs w:val="32"/>
+        </w:rPr>
+        <w:t>化與融合</w:t>
       </w:r>
       <w:bookmarkEnd w:id="47"/>
     </w:p>
@@ -24350,7 +25744,21 @@
         <w:rPr>
           <w:rFonts w:ascii="Times New Roman" w:eastAsia="標楷體" w:hAnsi="Times New Roman" w:cs="Times New Roman"/>
         </w:rPr>
-        <w:t>多目標之間達成有效的資訊共享，本研究在每一個群體完成費洛蒙更新後，進一步進行費洛蒙正規化與融合</w:t>
+        <w:t>多目標之間達成有效的資訊共享，本研究在每一個群體完成費洛蒙更新後，進一步進行費洛蒙正</w:t>
+      </w:r>
+      <w:proofErr w:type="gramStart"/>
+      <w:r>
+        <w:rPr>
+          <w:rFonts w:ascii="Times New Roman" w:eastAsia="標楷體" w:hAnsi="Times New Roman" w:cs="Times New Roman"/>
+        </w:rPr>
+        <w:t>規</w:t>
+      </w:r>
+      <w:proofErr w:type="gramEnd"/>
+      <w:r>
+        <w:rPr>
+          <w:rFonts w:ascii="Times New Roman" w:eastAsia="標楷體" w:hAnsi="Times New Roman" w:cs="Times New Roman"/>
+        </w:rPr>
+        <w:t>化與融合</w:t>
       </w:r>
       <w:r>
         <w:rPr>
@@ -24392,8 +25800,23 @@
         <w:rPr>
           <w:rFonts w:ascii="Times New Roman" w:eastAsia="標楷體" w:hAnsi="Times New Roman" w:cs="Times New Roman"/>
         </w:rPr>
-        <w:t>費洛蒙正規化公式，將各</w:t>
-      </w:r>
+        <w:t>費洛蒙正</w:t>
+      </w:r>
+      <w:proofErr w:type="gramStart"/>
+      <w:r>
+        <w:rPr>
+          <w:rFonts w:ascii="Times New Roman" w:eastAsia="標楷體" w:hAnsi="Times New Roman" w:cs="Times New Roman"/>
+        </w:rPr>
+        <w:t>規</w:t>
+      </w:r>
+      <w:proofErr w:type="gramEnd"/>
+      <w:r>
+        <w:rPr>
+          <w:rFonts w:ascii="Times New Roman" w:eastAsia="標楷體" w:hAnsi="Times New Roman" w:cs="Times New Roman"/>
+        </w:rPr>
+        <w:t>化公式，將各</w:t>
+      </w:r>
+      <w:proofErr w:type="gramStart"/>
       <w:r>
         <w:rPr>
           <w:rFonts w:ascii="Times New Roman" w:eastAsia="標楷體" w:hAnsi="Times New Roman" w:cs="Times New Roman" w:hint="eastAsia"/>
@@ -24404,7 +25827,14 @@
         <w:rPr>
           <w:rFonts w:ascii="Times New Roman" w:eastAsia="標楷體" w:hAnsi="Times New Roman" w:cs="Times New Roman"/>
         </w:rPr>
-        <w:t>間的費洛蒙值轉換為在該節點下的相對比</w:t>
+        <w:t>間的費洛蒙</w:t>
+      </w:r>
+      <w:proofErr w:type="gramEnd"/>
+      <w:r>
+        <w:rPr>
+          <w:rFonts w:ascii="Times New Roman" w:eastAsia="標楷體" w:hAnsi="Times New Roman" w:cs="Times New Roman"/>
+        </w:rPr>
+        <w:t>值轉換為在該節點下的相對比</w:t>
       </w:r>
       <w:r>
         <w:rPr>
@@ -24435,7 +25865,21 @@
         <w:rPr>
           <w:rFonts w:ascii="Times New Roman" w:eastAsia="標楷體" w:hAnsi="Times New Roman" w:cs="Times New Roman"/>
         </w:rPr>
-        <w:t>費洛蒙融合公式，其中三個權重參數分別對應於最小化配送車輛數量、最小化總行駛距離以及最小化配送總時間之相對重要</w:t>
+        <w:t>費洛蒙融合公式，其中</w:t>
+      </w:r>
+      <w:proofErr w:type="gramStart"/>
+      <w:r>
+        <w:rPr>
+          <w:rFonts w:ascii="Times New Roman" w:eastAsia="標楷體" w:hAnsi="Times New Roman" w:cs="Times New Roman"/>
+        </w:rPr>
+        <w:t>三個權</w:t>
+      </w:r>
+      <w:proofErr w:type="gramEnd"/>
+      <w:r>
+        <w:rPr>
+          <w:rFonts w:ascii="Times New Roman" w:eastAsia="標楷體" w:hAnsi="Times New Roman" w:cs="Times New Roman"/>
+        </w:rPr>
+        <w:t>重參數分別對應於最小化配送車輛數量、最小化總行駛距離以及最小化配送總時間之相對重要</w:t>
       </w:r>
       <w:r>
         <w:rPr>
@@ -27677,6 +29121,7 @@
   <w:style w:type="character" w:default="1" w:styleId="a0">
     <w:name w:val="Default Paragraph Font"/>
     <w:uiPriority w:val="1"/>
+    <w:semiHidden/>
     <w:unhideWhenUsed/>
   </w:style>
   <w:style w:type="table" w:default="1" w:styleId="a1">

</xml_diff>

<commit_message>
update: thesis 11/16 (Evaluation Module & chapter 4)
</commit_message>
<xml_diff>
--- a/docs/thesis/論文本文-楊宏傑.docx
+++ b/docs/thesis/論文本文-楊宏傑.docx
@@ -3674,7 +3674,7 @@
         </w:tabs>
         <w:ind w:left="480" w:hanging="480"/>
         <w:rPr>
-          <w:rFonts w:ascii="Times New Roman" w:hAnsi="Times New Roman" w:cs="Times New Roman"/>
+          <w:rFonts w:asciiTheme="minorHAnsi" w:eastAsiaTheme="minorEastAsia" w:hAnsiTheme="minorHAnsi" w:cstheme="minorBidi"/>
           <w:bCs w:val="0"/>
           <w:kern w:val="2"/>
           <w:szCs w:val="24"/>
@@ -3716,12 +3716,11 @@
         </w:rPr>
         <w:fldChar w:fldCharType="separate"/>
       </w:r>
-      <w:hyperlink w:anchor="_Toc206073098" w:history="1">
+      <w:hyperlink w:anchor="_Toc214222531" w:history="1">
         <w:r>
           <w:rPr>
             <w:rStyle w:val="af4"/>
-            <w:rFonts w:ascii="Times New Roman" w:hAnsi="Times New Roman" w:cs="Times New Roman"/>
-            <w:color w:val="auto"/>
+            <w:rFonts w:ascii="Times New Roman" w:hAnsi="Times New Roman" w:cs="Times New Roman" w:hint="eastAsia"/>
           </w:rPr>
           <w:t>表</w:t>
         </w:r>
@@ -3729,62 +3728,53 @@
           <w:rPr>
             <w:rStyle w:val="af4"/>
             <w:rFonts w:ascii="Times New Roman" w:hAnsi="Times New Roman" w:cs="Times New Roman"/>
-            <w:color w:val="auto"/>
           </w:rPr>
-          <w:t xml:space="preserve"> 1 </w:t>
+          <w:t>1</w:t>
         </w:r>
         <w:r>
           <w:rPr>
             <w:rStyle w:val="af4"/>
-            <w:rFonts w:ascii="Times New Roman" w:hAnsi="Times New Roman" w:cs="Times New Roman"/>
-            <w:color w:val="auto"/>
+            <w:rFonts w:ascii="Times New Roman" w:hAnsi="Times New Roman" w:cs="Times New Roman" w:hint="eastAsia"/>
           </w:rPr>
-          <w:t>變量定義</w:t>
+          <w:t>參數定義</w:t>
         </w:r>
         <w:r>
           <w:rPr>
-            <w:rFonts w:ascii="Times New Roman" w:hAnsi="Times New Roman" w:cs="Times New Roman"/>
             <w:webHidden/>
           </w:rPr>
           <w:tab/>
         </w:r>
         <w:r>
           <w:rPr>
-            <w:rFonts w:ascii="Times New Roman" w:hAnsi="Times New Roman" w:cs="Times New Roman"/>
             <w:webHidden/>
           </w:rPr>
           <w:fldChar w:fldCharType="begin"/>
         </w:r>
         <w:r>
           <w:rPr>
-            <w:rFonts w:ascii="Times New Roman" w:hAnsi="Times New Roman" w:cs="Times New Roman"/>
             <w:webHidden/>
           </w:rPr>
-          <w:instrText xml:space="preserve"> PAGEREF _Toc206073098 \h </w:instrText>
+          <w:instrText xml:space="preserve"> PAGEREF _Toc214222531 \h </w:instrText>
         </w:r>
         <w:r>
           <w:rPr>
-            <w:rFonts w:ascii="Times New Roman" w:hAnsi="Times New Roman" w:cs="Times New Roman"/>
             <w:webHidden/>
           </w:rPr>
         </w:r>
         <w:r>
           <w:rPr>
-            <w:rFonts w:ascii="Times New Roman" w:hAnsi="Times New Roman" w:cs="Times New Roman"/>
             <w:webHidden/>
           </w:rPr>
           <w:fldChar w:fldCharType="separate"/>
         </w:r>
         <w:r>
           <w:rPr>
-            <w:rFonts w:ascii="Times New Roman" w:hAnsi="Times New Roman" w:cs="Times New Roman"/>
             <w:webHidden/>
           </w:rPr>
-          <w:t>9</w:t>
+          <w:t>8</w:t>
         </w:r>
         <w:r>
           <w:rPr>
-            <w:rFonts w:ascii="Times New Roman" w:hAnsi="Times New Roman" w:cs="Times New Roman"/>
             <w:webHidden/>
           </w:rPr>
           <w:fldChar w:fldCharType="end"/>
@@ -3799,19 +3789,18 @@
         </w:tabs>
         <w:ind w:left="480" w:hanging="480"/>
         <w:rPr>
-          <w:rFonts w:ascii="Times New Roman" w:hAnsi="Times New Roman" w:cs="Times New Roman"/>
+          <w:rFonts w:asciiTheme="minorHAnsi" w:eastAsiaTheme="minorEastAsia" w:hAnsiTheme="minorHAnsi" w:cstheme="minorBidi"/>
           <w:bCs w:val="0"/>
           <w:kern w:val="2"/>
           <w:szCs w:val="24"/>
           <w14:ligatures w14:val="standardContextual"/>
         </w:rPr>
       </w:pPr>
-      <w:hyperlink w:anchor="_Toc206073099" w:history="1">
+      <w:hyperlink w:anchor="_Toc214222532" w:history="1">
         <w:r>
           <w:rPr>
             <w:rStyle w:val="af4"/>
-            <w:rFonts w:ascii="Times New Roman" w:hAnsi="Times New Roman" w:cs="Times New Roman"/>
-            <w:color w:val="auto"/>
+            <w:rFonts w:ascii="Times New Roman" w:hAnsi="Times New Roman" w:cs="Times New Roman" w:hint="eastAsia"/>
           </w:rPr>
           <w:t>表</w:t>
         </w:r>
@@ -3819,62 +3808,53 @@
           <w:rPr>
             <w:rStyle w:val="af4"/>
             <w:rFonts w:ascii="Times New Roman" w:hAnsi="Times New Roman" w:cs="Times New Roman"/>
-            <w:color w:val="auto"/>
           </w:rPr>
-          <w:t xml:space="preserve"> 2 </w:t>
+          <w:t xml:space="preserve">2 </w:t>
         </w:r>
         <w:r>
           <w:rPr>
             <w:rStyle w:val="af4"/>
-            <w:rFonts w:ascii="Times New Roman" w:hAnsi="Times New Roman" w:cs="Times New Roman"/>
-            <w:color w:val="auto"/>
+            <w:rFonts w:ascii="Times New Roman" w:hAnsi="Times New Roman" w:cs="Times New Roman" w:hint="eastAsia"/>
           </w:rPr>
-          <w:t>集合定義</w:t>
+          <w:t>超參數定義</w:t>
         </w:r>
         <w:r>
           <w:rPr>
-            <w:rFonts w:ascii="Times New Roman" w:hAnsi="Times New Roman" w:cs="Times New Roman"/>
             <w:webHidden/>
           </w:rPr>
           <w:tab/>
         </w:r>
         <w:r>
           <w:rPr>
-            <w:rFonts w:ascii="Times New Roman" w:hAnsi="Times New Roman" w:cs="Times New Roman"/>
             <w:webHidden/>
           </w:rPr>
           <w:fldChar w:fldCharType="begin"/>
         </w:r>
         <w:r>
           <w:rPr>
-            <w:rFonts w:ascii="Times New Roman" w:hAnsi="Times New Roman" w:cs="Times New Roman"/>
             <w:webHidden/>
           </w:rPr>
-          <w:instrText xml:space="preserve"> PAGEREF _Toc206073099 \h </w:instrText>
+          <w:instrText xml:space="preserve"> PAGEREF _Toc214222532 \h </w:instrText>
         </w:r>
         <w:r>
           <w:rPr>
-            <w:rFonts w:ascii="Times New Roman" w:hAnsi="Times New Roman" w:cs="Times New Roman"/>
             <w:webHidden/>
           </w:rPr>
         </w:r>
         <w:r>
           <w:rPr>
-            <w:rFonts w:ascii="Times New Roman" w:hAnsi="Times New Roman" w:cs="Times New Roman"/>
             <w:webHidden/>
           </w:rPr>
           <w:fldChar w:fldCharType="separate"/>
         </w:r>
         <w:r>
           <w:rPr>
-            <w:rFonts w:ascii="Times New Roman" w:hAnsi="Times New Roman" w:cs="Times New Roman"/>
             <w:webHidden/>
           </w:rPr>
-          <w:t>10</w:t>
+          <w:t>17</w:t>
         </w:r>
         <w:r>
           <w:rPr>
-            <w:rFonts w:ascii="Times New Roman" w:hAnsi="Times New Roman" w:cs="Times New Roman"/>
             <w:webHidden/>
           </w:rPr>
           <w:fldChar w:fldCharType="end"/>
@@ -3889,19 +3869,18 @@
         </w:tabs>
         <w:ind w:left="480" w:hanging="480"/>
         <w:rPr>
-          <w:rFonts w:ascii="Times New Roman" w:hAnsi="Times New Roman" w:cs="Times New Roman"/>
+          <w:rFonts w:asciiTheme="minorHAnsi" w:eastAsiaTheme="minorEastAsia" w:hAnsiTheme="minorHAnsi" w:cstheme="minorBidi"/>
           <w:bCs w:val="0"/>
           <w:kern w:val="2"/>
           <w:szCs w:val="24"/>
           <w14:ligatures w14:val="standardContextual"/>
         </w:rPr>
       </w:pPr>
-      <w:hyperlink w:anchor="_Toc206073100" w:history="1">
+      <w:hyperlink w:anchor="_Toc214222533" w:history="1">
         <w:r>
           <w:rPr>
             <w:rStyle w:val="af4"/>
-            <w:rFonts w:ascii="Times New Roman" w:hAnsi="Times New Roman" w:cs="Times New Roman"/>
-            <w:color w:val="auto"/>
+            <w:rFonts w:ascii="Times New Roman" w:hAnsi="Times New Roman" w:cs="Times New Roman" w:hint="eastAsia"/>
           </w:rPr>
           <w:t>表</w:t>
         </w:r>
@@ -3909,62 +3888,133 @@
           <w:rPr>
             <w:rStyle w:val="af4"/>
             <w:rFonts w:ascii="Times New Roman" w:hAnsi="Times New Roman" w:cs="Times New Roman"/>
-            <w:color w:val="auto"/>
           </w:rPr>
-          <w:t xml:space="preserve"> 3 </w:t>
+          <w:t xml:space="preserve">3 </w:t>
         </w:r>
         <w:r>
           <w:rPr>
             <w:rStyle w:val="af4"/>
-            <w:rFonts w:ascii="Times New Roman" w:hAnsi="Times New Roman" w:cs="Times New Roman"/>
-            <w:color w:val="auto"/>
+            <w:rFonts w:ascii="Times New Roman" w:hAnsi="Times New Roman" w:cs="Times New Roman" w:hint="eastAsia"/>
           </w:rPr>
-          <w:t>超參數定義</w:t>
+          <w:t>變量定義</w:t>
         </w:r>
         <w:r>
           <w:rPr>
-            <w:rFonts w:ascii="Times New Roman" w:hAnsi="Times New Roman" w:cs="Times New Roman"/>
             <w:webHidden/>
           </w:rPr>
           <w:tab/>
         </w:r>
         <w:r>
           <w:rPr>
-            <w:rFonts w:ascii="Times New Roman" w:hAnsi="Times New Roman" w:cs="Times New Roman"/>
             <w:webHidden/>
           </w:rPr>
           <w:fldChar w:fldCharType="begin"/>
         </w:r>
         <w:r>
           <w:rPr>
-            <w:rFonts w:ascii="Times New Roman" w:hAnsi="Times New Roman" w:cs="Times New Roman"/>
             <w:webHidden/>
           </w:rPr>
-          <w:instrText xml:space="preserve"> PAGEREF _Toc206073100 \h </w:instrText>
+          <w:instrText xml:space="preserve"> PAGEREF _Toc214222533 \h </w:instrText>
         </w:r>
         <w:r>
           <w:rPr>
-            <w:rFonts w:ascii="Times New Roman" w:hAnsi="Times New Roman" w:cs="Times New Roman"/>
             <w:webHidden/>
           </w:rPr>
         </w:r>
         <w:r>
           <w:rPr>
-            <w:rFonts w:ascii="Times New Roman" w:hAnsi="Times New Roman" w:cs="Times New Roman"/>
             <w:webHidden/>
           </w:rPr>
           <w:fldChar w:fldCharType="separate"/>
         </w:r>
         <w:r>
           <w:rPr>
-            <w:rFonts w:ascii="Times New Roman" w:hAnsi="Times New Roman" w:cs="Times New Roman"/>
             <w:webHidden/>
           </w:rPr>
-          <w:t>13</w:t>
+          <w:t>17</w:t>
         </w:r>
         <w:r>
           <w:rPr>
+            <w:webHidden/>
+          </w:rPr>
+          <w:fldChar w:fldCharType="end"/>
+        </w:r>
+      </w:hyperlink>
+    </w:p>
+    <w:p>
+      <w:pPr>
+        <w:pStyle w:val="af5"/>
+        <w:tabs>
+          <w:tab w:val="right" w:leader="dot" w:pos="8296"/>
+        </w:tabs>
+        <w:ind w:left="480" w:hanging="480"/>
+        <w:rPr>
+          <w:rFonts w:asciiTheme="minorHAnsi" w:eastAsiaTheme="minorEastAsia" w:hAnsiTheme="minorHAnsi" w:cstheme="minorBidi"/>
+          <w:bCs w:val="0"/>
+          <w:kern w:val="2"/>
+          <w:szCs w:val="24"/>
+          <w14:ligatures w14:val="standardContextual"/>
+        </w:rPr>
+      </w:pPr>
+      <w:hyperlink w:anchor="_Toc214222534" w:history="1">
+        <w:r>
+          <w:rPr>
+            <w:rStyle w:val="af4"/>
+            <w:rFonts w:ascii="Times New Roman" w:hAnsi="Times New Roman" w:cs="Times New Roman" w:hint="eastAsia"/>
+          </w:rPr>
+          <w:t>表</w:t>
+        </w:r>
+        <w:r>
+          <w:rPr>
+            <w:rStyle w:val="af4"/>
             <w:rFonts w:ascii="Times New Roman" w:hAnsi="Times New Roman" w:cs="Times New Roman"/>
+          </w:rPr>
+          <w:t>4</w:t>
+        </w:r>
+        <w:r>
+          <w:rPr>
+            <w:rStyle w:val="af4"/>
+            <w:rFonts w:ascii="Times New Roman" w:hAnsi="Times New Roman" w:cs="Times New Roman" w:hint="eastAsia"/>
+          </w:rPr>
+          <w:t>實驗設備規格表</w:t>
+        </w:r>
+        <w:r>
+          <w:rPr>
+            <w:webHidden/>
+          </w:rPr>
+          <w:tab/>
+        </w:r>
+        <w:r>
+          <w:rPr>
+            <w:webHidden/>
+          </w:rPr>
+          <w:fldChar w:fldCharType="begin"/>
+        </w:r>
+        <w:r>
+          <w:rPr>
+            <w:webHidden/>
+          </w:rPr>
+          <w:instrText xml:space="preserve"> PAGEREF _Toc214222534 \h </w:instrText>
+        </w:r>
+        <w:r>
+          <w:rPr>
+            <w:webHidden/>
+          </w:rPr>
+        </w:r>
+        <w:r>
+          <w:rPr>
+            <w:webHidden/>
+          </w:rPr>
+          <w:fldChar w:fldCharType="separate"/>
+        </w:r>
+        <w:r>
+          <w:rPr>
+            <w:webHidden/>
+          </w:rPr>
+          <w:t>21</w:t>
+        </w:r>
+        <w:r>
+          <w:rPr>
             <w:webHidden/>
           </w:rPr>
           <w:fldChar w:fldCharType="end"/>
@@ -6001,168 +6051,144 @@
       <w:r>
         <w:rPr>
           <w:rFonts w:ascii="Times New Roman" w:eastAsia="標楷體" w:hAnsi="Times New Roman" w:cs="Times New Roman" w:hint="eastAsia"/>
-          <w:color w:val="00B0F0"/>
         </w:rPr>
         <w:t>相較於僅考量容量限制的</w:t>
       </w:r>
       <w:r>
         <w:rPr>
           <w:rFonts w:ascii="Times New Roman" w:eastAsia="標楷體" w:hAnsi="Times New Roman" w:cs="Times New Roman" w:hint="eastAsia"/>
-          <w:color w:val="00B0F0"/>
         </w:rPr>
         <w:t>CVRP</w:t>
       </w:r>
       <w:r>
         <w:rPr>
           <w:rFonts w:ascii="Times New Roman" w:eastAsia="標楷體" w:hAnsi="Times New Roman" w:cs="Times New Roman"/>
-          <w:color w:val="00B0F0"/>
         </w:rPr>
         <w:t>，</w:t>
       </w:r>
       <w:r>
         <w:rPr>
           <w:rFonts w:ascii="Times New Roman" w:eastAsia="標楷體" w:hAnsi="Times New Roman" w:cs="Times New Roman"/>
-          <w:color w:val="00B0F0"/>
         </w:rPr>
         <w:t>VRPTW</w:t>
       </w:r>
       <w:r>
         <w:rPr>
           <w:rFonts w:ascii="Times New Roman" w:eastAsia="標楷體" w:hAnsi="Times New Roman" w:cs="Times New Roman" w:hint="eastAsia"/>
-          <w:color w:val="00B0F0"/>
         </w:rPr>
         <w:t>在</w:t>
       </w:r>
       <w:r>
         <w:rPr>
           <w:rFonts w:ascii="Times New Roman" w:eastAsia="標楷體" w:hAnsi="Times New Roman" w:cs="Times New Roman"/>
-          <w:color w:val="00B0F0"/>
         </w:rPr>
         <w:t>考</w:t>
       </w:r>
       <w:r>
         <w:rPr>
           <w:rFonts w:ascii="Times New Roman" w:eastAsia="標楷體" w:hAnsi="Times New Roman" w:cs="Times New Roman" w:hint="eastAsia"/>
-          <w:color w:val="00B0F0"/>
         </w:rPr>
         <w:t>量</w:t>
       </w:r>
       <w:r>
         <w:rPr>
           <w:rFonts w:ascii="Times New Roman" w:eastAsia="標楷體" w:hAnsi="Times New Roman" w:cs="Times New Roman"/>
-          <w:color w:val="00B0F0"/>
         </w:rPr>
         <w:t>容量限制外</w:t>
       </w:r>
       <w:r>
         <w:rPr>
           <w:rFonts w:ascii="Times New Roman" w:eastAsia="標楷體" w:hAnsi="Times New Roman" w:cs="Times New Roman"/>
-          <w:color w:val="00B0F0"/>
         </w:rPr>
         <w:t>還</w:t>
       </w:r>
       <w:r>
         <w:rPr>
           <w:rFonts w:ascii="Times New Roman" w:eastAsia="標楷體" w:hAnsi="Times New Roman" w:cs="Times New Roman"/>
-          <w:color w:val="00B0F0"/>
         </w:rPr>
         <w:t>增加時間窗限制條件</w:t>
       </w:r>
       <w:r>
         <w:rPr>
           <w:rFonts w:ascii="Times New Roman" w:eastAsia="標楷體" w:hAnsi="Times New Roman" w:cs="Times New Roman" w:hint="eastAsia"/>
-          <w:color w:val="00B0F0"/>
         </w:rPr>
         <w:t>，每個顧客節點需在特定時間範圍內被造訪</w:t>
       </w:r>
       <w:r>
         <w:rPr>
           <w:rFonts w:ascii="Times New Roman" w:eastAsia="標楷體" w:hAnsi="Times New Roman" w:cs="Times New Roman" w:hint="eastAsia"/>
-          <w:color w:val="00B0F0"/>
         </w:rPr>
         <w:t>，</w:t>
       </w:r>
       <w:r>
         <w:rPr>
           <w:rFonts w:ascii="Times New Roman" w:eastAsia="標楷體" w:hAnsi="Times New Roman" w:cs="Times New Roman" w:hint="eastAsia"/>
-          <w:color w:val="00B0F0"/>
         </w:rPr>
         <w:t>以確保在規定時間內完成顧客節點的服務</w:t>
       </w:r>
       <w:r>
         <w:rPr>
           <w:rFonts w:ascii="Times New Roman" w:eastAsia="標楷體" w:hAnsi="Times New Roman" w:cs="Times New Roman"/>
-          <w:color w:val="00B0F0"/>
         </w:rPr>
         <w:t>，</w:t>
       </w:r>
       <w:r>
         <w:rPr>
           <w:rFonts w:ascii="Times New Roman" w:eastAsia="標楷體" w:hAnsi="Times New Roman" w:cs="Times New Roman" w:hint="eastAsia"/>
-          <w:color w:val="00B0F0"/>
         </w:rPr>
         <w:t>並最小化</w:t>
       </w:r>
       <w:r>
         <w:rPr>
           <w:rFonts w:ascii="Times New Roman" w:eastAsia="標楷體" w:hAnsi="Times New Roman" w:cs="Times New Roman" w:hint="eastAsia"/>
-          <w:color w:val="00B0F0"/>
         </w:rPr>
         <w:t>總行駛距離</w:t>
       </w:r>
       <w:r>
         <w:rPr>
           <w:rFonts w:ascii="Times New Roman" w:eastAsia="標楷體" w:hAnsi="Times New Roman" w:cs="Times New Roman" w:hint="eastAsia"/>
-          <w:color w:val="00B0F0"/>
         </w:rPr>
         <w:t>與</w:t>
       </w:r>
       <w:r>
         <w:rPr>
           <w:rFonts w:ascii="Times New Roman" w:eastAsia="標楷體" w:hAnsi="Times New Roman" w:cs="Times New Roman" w:hint="eastAsia"/>
-          <w:color w:val="00B0F0"/>
         </w:rPr>
         <w:t>成本</w:t>
       </w:r>
       <w:r>
         <w:rPr>
           <w:rFonts w:ascii="Times New Roman" w:eastAsia="標楷體" w:hAnsi="Times New Roman" w:cs="Times New Roman"/>
-          <w:color w:val="00B0F0"/>
         </w:rPr>
         <w:t>。</w:t>
       </w:r>
       <w:r>
         <w:rPr>
           <w:rFonts w:ascii="Times New Roman" w:eastAsia="標楷體" w:hAnsi="Times New Roman" w:cs="Times New Roman" w:hint="eastAsia"/>
-          <w:color w:val="00B0F0"/>
         </w:rPr>
         <w:t>VRPTW</w:t>
       </w:r>
       <w:r>
         <w:rPr>
           <w:rFonts w:ascii="Times New Roman" w:eastAsia="標楷體" w:hAnsi="Times New Roman" w:cs="Times New Roman" w:hint="eastAsia"/>
-          <w:color w:val="00B0F0"/>
         </w:rPr>
         <w:t>在</w:t>
       </w:r>
       <w:r>
         <w:rPr>
           <w:rFonts w:ascii="Times New Roman" w:eastAsia="標楷體" w:hAnsi="Times New Roman" w:cs="Times New Roman"/>
-          <w:color w:val="00B0F0"/>
         </w:rPr>
         <w:t>學術研究與實務應用中均被廣泛探討</w:t>
       </w:r>
       <w:r>
         <w:rPr>
           <w:rFonts w:ascii="Times New Roman" w:eastAsia="標楷體" w:hAnsi="Times New Roman" w:cs="Times New Roman" w:hint="eastAsia"/>
-          <w:color w:val="00B0F0"/>
         </w:rPr>
         <w:t>，相關文獻中提出多種演算法以解決此問題</w:t>
       </w:r>
       <w:r>
         <w:rPr>
           <w:rFonts w:ascii="Times New Roman" w:eastAsia="標楷體" w:hAnsi="Times New Roman" w:cs="Times New Roman"/>
-          <w:color w:val="00B0F0"/>
         </w:rPr>
         <w:t>。</w:t>
       </w:r>
@@ -6238,146 +6264,125 @@
         <w:spacing w:line="360" w:lineRule="auto"/>
         <w:rPr>
           <w:rFonts w:ascii="Times New Roman" w:eastAsia="標楷體" w:hAnsi="Times New Roman" w:cs="Times New Roman"/>
-          <w:color w:val="00B0F0"/>
-        </w:rPr>
-      </w:pPr>
-      <w:r>
-        <w:rPr>
-          <w:rFonts w:ascii="Times New Roman" w:eastAsia="標楷體" w:hAnsi="Times New Roman" w:cs="Times New Roman"/>
-          <w:color w:val="00B0F0"/>
+        </w:rPr>
+      </w:pPr>
+      <w:r>
+        <w:rPr>
+          <w:rFonts w:ascii="Times New Roman" w:eastAsia="標楷體" w:hAnsi="Times New Roman" w:cs="Times New Roman"/>
         </w:rPr>
         <w:tab/>
       </w:r>
       <w:r>
         <w:rPr>
           <w:rFonts w:ascii="Times New Roman" w:eastAsia="標楷體" w:hAnsi="Times New Roman" w:cs="Times New Roman"/>
-          <w:color w:val="00B0F0"/>
         </w:rPr>
         <w:t>DVRP</w:t>
       </w:r>
       <w:r>
         <w:rPr>
           <w:rFonts w:ascii="Times New Roman" w:eastAsia="標楷體" w:hAnsi="Times New Roman" w:cs="Times New Roman"/>
-          <w:color w:val="00B0F0"/>
         </w:rPr>
         <w:t>是</w:t>
       </w:r>
       <w:r>
         <w:rPr>
           <w:rFonts w:ascii="Times New Roman" w:eastAsia="標楷體" w:hAnsi="Times New Roman" w:cs="Times New Roman" w:hint="eastAsia"/>
-          <w:color w:val="00B0F0"/>
         </w:rPr>
         <w:t>一種</w:t>
       </w:r>
       <w:r>
         <w:rPr>
           <w:rFonts w:ascii="Times New Roman" w:eastAsia="標楷體" w:hAnsi="Times New Roman" w:cs="Times New Roman"/>
-          <w:color w:val="00B0F0"/>
         </w:rPr>
         <w:t>資訊動態變化的</w:t>
       </w:r>
       <w:r>
         <w:rPr>
           <w:rFonts w:ascii="Times New Roman" w:eastAsia="標楷體" w:hAnsi="Times New Roman" w:cs="Times New Roman"/>
-          <w:color w:val="00B0F0"/>
         </w:rPr>
         <w:t>VRP</w:t>
       </w:r>
       <w:r>
         <w:rPr>
           <w:rFonts w:ascii="Times New Roman" w:eastAsia="標楷體" w:hAnsi="Times New Roman" w:cs="Times New Roman"/>
-          <w:color w:val="00B0F0"/>
         </w:rPr>
         <w:t>，其特徵在於</w:t>
       </w:r>
       <w:r>
         <w:rPr>
           <w:rFonts w:ascii="Times New Roman" w:eastAsia="標楷體" w:hAnsi="Times New Roman" w:cs="Times New Roman"/>
-          <w:color w:val="00B0F0"/>
         </w:rPr>
         <w:t>配送任務在規劃</w:t>
       </w:r>
       <w:r>
         <w:rPr>
           <w:rFonts w:ascii="Times New Roman" w:eastAsia="標楷體" w:hAnsi="Times New Roman" w:cs="Times New Roman" w:hint="eastAsia"/>
-          <w:color w:val="00B0F0"/>
         </w:rPr>
         <w:t>階段並非完全</w:t>
       </w:r>
       <w:r>
         <w:rPr>
           <w:rFonts w:ascii="Times New Roman" w:eastAsia="標楷體" w:hAnsi="Times New Roman" w:cs="Times New Roman"/>
-          <w:color w:val="00B0F0"/>
         </w:rPr>
         <w:t>已知，而是在</w:t>
       </w:r>
       <w:r>
         <w:rPr>
           <w:rFonts w:ascii="Times New Roman" w:eastAsia="標楷體" w:hAnsi="Times New Roman" w:cs="Times New Roman"/>
-          <w:color w:val="00B0F0"/>
         </w:rPr>
         <w:t>配送</w:t>
       </w:r>
       <w:r>
         <w:rPr>
           <w:rFonts w:ascii="Times New Roman" w:eastAsia="標楷體" w:hAnsi="Times New Roman" w:cs="Times New Roman"/>
-          <w:color w:val="00B0F0"/>
         </w:rPr>
         <w:t>期間會隨著時間發生</w:t>
       </w:r>
       <w:r>
         <w:rPr>
           <w:rFonts w:ascii="Times New Roman" w:eastAsia="標楷體" w:hAnsi="Times New Roman" w:cs="Times New Roman"/>
-          <w:color w:val="00B0F0"/>
         </w:rPr>
         <w:t>改變</w:t>
       </w:r>
       <w:r>
         <w:rPr>
           <w:rFonts w:ascii="Times New Roman" w:eastAsia="標楷體" w:hAnsi="Times New Roman" w:cs="Times New Roman"/>
-          <w:color w:val="00B0F0"/>
         </w:rPr>
         <w:t>，使</w:t>
       </w:r>
       <w:r>
         <w:rPr>
           <w:rFonts w:ascii="Times New Roman" w:eastAsia="標楷體" w:hAnsi="Times New Roman" w:cs="Times New Roman"/>
-          <w:color w:val="00B0F0"/>
         </w:rPr>
         <w:t>其</w:t>
       </w:r>
       <w:r>
         <w:rPr>
           <w:rFonts w:ascii="Times New Roman" w:eastAsia="標楷體" w:hAnsi="Times New Roman" w:cs="Times New Roman"/>
-          <w:color w:val="00B0F0"/>
         </w:rPr>
         <w:t>需即時調整路線規劃</w:t>
       </w:r>
       <w:r>
         <w:rPr>
           <w:rFonts w:ascii="Times New Roman" w:eastAsia="標楷體" w:hAnsi="Times New Roman" w:cs="Times New Roman"/>
-          <w:color w:val="00B0F0"/>
         </w:rPr>
         <w:t>。</w:t>
       </w:r>
       <w:r>
         <w:rPr>
           <w:rFonts w:ascii="Times New Roman" w:eastAsia="標楷體" w:hAnsi="Times New Roman" w:cs="Times New Roman" w:hint="eastAsia"/>
-          <w:color w:val="00B0F0"/>
         </w:rPr>
         <w:t>此類問題</w:t>
       </w:r>
       <w:r>
         <w:rPr>
           <w:rFonts w:ascii="Times New Roman" w:eastAsia="標楷體" w:hAnsi="Times New Roman" w:cs="Times New Roman" w:hint="eastAsia"/>
-          <w:color w:val="00B0F0"/>
         </w:rPr>
         <w:t>被</w:t>
       </w:r>
       <w:r>
         <w:rPr>
           <w:rFonts w:ascii="Times New Roman" w:eastAsia="標楷體" w:hAnsi="Times New Roman" w:cs="Times New Roman" w:hint="eastAsia"/>
-          <w:color w:val="00B0F0"/>
         </w:rPr>
         <w:t>廣泛應用於物流配送及即時運輸管理等領域。</w:t>
       </w:r>
@@ -6451,83 +6456,71 @@
         <w:jc w:val="both"/>
         <w:rPr>
           <w:rFonts w:ascii="Times New Roman" w:eastAsia="標楷體" w:hAnsi="Times New Roman" w:cs="Times New Roman"/>
-          <w:color w:val="00B0F0"/>
-        </w:rPr>
-      </w:pPr>
-      <w:r>
-        <w:rPr>
-          <w:rFonts w:ascii="Times New Roman" w:eastAsia="標楷體" w:hAnsi="Times New Roman" w:cs="Times New Roman" w:hint="eastAsia"/>
-          <w:color w:val="00B0F0"/>
+        </w:rPr>
+      </w:pPr>
+      <w:r>
+        <w:rPr>
+          <w:rFonts w:ascii="Times New Roman" w:eastAsia="標楷體" w:hAnsi="Times New Roman" w:cs="Times New Roman" w:hint="eastAsia"/>
         </w:rPr>
         <w:t>MDVRP</w:t>
       </w:r>
       <w:r>
         <w:rPr>
           <w:rFonts w:ascii="Times New Roman" w:eastAsia="標楷體" w:hAnsi="Times New Roman" w:cs="Times New Roman" w:hint="eastAsia"/>
-          <w:color w:val="00B0F0"/>
         </w:rPr>
         <w:t>跟原本</w:t>
       </w:r>
       <w:r>
         <w:rPr>
           <w:rFonts w:ascii="Times New Roman" w:eastAsia="標楷體" w:hAnsi="Times New Roman" w:cs="Times New Roman" w:hint="eastAsia"/>
-          <w:color w:val="00B0F0"/>
         </w:rPr>
         <w:t>VRP</w:t>
       </w:r>
       <w:r>
         <w:rPr>
           <w:rFonts w:ascii="Times New Roman" w:eastAsia="標楷體" w:hAnsi="Times New Roman" w:cs="Times New Roman" w:hint="eastAsia"/>
-          <w:color w:val="00B0F0"/>
         </w:rPr>
         <w:t>最大的</w:t>
       </w:r>
       <w:r>
         <w:rPr>
           <w:rFonts w:ascii="Times New Roman" w:eastAsia="標楷體" w:hAnsi="Times New Roman" w:cs="Times New Roman" w:hint="eastAsia"/>
-          <w:color w:val="00B0F0"/>
         </w:rPr>
         <w:t>差異在於</w:t>
       </w:r>
       <w:r>
         <w:rPr>
           <w:rFonts w:ascii="Times New Roman" w:eastAsia="標楷體" w:hAnsi="Times New Roman" w:cs="Times New Roman" w:hint="eastAsia"/>
-          <w:color w:val="00B0F0"/>
         </w:rPr>
         <w:t>同時存在多個配送中心，每輛車輛皆從其所屬的配送中心出發並返回，每位顧客節點必須被指派至其中一個配送中心並由該中心的車輛完成服務。</w:t>
       </w:r>
       <w:r>
         <w:rPr>
           <w:rFonts w:ascii="Times New Roman" w:eastAsia="標楷體" w:hAnsi="Times New Roman" w:cs="Times New Roman" w:hint="eastAsia"/>
-          <w:color w:val="00B0F0"/>
         </w:rPr>
         <w:t>MDVRP</w:t>
       </w:r>
       <w:r>
         <w:rPr>
           <w:rFonts w:ascii="Times New Roman" w:eastAsia="標楷體" w:hAnsi="Times New Roman" w:cs="Times New Roman" w:hint="eastAsia"/>
-          <w:color w:val="00B0F0"/>
         </w:rPr>
         <w:t>的目標為在滿足各顧客節點需求</w:t>
       </w:r>
       <w:r>
         <w:rPr>
           <w:rFonts w:ascii="Times New Roman" w:eastAsia="標楷體" w:hAnsi="Times New Roman" w:cs="Times New Roman" w:hint="eastAsia"/>
-          <w:color w:val="00B0F0"/>
         </w:rPr>
         <w:t>的前提下，同時決定負責顧客節點的配送中心與各配送中心所屬車輛的配送順序安排，</w:t>
       </w:r>
       <w:r>
         <w:rPr>
           <w:rFonts w:ascii="Times New Roman" w:eastAsia="標楷體" w:hAnsi="Times New Roman" w:cs="Times New Roman" w:hint="eastAsia"/>
-          <w:color w:val="00B0F0"/>
         </w:rPr>
         <w:t>並</w:t>
       </w:r>
       <w:r>
         <w:rPr>
           <w:rFonts w:ascii="Times New Roman" w:eastAsia="標楷體" w:hAnsi="Times New Roman" w:cs="Times New Roman" w:hint="eastAsia"/>
-          <w:color w:val="00B0F0"/>
         </w:rPr>
         <w:t>最小化總行駛距離與成本。</w:t>
       </w:r>
@@ -8610,7 +8603,7 @@
           <w:szCs w:val="24"/>
         </w:rPr>
       </w:pPr>
-      <w:bookmarkStart w:id="31" w:name="_Toc206073098"/>
+      <w:bookmarkStart w:id="31" w:name="_Toc214222531"/>
       <w:r>
         <w:rPr>
           <w:rFonts w:ascii="Times New Roman" w:eastAsia="標楷體" w:hAnsi="Times New Roman" w:cs="Times New Roman"/>
@@ -20974,77 +20967,106 @@
         <w:jc w:val="both"/>
         <w:rPr>
           <w:rFonts w:ascii="Times New Roman" w:eastAsia="標楷體" w:hAnsi="Times New Roman" w:cs="Times New Roman"/>
-          <w:color w:val="EE0000"/>
-        </w:rPr>
-      </w:pPr>
-      <w:r>
-        <w:rPr>
-          <w:rFonts w:ascii="Times New Roman" w:eastAsia="標楷體" w:hAnsi="Times New Roman" w:cs="Times New Roman"/>
-          <w:color w:val="EE0000"/>
+          <w:color w:val="00B0F0"/>
+        </w:rPr>
+      </w:pPr>
+      <w:r>
+        <w:rPr>
+          <w:rFonts w:ascii="Times New Roman" w:eastAsia="標楷體" w:hAnsi="Times New Roman" w:cs="Times New Roman"/>
+          <w:color w:val="00B0F0"/>
         </w:rPr>
         <w:tab/>
       </w:r>
       <w:r>
         <w:rPr>
           <w:rFonts w:ascii="Times New Roman" w:eastAsia="標楷體" w:hAnsi="Times New Roman" w:cs="Times New Roman"/>
-          <w:color w:val="EE0000"/>
-        </w:rPr>
-        <w:t>此模組負責與外部服務進行串接，以取</w:t>
-      </w:r>
-      <w:r>
-        <w:rPr>
-          <w:rFonts w:ascii="Times New Roman" w:eastAsia="標楷體" w:hAnsi="Times New Roman" w:cs="Times New Roman" w:hint="eastAsia"/>
-          <w:color w:val="EE0000"/>
-        </w:rPr>
-        <w:t>得</w:t>
-      </w:r>
-      <w:r>
-        <w:rPr>
-          <w:rFonts w:ascii="Times New Roman" w:eastAsia="標楷體" w:hAnsi="Times New Roman" w:cs="Times New Roman"/>
-          <w:color w:val="EE0000"/>
-        </w:rPr>
-        <w:t>相關的路線即時資訊。透過</w:t>
-      </w:r>
-      <w:r>
-        <w:rPr>
-          <w:rFonts w:ascii="Times New Roman" w:eastAsia="標楷體" w:hAnsi="Times New Roman" w:cs="Times New Roman"/>
-          <w:color w:val="EE0000"/>
-        </w:rPr>
-        <w:t>API</w:t>
-      </w:r>
-      <w:r>
-        <w:rPr>
-          <w:rFonts w:ascii="Times New Roman" w:eastAsia="標楷體" w:hAnsi="Times New Roman" w:cs="Times New Roman" w:hint="eastAsia"/>
-          <w:color w:val="EE0000"/>
-        </w:rPr>
-        <w:t>模組</w:t>
-      </w:r>
-      <w:r>
-        <w:rPr>
-          <w:rFonts w:ascii="Times New Roman" w:eastAsia="標楷體" w:hAnsi="Times New Roman" w:cs="Times New Roman"/>
-          <w:color w:val="EE0000"/>
-        </w:rPr>
-        <w:t>，</w:t>
-      </w:r>
-      <w:r>
-        <w:rPr>
-          <w:rFonts w:ascii="Times New Roman" w:eastAsia="標楷體" w:hAnsi="Times New Roman" w:cs="Times New Roman" w:hint="eastAsia"/>
-          <w:color w:val="EE0000"/>
-        </w:rPr>
-        <w:t>系統能</w:t>
-      </w:r>
-      <w:r>
-        <w:rPr>
-          <w:rFonts w:ascii="Times New Roman" w:eastAsia="標楷體" w:hAnsi="Times New Roman" w:cs="Times New Roman"/>
-          <w:color w:val="EE0000"/>
-        </w:rPr>
-        <w:t>依據規劃的配送順序與店舖位置查詢實際行駛距離與所需時間，並將查詢結果返回系統，確保與實際規劃一致。若在驗證過程中發現有店舖無法合理規劃進任何路線，系統會將其重新加入候選店舖集合，再次執行路線模組的規劃流程。</w:t>
+          <w:color w:val="00B0F0"/>
+        </w:rPr>
+        <w:t>評估模組</w:t>
+      </w:r>
+      <w:r>
+        <w:rPr>
+          <w:rFonts w:ascii="Times New Roman" w:eastAsia="標楷體" w:hAnsi="Times New Roman" w:cs="Times New Roman" w:hint="eastAsia"/>
+          <w:color w:val="00B0F0"/>
+        </w:rPr>
+        <w:t>旨</w:t>
+      </w:r>
+      <w:r>
+        <w:rPr>
+          <w:rFonts w:ascii="Times New Roman" w:eastAsia="標楷體" w:hAnsi="Times New Roman" w:cs="Times New Roman" w:hint="eastAsia"/>
+          <w:color w:val="00B0F0"/>
+        </w:rPr>
+        <w:t>在於</w:t>
+      </w:r>
+      <w:r>
+        <w:rPr>
+          <w:rFonts w:ascii="Times New Roman" w:eastAsia="標楷體" w:hAnsi="Times New Roman" w:cs="Times New Roman"/>
+          <w:color w:val="00B0F0"/>
+        </w:rPr>
+        <w:t>比較不同的路線規劃結果，以</w:t>
+      </w:r>
+      <w:r>
+        <w:rPr>
+          <w:rFonts w:ascii="Times New Roman" w:eastAsia="標楷體" w:hAnsi="Times New Roman" w:cs="Times New Roman" w:hint="eastAsia"/>
+          <w:color w:val="00B0F0"/>
+        </w:rPr>
+        <w:t>驗證</w:t>
+      </w:r>
+      <w:r>
+        <w:rPr>
+          <w:rFonts w:ascii="Times New Roman" w:eastAsia="標楷體" w:hAnsi="Times New Roman" w:cs="Times New Roman"/>
+          <w:color w:val="00B0F0"/>
+        </w:rPr>
+        <w:t>本研究所提出方法</w:t>
+      </w:r>
+      <w:r>
+        <w:rPr>
+          <w:rFonts w:ascii="Times New Roman" w:eastAsia="標楷體" w:hAnsi="Times New Roman" w:cs="Times New Roman" w:hint="eastAsia"/>
+          <w:color w:val="00B0F0"/>
+        </w:rPr>
+        <w:t>之效果</w:t>
+      </w:r>
+      <w:r>
+        <w:rPr>
+          <w:rFonts w:ascii="Times New Roman" w:eastAsia="標楷體" w:hAnsi="Times New Roman" w:cs="Times New Roman"/>
+          <w:color w:val="00B0F0"/>
+        </w:rPr>
+        <w:t>。</w:t>
+      </w:r>
+      <w:r>
+        <w:rPr>
+          <w:rFonts w:ascii="Times New Roman" w:eastAsia="標楷體" w:hAnsi="Times New Roman" w:cs="Times New Roman"/>
+          <w:color w:val="00B0F0"/>
+        </w:rPr>
+        <w:t>此模組會依據設定的評估指標比較</w:t>
+      </w:r>
+      <w:r>
+        <w:rPr>
+          <w:rFonts w:ascii="Times New Roman" w:eastAsia="標楷體" w:hAnsi="Times New Roman" w:cs="Times New Roman" w:hint="eastAsia"/>
+          <w:color w:val="00B0F0"/>
+        </w:rPr>
+        <w:t>兩者</w:t>
+      </w:r>
+      <w:r>
+        <w:rPr>
+          <w:rFonts w:ascii="Times New Roman" w:eastAsia="標楷體" w:hAnsi="Times New Roman" w:cs="Times New Roman" w:hint="eastAsia"/>
+          <w:color w:val="00B0F0"/>
+        </w:rPr>
+        <w:t>的</w:t>
+      </w:r>
+      <w:r>
+        <w:rPr>
+          <w:rFonts w:ascii="Times New Roman" w:eastAsia="標楷體" w:hAnsi="Times New Roman" w:cs="Times New Roman"/>
+          <w:color w:val="00B0F0"/>
+        </w:rPr>
+        <w:t>路線規劃結果，而其產出的結果可用來檢視系統的路線規劃表現，並判斷是否符合實務需求。</w:t>
       </w:r>
     </w:p>
     <w:p>
       <w:pPr>
         <w:widowControl/>
         <w:spacing w:line="360" w:lineRule="auto"/>
+        <w:jc w:val="both"/>
         <w:outlineLvl w:val="3"/>
         <w:rPr>
           <w:rFonts w:ascii="Times New Roman" w:eastAsia="標楷體" w:hAnsi="Times New Roman" w:cs="Times New Roman"/>
@@ -21184,85 +21206,197 @@
         <w:jc w:val="both"/>
         <w:rPr>
           <w:rFonts w:ascii="Times New Roman" w:eastAsia="標楷體" w:hAnsi="Times New Roman" w:cs="Times New Roman"/>
-          <w:color w:val="EE0000"/>
-        </w:rPr>
-      </w:pPr>
-      <w:r>
-        <w:rPr>
-          <w:rFonts w:ascii="Times New Roman" w:eastAsia="標楷體" w:hAnsi="Times New Roman" w:cs="Times New Roman"/>
-          <w:color w:val="EE0000"/>
+          <w:color w:val="00B0F0"/>
+        </w:rPr>
+      </w:pPr>
+      <w:r>
+        <w:rPr>
+          <w:rFonts w:ascii="Times New Roman" w:eastAsia="標楷體" w:hAnsi="Times New Roman" w:cs="Times New Roman"/>
+          <w:color w:val="00B0F0"/>
         </w:rPr>
         <w:tab/>
       </w:r>
       <w:r>
         <w:rPr>
           <w:rFonts w:ascii="Times New Roman" w:eastAsia="標楷體" w:hAnsi="Times New Roman" w:cs="Times New Roman" w:hint="eastAsia"/>
-          <w:color w:val="EE0000"/>
-        </w:rPr>
-        <w:t>OSRM</w:t>
-      </w:r>
-      <w:r>
-        <w:rPr>
-          <w:rFonts w:ascii="Times New Roman" w:eastAsia="標楷體" w:hAnsi="Times New Roman" w:cs="Times New Roman" w:hint="eastAsia"/>
-          <w:color w:val="EE0000"/>
-        </w:rPr>
-        <w:t>是用於路徑計算的路由引擎，能夠計算路網中任意兩點間的最短路徑及預估行車時間。</w:t>
-      </w:r>
-      <w:r>
-        <w:rPr>
-          <w:rFonts w:ascii="Times New Roman" w:eastAsia="標楷體" w:hAnsi="Times New Roman" w:cs="Times New Roman" w:hint="eastAsia"/>
-          <w:color w:val="EE0000"/>
-        </w:rPr>
-        <w:t>OSRM</w:t>
-      </w:r>
-      <w:r>
-        <w:rPr>
-          <w:rFonts w:ascii="Times New Roman" w:eastAsia="標楷體" w:hAnsi="Times New Roman" w:cs="Times New Roman" w:hint="eastAsia"/>
-          <w:color w:val="EE0000"/>
-        </w:rPr>
-        <w:t>利用來自</w:t>
-      </w:r>
-      <w:r>
-        <w:rPr>
-          <w:rFonts w:ascii="Times New Roman" w:eastAsia="標楷體" w:hAnsi="Times New Roman" w:cs="Times New Roman" w:hint="eastAsia"/>
-          <w:color w:val="EE0000"/>
-        </w:rPr>
-        <w:t>OpenStreetMap</w:t>
-      </w:r>
-      <w:r>
-        <w:rPr>
-          <w:rFonts w:ascii="Times New Roman" w:eastAsia="標楷體" w:hAnsi="Times New Roman" w:cs="Times New Roman" w:hint="eastAsia"/>
-          <w:color w:val="EE0000"/>
-        </w:rPr>
-        <w:t>的地圖資料進行前處理，並透過</w:t>
-      </w:r>
-      <w:r>
-        <w:rPr>
-          <w:rFonts w:ascii="Times New Roman" w:eastAsia="標楷體" w:hAnsi="Times New Roman" w:cs="Times New Roman" w:hint="eastAsia"/>
-          <w:color w:val="EE0000"/>
-        </w:rPr>
-        <w:t>RESTful API</w:t>
-      </w:r>
-      <w:r>
-        <w:rPr>
-          <w:rFonts w:ascii="Times New Roman" w:eastAsia="標楷體" w:hAnsi="Times New Roman" w:cs="Times New Roman" w:hint="eastAsia"/>
-          <w:color w:val="EE0000"/>
-        </w:rPr>
-        <w:t>提供路徑規劃、距離矩陣及時間估算等功能。在本研究中，</w:t>
-      </w:r>
-      <w:r>
-        <w:rPr>
-          <w:rFonts w:ascii="Times New Roman" w:eastAsia="標楷體" w:hAnsi="Times New Roman" w:cs="Times New Roman" w:hint="eastAsia"/>
-          <w:color w:val="EE0000"/>
-        </w:rPr>
-        <w:t>OSRM</w:t>
-      </w:r>
-      <w:r>
-        <w:rPr>
-          <w:rFonts w:ascii="Times New Roman" w:eastAsia="標楷體" w:hAnsi="Times New Roman" w:cs="Times New Roman" w:hint="eastAsia"/>
-          <w:color w:val="EE0000"/>
-        </w:rPr>
-        <w:t>用於計算店舖間的行駛距離與時間，並依據實際道路網路得到完整的距離與時間矩陣，以作為後續配送路線規劃的輸入資料。</w:t>
+          <w:color w:val="00B0F0"/>
+        </w:rPr>
+        <w:t>路線評估</w:t>
+      </w:r>
+      <w:r>
+        <w:rPr>
+          <w:rFonts w:ascii="Times New Roman" w:eastAsia="標楷體" w:hAnsi="Times New Roman" w:cs="Times New Roman" w:hint="eastAsia"/>
+          <w:color w:val="00B0F0"/>
+        </w:rPr>
+        <w:t>的目標</w:t>
+      </w:r>
+      <w:r>
+        <w:rPr>
+          <w:rFonts w:ascii="Times New Roman" w:eastAsia="標楷體" w:hAnsi="Times New Roman" w:cs="Times New Roman" w:hint="eastAsia"/>
+          <w:color w:val="00B0F0"/>
+        </w:rPr>
+        <w:t>在</w:t>
+      </w:r>
+      <w:r>
+        <w:rPr>
+          <w:rFonts w:ascii="Times New Roman" w:eastAsia="標楷體" w:hAnsi="Times New Roman" w:cs="Times New Roman" w:hint="eastAsia"/>
+          <w:color w:val="00B0F0"/>
+        </w:rPr>
+        <w:t>於</w:t>
+      </w:r>
+      <w:r>
+        <w:rPr>
+          <w:rFonts w:ascii="Times New Roman" w:eastAsia="標楷體" w:hAnsi="Times New Roman" w:cs="Times New Roman" w:hint="eastAsia"/>
+          <w:color w:val="00B0F0"/>
+        </w:rPr>
+        <w:t>比較</w:t>
+      </w:r>
+      <w:r>
+        <w:rPr>
+          <w:rFonts w:ascii="Times New Roman" w:eastAsia="標楷體" w:hAnsi="Times New Roman" w:cs="Times New Roman" w:hint="eastAsia"/>
+          <w:color w:val="00B0F0"/>
+        </w:rPr>
+        <w:t>物流公司手動編排</w:t>
+      </w:r>
+      <w:r>
+        <w:rPr>
+          <w:rFonts w:ascii="Times New Roman" w:eastAsia="標楷體" w:hAnsi="Times New Roman" w:cs="Times New Roman" w:hint="eastAsia"/>
+          <w:color w:val="00B0F0"/>
+        </w:rPr>
+        <w:t>路線與本研究</w:t>
+      </w:r>
+      <w:r>
+        <w:rPr>
+          <w:rFonts w:ascii="Times New Roman" w:eastAsia="標楷體" w:hAnsi="Times New Roman" w:cs="Times New Roman" w:hint="eastAsia"/>
+          <w:color w:val="00B0F0"/>
+        </w:rPr>
+        <w:t>之</w:t>
+      </w:r>
+      <w:r>
+        <w:rPr>
+          <w:rFonts w:ascii="Times New Roman" w:eastAsia="標楷體" w:hAnsi="Times New Roman" w:cs="Times New Roman" w:hint="eastAsia"/>
+          <w:color w:val="00B0F0"/>
+        </w:rPr>
+        <w:t>系統產生路線</w:t>
+      </w:r>
+      <w:r>
+        <w:rPr>
+          <w:rFonts w:ascii="Times New Roman" w:eastAsia="標楷體" w:hAnsi="Times New Roman" w:cs="Times New Roman" w:hint="eastAsia"/>
+          <w:color w:val="00B0F0"/>
+        </w:rPr>
+        <w:t>結果</w:t>
+      </w:r>
+      <w:r>
+        <w:rPr>
+          <w:rFonts w:ascii="Times New Roman" w:eastAsia="標楷體" w:hAnsi="Times New Roman" w:cs="Times New Roman" w:hint="eastAsia"/>
+          <w:color w:val="00B0F0"/>
+        </w:rPr>
+        <w:t>，</w:t>
+      </w:r>
+      <w:r>
+        <w:rPr>
+          <w:rFonts w:ascii="Times New Roman" w:eastAsia="標楷體" w:hAnsi="Times New Roman" w:cs="Times New Roman" w:hint="eastAsia"/>
+          <w:color w:val="00B0F0"/>
+        </w:rPr>
+        <w:t>以驗證</w:t>
+      </w:r>
+      <w:r>
+        <w:rPr>
+          <w:rFonts w:ascii="Times New Roman" w:eastAsia="標楷體" w:hAnsi="Times New Roman" w:cs="Times New Roman" w:hint="eastAsia"/>
+          <w:color w:val="00B0F0"/>
+        </w:rPr>
+        <w:t>方法的效果與實務可行性。評估內容包含</w:t>
+      </w:r>
+      <w:r>
+        <w:rPr>
+          <w:rFonts w:ascii="Times New Roman" w:eastAsia="標楷體" w:hAnsi="Times New Roman" w:cs="Times New Roman" w:hint="eastAsia"/>
+          <w:color w:val="00B0F0"/>
+        </w:rPr>
+        <w:t>路線平均</w:t>
+      </w:r>
+      <w:r>
+        <w:rPr>
+          <w:rFonts w:ascii="Times New Roman" w:eastAsia="標楷體" w:hAnsi="Times New Roman" w:cs="Times New Roman" w:hint="eastAsia"/>
+          <w:color w:val="00B0F0"/>
+        </w:rPr>
+        <w:t>行駛距離</w:t>
+      </w:r>
+      <w:r>
+        <w:rPr>
+          <w:rFonts w:ascii="Times New Roman" w:eastAsia="標楷體" w:hAnsi="Times New Roman" w:cs="Times New Roman" w:hint="eastAsia"/>
+          <w:color w:val="00B0F0"/>
+        </w:rPr>
+        <w:t>、路線平均行駛時間</w:t>
+      </w:r>
+      <w:r>
+        <w:rPr>
+          <w:rFonts w:ascii="Times New Roman" w:eastAsia="標楷體" w:hAnsi="Times New Roman" w:cs="Times New Roman" w:hint="eastAsia"/>
+          <w:color w:val="00B0F0"/>
+        </w:rPr>
+        <w:t>、</w:t>
+      </w:r>
+      <w:r>
+        <w:rPr>
+          <w:rFonts w:ascii="Times New Roman" w:eastAsia="標楷體" w:hAnsi="Times New Roman" w:cs="Times New Roman" w:hint="eastAsia"/>
+          <w:color w:val="00B0F0"/>
+        </w:rPr>
+        <w:t>路線數量</w:t>
+      </w:r>
+      <w:r>
+        <w:rPr>
+          <w:rFonts w:ascii="Times New Roman" w:eastAsia="標楷體" w:hAnsi="Times New Roman" w:cs="Times New Roman" w:hint="eastAsia"/>
+          <w:color w:val="00B0F0"/>
+        </w:rPr>
+        <w:t>、</w:t>
+      </w:r>
+      <w:r>
+        <w:rPr>
+          <w:rFonts w:ascii="Times New Roman" w:eastAsia="標楷體" w:hAnsi="Times New Roman" w:cs="Times New Roman" w:hint="eastAsia"/>
+          <w:color w:val="00B0F0"/>
+        </w:rPr>
+        <w:t>路線平均裝載率</w:t>
+      </w:r>
+      <w:r>
+        <w:rPr>
+          <w:rFonts w:ascii="Times New Roman" w:eastAsia="標楷體" w:hAnsi="Times New Roman" w:cs="Times New Roman" w:hint="eastAsia"/>
+          <w:color w:val="00B0F0"/>
+        </w:rPr>
+        <w:t>。</w:t>
+      </w:r>
+      <w:r>
+        <w:rPr>
+          <w:rFonts w:ascii="Times New Roman" w:eastAsia="標楷體" w:hAnsi="Times New Roman" w:cs="Times New Roman"/>
+          <w:color w:val="00B0F0"/>
+        </w:rPr>
+        <w:t>透過上述資訊</w:t>
+      </w:r>
+      <w:r>
+        <w:rPr>
+          <w:rFonts w:ascii="Times New Roman" w:eastAsia="標楷體" w:hAnsi="Times New Roman" w:cs="Times New Roman" w:hint="eastAsia"/>
+          <w:color w:val="00B0F0"/>
+        </w:rPr>
+        <w:t>分析與比較</w:t>
+      </w:r>
+      <w:r>
+        <w:rPr>
+          <w:rFonts w:ascii="Times New Roman" w:eastAsia="標楷體" w:hAnsi="Times New Roman" w:cs="Times New Roman"/>
+          <w:color w:val="00B0F0"/>
+        </w:rPr>
+        <w:t>系統規劃與手動編排</w:t>
+      </w:r>
+      <w:r>
+        <w:rPr>
+          <w:rFonts w:ascii="Times New Roman" w:eastAsia="標楷體" w:hAnsi="Times New Roman" w:cs="Times New Roman"/>
+          <w:color w:val="00B0F0"/>
+        </w:rPr>
+        <w:t>結果</w:t>
+      </w:r>
+      <w:r>
+        <w:rPr>
+          <w:rFonts w:ascii="Times New Roman" w:eastAsia="標楷體" w:hAnsi="Times New Roman" w:cs="Times New Roman"/>
+          <w:color w:val="00B0F0"/>
+        </w:rPr>
+        <w:t>之間的差異。</w:t>
       </w:r>
     </w:p>
     <w:p>
@@ -21394,74 +21528,80 @@
         <w:rPr>
           <w:rFonts w:ascii="Times New Roman" w:eastAsia="標楷體" w:hAnsi="Times New Roman" w:cs="Times New Roman"/>
         </w:rPr>
+        <w:tab/>
+      </w:r>
+      <w:r>
+        <w:rPr>
+          <w:rFonts w:ascii="Times New Roman" w:eastAsia="標楷體" w:hAnsi="Times New Roman" w:cs="Times New Roman"/>
+        </w:rPr>
+        <w:t>此模組</w:t>
+      </w:r>
+      <w:r>
+        <w:rPr>
+          <w:rFonts w:ascii="Times New Roman" w:eastAsia="標楷體" w:hAnsi="Times New Roman" w:cs="Times New Roman"/>
+        </w:rPr>
+        <w:t>負責與外部服務進行串接，以取</w:t>
+      </w:r>
+      <w:r>
+        <w:rPr>
+          <w:rFonts w:ascii="Times New Roman" w:eastAsia="標楷體" w:hAnsi="Times New Roman" w:cs="Times New Roman" w:hint="eastAsia"/>
+        </w:rPr>
+        <w:t>得</w:t>
+      </w:r>
+      <w:r>
+        <w:rPr>
+          <w:rFonts w:ascii="Times New Roman" w:eastAsia="標楷體" w:hAnsi="Times New Roman" w:cs="Times New Roman"/>
+        </w:rPr>
+        <w:t>相關的路線即時資訊。透過</w:t>
+      </w:r>
+      <w:r>
+        <w:rPr>
+          <w:rFonts w:ascii="Times New Roman" w:eastAsia="標楷體" w:hAnsi="Times New Roman" w:cs="Times New Roman"/>
+        </w:rPr>
+        <w:t>API</w:t>
+      </w:r>
+      <w:r>
+        <w:rPr>
+          <w:rFonts w:ascii="Times New Roman" w:eastAsia="標楷體" w:hAnsi="Times New Roman" w:cs="Times New Roman" w:hint="eastAsia"/>
+        </w:rPr>
+        <w:t>模組</w:t>
+      </w:r>
+      <w:r>
+        <w:rPr>
+          <w:rFonts w:ascii="Times New Roman" w:eastAsia="標楷體" w:hAnsi="Times New Roman" w:cs="Times New Roman"/>
+        </w:rPr>
+        <w:t>，</w:t>
+      </w:r>
+      <w:r>
+        <w:rPr>
+          <w:rFonts w:ascii="Times New Roman" w:eastAsia="標楷體" w:hAnsi="Times New Roman" w:cs="Times New Roman" w:hint="eastAsia"/>
+        </w:rPr>
+        <w:t>系統能</w:t>
+      </w:r>
+      <w:r>
+        <w:rPr>
+          <w:rFonts w:ascii="Times New Roman" w:eastAsia="標楷體" w:hAnsi="Times New Roman" w:cs="Times New Roman"/>
+        </w:rPr>
+        <w:t>依據規劃的配送順序與</w:t>
+      </w:r>
+      <w:r>
+        <w:rPr>
+          <w:rFonts w:ascii="Times New Roman" w:eastAsia="標楷體" w:hAnsi="Times New Roman" w:cs="Times New Roman"/>
+        </w:rPr>
+        <w:t>店舖</w:t>
+      </w:r>
+      <w:r>
+        <w:rPr>
+          <w:rFonts w:ascii="Times New Roman" w:eastAsia="標楷體" w:hAnsi="Times New Roman" w:cs="Times New Roman"/>
+        </w:rPr>
+        <w:t>位置查詢實際行駛距離與所需時間，並將查詢結果返回</w:t>
+      </w:r>
+      <w:r>
+        <w:rPr>
+          <w:rFonts w:ascii="Times New Roman" w:eastAsia="標楷體" w:hAnsi="Times New Roman" w:cs="Times New Roman"/>
+        </w:rPr>
         <w:lastRenderedPageBreak/>
-        <w:tab/>
-      </w:r>
-      <w:r>
-        <w:rPr>
-          <w:rFonts w:ascii="Times New Roman" w:eastAsia="標楷體" w:hAnsi="Times New Roman" w:cs="Times New Roman"/>
-        </w:rPr>
-        <w:t>此模組</w:t>
-      </w:r>
-      <w:r>
-        <w:rPr>
-          <w:rFonts w:ascii="Times New Roman" w:eastAsia="標楷體" w:hAnsi="Times New Roman" w:cs="Times New Roman"/>
-        </w:rPr>
-        <w:t>負責與外部服務進行串接，以取</w:t>
-      </w:r>
-      <w:r>
-        <w:rPr>
-          <w:rFonts w:ascii="Times New Roman" w:eastAsia="標楷體" w:hAnsi="Times New Roman" w:cs="Times New Roman" w:hint="eastAsia"/>
-        </w:rPr>
-        <w:t>得</w:t>
-      </w:r>
-      <w:r>
-        <w:rPr>
-          <w:rFonts w:ascii="Times New Roman" w:eastAsia="標楷體" w:hAnsi="Times New Roman" w:cs="Times New Roman"/>
-        </w:rPr>
-        <w:t>相關的路線即時資訊。透過</w:t>
-      </w:r>
-      <w:r>
-        <w:rPr>
-          <w:rFonts w:ascii="Times New Roman" w:eastAsia="標楷體" w:hAnsi="Times New Roman" w:cs="Times New Roman"/>
-        </w:rPr>
-        <w:t>API</w:t>
-      </w:r>
-      <w:r>
-        <w:rPr>
-          <w:rFonts w:ascii="Times New Roman" w:eastAsia="標楷體" w:hAnsi="Times New Roman" w:cs="Times New Roman" w:hint="eastAsia"/>
-        </w:rPr>
-        <w:t>模組</w:t>
-      </w:r>
-      <w:r>
-        <w:rPr>
-          <w:rFonts w:ascii="Times New Roman" w:eastAsia="標楷體" w:hAnsi="Times New Roman" w:cs="Times New Roman"/>
-        </w:rPr>
-        <w:t>，</w:t>
-      </w:r>
-      <w:r>
-        <w:rPr>
-          <w:rFonts w:ascii="Times New Roman" w:eastAsia="標楷體" w:hAnsi="Times New Roman" w:cs="Times New Roman" w:hint="eastAsia"/>
-        </w:rPr>
-        <w:t>系統能</w:t>
-      </w:r>
-      <w:r>
-        <w:rPr>
-          <w:rFonts w:ascii="Times New Roman" w:eastAsia="標楷體" w:hAnsi="Times New Roman" w:cs="Times New Roman"/>
-        </w:rPr>
-        <w:t>依據規劃的配送順序與</w:t>
-      </w:r>
-      <w:r>
-        <w:rPr>
-          <w:rFonts w:ascii="Times New Roman" w:eastAsia="標楷體" w:hAnsi="Times New Roman" w:cs="Times New Roman"/>
-        </w:rPr>
-        <w:t>店舖</w:t>
-      </w:r>
-      <w:r>
-        <w:rPr>
-          <w:rFonts w:ascii="Times New Roman" w:eastAsia="標楷體" w:hAnsi="Times New Roman" w:cs="Times New Roman"/>
-        </w:rPr>
-        <w:t>位置查詢實際行駛距離與所需時間，並將查詢結果返回系統</w:t>
+        <w:t>系統</w:t>
       </w:r>
       <w:r>
         <w:rPr>
@@ -22320,7 +22460,7 @@
           <w:szCs w:val="24"/>
         </w:rPr>
       </w:pPr>
-      <w:bookmarkStart w:id="42" w:name="_Toc206073100"/>
+      <w:bookmarkStart w:id="42" w:name="_Toc214222532"/>
       <w:r>
         <w:rPr>
           <w:rFonts w:ascii="Times New Roman" w:eastAsia="標楷體" w:hAnsi="Times New Roman" w:cs="Times New Roman"/>
@@ -22948,6 +23088,7 @@
           <w:szCs w:val="24"/>
         </w:rPr>
       </w:pPr>
+      <w:bookmarkStart w:id="43" w:name="_Toc214222533"/>
       <w:r>
         <w:rPr>
           <w:rFonts w:ascii="Times New Roman" w:eastAsia="標楷體" w:hAnsi="Times New Roman" w:cs="Times New Roman"/>
@@ -23029,6 +23170,7 @@
         </w:rPr>
         <w:t>變量定義</w:t>
       </w:r>
+      <w:bookmarkEnd w:id="43"/>
     </w:p>
     <w:tbl>
       <w:tblPr>
@@ -23652,7 +23794,7 @@
           <w:szCs w:val="32"/>
         </w:rPr>
       </w:pPr>
-      <w:bookmarkStart w:id="43" w:name="_Toc213505216"/>
+      <w:bookmarkStart w:id="44" w:name="_Toc213505216"/>
       <w:r>
         <w:rPr>
           <w:rFonts w:ascii="Times New Roman" w:eastAsia="標楷體" w:hAnsi="Times New Roman" w:cs="Times New Roman"/>
@@ -23723,7 +23865,7 @@
         </w:rPr>
         <w:t>策略</w:t>
       </w:r>
-      <w:bookmarkEnd w:id="43"/>
+      <w:bookmarkEnd w:id="44"/>
     </w:p>
     <w:p>
       <w:pPr>
@@ -25107,7 +25249,7 @@
           <w:szCs w:val="32"/>
         </w:rPr>
       </w:pPr>
-      <w:bookmarkStart w:id="44" w:name="_Toc213505217"/>
+      <w:bookmarkStart w:id="45" w:name="_Toc213505217"/>
       <w:r>
         <w:rPr>
           <w:rFonts w:ascii="Times New Roman" w:eastAsia="標楷體" w:hAnsi="Times New Roman" w:cs="Times New Roman"/>
@@ -25168,7 +25310,7 @@
         </w:rPr>
         <w:t>配送車狀態更新</w:t>
       </w:r>
-      <w:bookmarkEnd w:id="44"/>
+      <w:bookmarkEnd w:id="45"/>
     </w:p>
     <w:p>
       <w:pPr>
@@ -25702,7 +25844,7 @@
           <w:szCs w:val="32"/>
         </w:rPr>
       </w:pPr>
-      <w:bookmarkStart w:id="45" w:name="_Toc213505218"/>
+      <w:bookmarkStart w:id="46" w:name="_Toc213505218"/>
       <w:r>
         <w:rPr>
           <w:rFonts w:ascii="Times New Roman" w:eastAsia="標楷體" w:hAnsi="Times New Roman" w:cs="Times New Roman"/>
@@ -25783,7 +25925,7 @@
         </w:rPr>
         <w:t>更新</w:t>
       </w:r>
-      <w:bookmarkEnd w:id="45"/>
+      <w:bookmarkEnd w:id="46"/>
     </w:p>
     <w:p>
       <w:pPr>
@@ -26847,7 +26989,7 @@
           <w:szCs w:val="32"/>
         </w:rPr>
       </w:pPr>
-      <w:bookmarkStart w:id="46" w:name="_Toc213505219"/>
+      <w:bookmarkStart w:id="47" w:name="_Toc213505219"/>
       <w:r>
         <w:rPr>
           <w:rFonts w:ascii="Times New Roman" w:eastAsia="標楷體" w:hAnsi="Times New Roman" w:cs="Times New Roman"/>
@@ -26908,7 +27050,7 @@
         </w:rPr>
         <w:t>費洛蒙正規化與融合</w:t>
       </w:r>
-      <w:bookmarkEnd w:id="46"/>
+      <w:bookmarkEnd w:id="47"/>
     </w:p>
     <w:p>
       <w:pPr>
@@ -27655,7 +27797,7 @@
           <w:szCs w:val="40"/>
         </w:rPr>
       </w:pPr>
-      <w:bookmarkStart w:id="47" w:name="_Toc213505220"/>
+      <w:bookmarkStart w:id="48" w:name="_Toc213505220"/>
       <w:r>
         <w:rPr>
           <w:rFonts w:ascii="Times New Roman" w:eastAsia="標楷體" w:hAnsi="Times New Roman" w:cs="Times New Roman"/>
@@ -27687,14 +27829,14 @@
         </w:rPr>
         <w:t>實驗與討論</w:t>
       </w:r>
-      <w:bookmarkEnd w:id="47"/>
+      <w:bookmarkEnd w:id="48"/>
     </w:p>
     <w:p>
       <w:pPr>
         <w:spacing w:line="360" w:lineRule="auto"/>
         <w:ind w:firstLine="480"/>
         <w:rPr>
-          <w:rFonts w:ascii="Times New Roman" w:eastAsia="標楷體" w:hAnsi="Times New Roman" w:cs="Times New Roman" w:hint="eastAsia"/>
+          <w:rFonts w:ascii="Times New Roman" w:eastAsia="標楷體" w:hAnsi="Times New Roman" w:cs="Times New Roman"/>
           <w:color w:val="00B0F0"/>
         </w:rPr>
       </w:pPr>
@@ -27777,6 +27919,7 @@
           <w:rFonts w:ascii="Times New Roman" w:eastAsia="標楷體" w:hAnsi="Times New Roman" w:cs="Times New Roman"/>
           <w:b/>
           <w:bCs/>
+          <w:color w:val="00B0F0"/>
           <w:sz w:val="36"/>
           <w:szCs w:val="36"/>
         </w:rPr>
@@ -27786,6 +27929,7 @@
           <w:rFonts w:ascii="Times New Roman" w:eastAsia="標楷體" w:hAnsi="Times New Roman" w:cs="Times New Roman" w:hint="eastAsia"/>
           <w:b/>
           <w:bCs/>
+          <w:color w:val="00B0F0"/>
           <w:sz w:val="36"/>
           <w:szCs w:val="36"/>
         </w:rPr>
@@ -27796,6 +27940,7 @@
           <w:rFonts w:ascii="Times New Roman" w:eastAsia="標楷體" w:hAnsi="Times New Roman" w:cs="Times New Roman" w:hint="eastAsia"/>
           <w:b/>
           <w:bCs/>
+          <w:color w:val="00B0F0"/>
           <w:sz w:val="36"/>
           <w:szCs w:val="36"/>
         </w:rPr>
@@ -27806,6 +27951,7 @@
           <w:rFonts w:ascii="Times New Roman" w:eastAsia="標楷體" w:hAnsi="Times New Roman" w:cs="Times New Roman" w:hint="eastAsia"/>
           <w:b/>
           <w:bCs/>
+          <w:color w:val="00B0F0"/>
           <w:sz w:val="36"/>
           <w:szCs w:val="36"/>
         </w:rPr>
@@ -27818,47 +27964,55 @@
         <w:ind w:firstLine="480"/>
         <w:rPr>
           <w:rFonts w:ascii="Times New Roman" w:eastAsia="標楷體" w:hAnsi="Times New Roman" w:cs="Times New Roman"/>
-        </w:rPr>
-      </w:pPr>
-      <w:r>
-        <w:rPr>
-          <w:rFonts w:ascii="Times New Roman" w:eastAsia="標楷體" w:hAnsi="Times New Roman" w:cs="Times New Roman" w:hint="eastAsia"/>
+          <w:color w:val="00B0F0"/>
+        </w:rPr>
+      </w:pPr>
+      <w:r>
+        <w:rPr>
+          <w:rFonts w:ascii="Times New Roman" w:eastAsia="標楷體" w:hAnsi="Times New Roman" w:cs="Times New Roman" w:hint="eastAsia"/>
+          <w:color w:val="00B0F0"/>
         </w:rPr>
         <w:t>本研究</w:t>
       </w:r>
       <w:r>
         <w:rPr>
           <w:rFonts w:ascii="Times New Roman" w:eastAsia="標楷體" w:hAnsi="Times New Roman" w:cs="Times New Roman" w:hint="eastAsia"/>
+          <w:color w:val="00B0F0"/>
         </w:rPr>
         <w:t>進行</w:t>
       </w:r>
       <w:r>
         <w:rPr>
           <w:rFonts w:ascii="Times New Roman" w:eastAsia="標楷體" w:hAnsi="Times New Roman" w:cs="Times New Roman" w:hint="eastAsia"/>
+          <w:color w:val="00B0F0"/>
         </w:rPr>
         <w:t>實驗</w:t>
       </w:r>
       <w:r>
         <w:rPr>
           <w:rFonts w:ascii="Times New Roman" w:eastAsia="標楷體" w:hAnsi="Times New Roman" w:cs="Times New Roman" w:hint="eastAsia"/>
+          <w:color w:val="00B0F0"/>
         </w:rPr>
         <w:t>之</w:t>
       </w:r>
       <w:r>
         <w:rPr>
           <w:rFonts w:ascii="Times New Roman" w:eastAsia="標楷體" w:hAnsi="Times New Roman" w:cs="Times New Roman" w:hint="eastAsia"/>
+          <w:color w:val="00B0F0"/>
         </w:rPr>
         <w:t>硬體</w:t>
       </w:r>
       <w:r>
         <w:rPr>
           <w:rFonts w:ascii="Times New Roman" w:eastAsia="標楷體" w:hAnsi="Times New Roman" w:cs="Times New Roman" w:hint="eastAsia"/>
+          <w:color w:val="00B0F0"/>
         </w:rPr>
         <w:t>設備規格如</w:t>
       </w:r>
       <w:r>
         <w:rPr>
           <w:rFonts w:ascii="Times New Roman" w:eastAsia="標楷體" w:hAnsi="Times New Roman" w:cs="Times New Roman" w:hint="eastAsia"/>
+          <w:color w:val="00B0F0"/>
         </w:rPr>
         <w:t>表</w:t>
       </w:r>
@@ -27886,6 +28040,7 @@
       <w:r>
         <w:rPr>
           <w:rFonts w:ascii="Times New Roman" w:eastAsia="標楷體" w:hAnsi="Times New Roman" w:cs="Times New Roman" w:hint="eastAsia"/>
+          <w:color w:val="00B0F0"/>
         </w:rPr>
         <w:t>所示。</w:t>
       </w:r>
@@ -27895,16 +28050,19 @@
         <w:pStyle w:val="af6"/>
         <w:jc w:val="center"/>
         <w:rPr>
-          <w:rFonts w:ascii="Times New Roman" w:eastAsia="標楷體" w:hAnsi="Times New Roman" w:cs="Times New Roman" w:hint="eastAsia"/>
+          <w:rFonts w:ascii="Times New Roman" w:eastAsia="標楷體" w:hAnsi="Times New Roman" w:cs="Times New Roman"/>
           <w:b/>
           <w:bCs/>
+          <w:color w:val="00B0F0"/>
           <w:sz w:val="24"/>
           <w:szCs w:val="24"/>
         </w:rPr>
       </w:pPr>
-      <w:r>
-        <w:rPr>
-          <w:rFonts w:ascii="Times New Roman" w:eastAsia="標楷體" w:hAnsi="Times New Roman" w:cs="Times New Roman"/>
+      <w:bookmarkStart w:id="49" w:name="_Toc214222534"/>
+      <w:r>
+        <w:rPr>
+          <w:rFonts w:ascii="Times New Roman" w:eastAsia="標楷體" w:hAnsi="Times New Roman" w:cs="Times New Roman"/>
+          <w:color w:val="00B0F0"/>
           <w:sz w:val="24"/>
           <w:szCs w:val="24"/>
         </w:rPr>
@@ -27913,6 +28071,7 @@
       <w:r>
         <w:rPr>
           <w:rFonts w:ascii="Times New Roman" w:eastAsia="標楷體" w:hAnsi="Times New Roman" w:cs="Times New Roman"/>
+          <w:color w:val="00B0F0"/>
           <w:sz w:val="24"/>
           <w:szCs w:val="24"/>
         </w:rPr>
@@ -27921,6 +28080,7 @@
       <w:r>
         <w:rPr>
           <w:rFonts w:ascii="Times New Roman" w:eastAsia="標楷體" w:hAnsi="Times New Roman" w:cs="Times New Roman"/>
+          <w:color w:val="00B0F0"/>
           <w:sz w:val="24"/>
           <w:szCs w:val="24"/>
         </w:rPr>
@@ -27929,6 +28089,7 @@
       <w:r>
         <w:rPr>
           <w:rFonts w:ascii="Times New Roman" w:eastAsia="標楷體" w:hAnsi="Times New Roman" w:cs="Times New Roman"/>
+          <w:color w:val="00B0F0"/>
           <w:sz w:val="24"/>
           <w:szCs w:val="24"/>
         </w:rPr>
@@ -27937,6 +28098,7 @@
       <w:r>
         <w:rPr>
           <w:rFonts w:ascii="Times New Roman" w:eastAsia="標楷體" w:hAnsi="Times New Roman" w:cs="Times New Roman"/>
+          <w:color w:val="00B0F0"/>
           <w:sz w:val="24"/>
           <w:szCs w:val="24"/>
         </w:rPr>
@@ -27945,6 +28107,7 @@
       <w:r>
         <w:rPr>
           <w:rFonts w:ascii="Times New Roman" w:eastAsia="標楷體" w:hAnsi="Times New Roman" w:cs="Times New Roman"/>
+          <w:color w:val="00B0F0"/>
           <w:sz w:val="24"/>
           <w:szCs w:val="24"/>
         </w:rPr>
@@ -27954,6 +28117,7 @@
         <w:rPr>
           <w:rFonts w:ascii="Times New Roman" w:eastAsia="標楷體" w:hAnsi="Times New Roman" w:cs="Times New Roman"/>
           <w:noProof/>
+          <w:color w:val="00B0F0"/>
           <w:sz w:val="24"/>
           <w:szCs w:val="24"/>
         </w:rPr>
@@ -27962,6 +28126,7 @@
       <w:r>
         <w:rPr>
           <w:rFonts w:ascii="Times New Roman" w:eastAsia="標楷體" w:hAnsi="Times New Roman" w:cs="Times New Roman"/>
+          <w:color w:val="00B0F0"/>
           <w:sz w:val="24"/>
           <w:szCs w:val="24"/>
         </w:rPr>
@@ -27970,11 +28135,13 @@
       <w:r>
         <w:rPr>
           <w:rFonts w:ascii="Times New Roman" w:eastAsia="標楷體" w:hAnsi="Times New Roman" w:cs="Times New Roman" w:hint="eastAsia"/>
+          <w:color w:val="00B0F0"/>
           <w:sz w:val="24"/>
           <w:szCs w:val="24"/>
         </w:rPr>
         <w:t>實驗設備規格表</w:t>
       </w:r>
+      <w:bookmarkEnd w:id="49"/>
     </w:p>
     <w:tbl>
       <w:tblPr>
@@ -27997,18 +28164,21 @@
               <w:widowControl/>
               <w:spacing w:line="360" w:lineRule="auto"/>
               <w:rPr>
+                <w:rFonts w:ascii="Times New Roman" w:eastAsia="標楷體" w:hAnsi="Times New Roman" w:cs="Times New Roman"/>
+                <w:color w:val="00B0F0"/>
+              </w:rPr>
+            </w:pPr>
+            <w:r>
+              <w:rPr>
                 <w:rFonts w:ascii="Times New Roman" w:eastAsia="標楷體" w:hAnsi="Times New Roman" w:cs="Times New Roman" w:hint="eastAsia"/>
-              </w:rPr>
-            </w:pPr>
+                <w:color w:val="00B0F0"/>
+              </w:rPr>
+              <w:t>中央處理器</w:t>
+            </w:r>
             <w:r>
               <w:rPr>
                 <w:rFonts w:ascii="Times New Roman" w:eastAsia="標楷體" w:hAnsi="Times New Roman" w:cs="Times New Roman" w:hint="eastAsia"/>
-              </w:rPr>
-              <w:t>中央處理器</w:t>
-            </w:r>
-            <w:r>
-              <w:rPr>
-                <w:rFonts w:ascii="Times New Roman" w:eastAsia="標楷體" w:hAnsi="Times New Roman" w:cs="Times New Roman" w:hint="eastAsia"/>
+                <w:color w:val="00B0F0"/>
               </w:rPr>
               <w:t>(CPU)</w:t>
             </w:r>
@@ -28022,7 +28192,8 @@
             <w:pPr>
               <w:widowControl/>
               <w:rPr>
-                <w:rFonts w:ascii="Times New Roman" w:eastAsia="標楷體" w:hAnsi="Times New Roman" w:cs="Times New Roman" w:hint="eastAsia"/>
+                <w:rFonts w:ascii="Times New Roman" w:eastAsia="標楷體" w:hAnsi="Times New Roman" w:cs="Times New Roman"/>
+                <w:color w:val="00B0F0"/>
               </w:rPr>
             </w:pPr>
           </w:p>
@@ -28038,18 +28209,21 @@
               <w:widowControl/>
               <w:spacing w:line="360" w:lineRule="auto"/>
               <w:rPr>
+                <w:rFonts w:ascii="Times New Roman" w:eastAsia="標楷體" w:hAnsi="Times New Roman" w:cs="Times New Roman"/>
+                <w:color w:val="00B0F0"/>
+              </w:rPr>
+            </w:pPr>
+            <w:r>
+              <w:rPr>
                 <w:rFonts w:ascii="Times New Roman" w:eastAsia="標楷體" w:hAnsi="Times New Roman" w:cs="Times New Roman" w:hint="eastAsia"/>
-              </w:rPr>
-            </w:pPr>
+                <w:color w:val="00B0F0"/>
+              </w:rPr>
+              <w:t>顯示卡</w:t>
+            </w:r>
             <w:r>
               <w:rPr>
                 <w:rFonts w:ascii="Times New Roman" w:eastAsia="標楷體" w:hAnsi="Times New Roman" w:cs="Times New Roman" w:hint="eastAsia"/>
-              </w:rPr>
-              <w:t>顯示卡</w:t>
-            </w:r>
-            <w:r>
-              <w:rPr>
-                <w:rFonts w:ascii="Times New Roman" w:eastAsia="標楷體" w:hAnsi="Times New Roman" w:cs="Times New Roman" w:hint="eastAsia"/>
+                <w:color w:val="00B0F0"/>
               </w:rPr>
               <w:t>(GPU)</w:t>
             </w:r>
@@ -28063,7 +28237,8 @@
             <w:pPr>
               <w:widowControl/>
               <w:rPr>
-                <w:rFonts w:ascii="Times New Roman" w:eastAsia="標楷體" w:hAnsi="Times New Roman" w:cs="Times New Roman" w:hint="eastAsia"/>
+                <w:rFonts w:ascii="Times New Roman" w:eastAsia="標楷體" w:hAnsi="Times New Roman" w:cs="Times New Roman"/>
+                <w:color w:val="00B0F0"/>
               </w:rPr>
             </w:pPr>
           </w:p>
@@ -28079,12 +28254,14 @@
               <w:widowControl/>
               <w:spacing w:line="360" w:lineRule="auto"/>
               <w:rPr>
+                <w:rFonts w:ascii="Times New Roman" w:eastAsia="標楷體" w:hAnsi="Times New Roman" w:cs="Times New Roman"/>
+                <w:color w:val="00B0F0"/>
+              </w:rPr>
+            </w:pPr>
+            <w:r>
+              <w:rPr>
                 <w:rFonts w:ascii="Times New Roman" w:eastAsia="標楷體" w:hAnsi="Times New Roman" w:cs="Times New Roman" w:hint="eastAsia"/>
-              </w:rPr>
-            </w:pPr>
-            <w:r>
-              <w:rPr>
-                <w:rFonts w:ascii="Times New Roman" w:eastAsia="標楷體" w:hAnsi="Times New Roman" w:cs="Times New Roman" w:hint="eastAsia"/>
+                <w:color w:val="00B0F0"/>
               </w:rPr>
               <w:t>記憶體</w:t>
             </w:r>
@@ -28098,7 +28275,8 @@
             <w:pPr>
               <w:widowControl/>
               <w:rPr>
-                <w:rFonts w:ascii="Times New Roman" w:eastAsia="標楷體" w:hAnsi="Times New Roman" w:cs="Times New Roman" w:hint="eastAsia"/>
+                <w:rFonts w:ascii="Times New Roman" w:eastAsia="標楷體" w:hAnsi="Times New Roman" w:cs="Times New Roman"/>
+                <w:color w:val="00B0F0"/>
               </w:rPr>
             </w:pPr>
           </w:p>
@@ -28114,12 +28292,14 @@
               <w:widowControl/>
               <w:spacing w:line="360" w:lineRule="auto"/>
               <w:rPr>
+                <w:rFonts w:ascii="Times New Roman" w:eastAsia="標楷體" w:hAnsi="Times New Roman" w:cs="Times New Roman"/>
+                <w:color w:val="00B0F0"/>
+              </w:rPr>
+            </w:pPr>
+            <w:r>
+              <w:rPr>
                 <w:rFonts w:ascii="Times New Roman" w:eastAsia="標楷體" w:hAnsi="Times New Roman" w:cs="Times New Roman" w:hint="eastAsia"/>
-              </w:rPr>
-            </w:pPr>
-            <w:r>
-              <w:rPr>
-                <w:rFonts w:ascii="Times New Roman" w:eastAsia="標楷體" w:hAnsi="Times New Roman" w:cs="Times New Roman" w:hint="eastAsia"/>
+                <w:color w:val="00B0F0"/>
               </w:rPr>
               <w:t>硬碟</w:t>
             </w:r>
@@ -28133,7 +28313,8 @@
             <w:pPr>
               <w:widowControl/>
               <w:rPr>
-                <w:rFonts w:ascii="Times New Roman" w:eastAsia="標楷體" w:hAnsi="Times New Roman" w:cs="Times New Roman" w:hint="eastAsia"/>
+                <w:rFonts w:ascii="Times New Roman" w:eastAsia="標楷體" w:hAnsi="Times New Roman" w:cs="Times New Roman"/>
+                <w:color w:val="00B0F0"/>
               </w:rPr>
             </w:pPr>
           </w:p>
@@ -28149,12 +28330,14 @@
               <w:widowControl/>
               <w:spacing w:line="360" w:lineRule="auto"/>
               <w:rPr>
+                <w:rFonts w:ascii="Times New Roman" w:eastAsia="標楷體" w:hAnsi="Times New Roman" w:cs="Times New Roman"/>
+                <w:color w:val="00B0F0"/>
+              </w:rPr>
+            </w:pPr>
+            <w:r>
+              <w:rPr>
                 <w:rFonts w:ascii="Times New Roman" w:eastAsia="標楷體" w:hAnsi="Times New Roman" w:cs="Times New Roman" w:hint="eastAsia"/>
-              </w:rPr>
-            </w:pPr>
-            <w:r>
-              <w:rPr>
-                <w:rFonts w:ascii="Times New Roman" w:eastAsia="標楷體" w:hAnsi="Times New Roman" w:cs="Times New Roman" w:hint="eastAsia"/>
+                <w:color w:val="00B0F0"/>
               </w:rPr>
               <w:t>作業系統</w:t>
             </w:r>
@@ -28168,7 +28351,8 @@
             <w:pPr>
               <w:widowControl/>
               <w:rPr>
-                <w:rFonts w:ascii="Times New Roman" w:eastAsia="標楷體" w:hAnsi="Times New Roman" w:cs="Times New Roman" w:hint="eastAsia"/>
+                <w:rFonts w:ascii="Times New Roman" w:eastAsia="標楷體" w:hAnsi="Times New Roman" w:cs="Times New Roman"/>
+                <w:color w:val="00B0F0"/>
               </w:rPr>
             </w:pPr>
           </w:p>
@@ -28180,6 +28364,212 @@
         <w:widowControl/>
         <w:rPr>
           <w:rFonts w:ascii="Times New Roman" w:eastAsia="標楷體" w:hAnsi="Times New Roman" w:cs="Times New Roman"/>
+          <w:color w:val="00B0F0"/>
+        </w:rPr>
+      </w:pPr>
+    </w:p>
+    <w:p>
+      <w:pPr>
+        <w:widowControl/>
+        <w:outlineLvl w:val="0"/>
+        <w:rPr>
+          <w:rFonts w:ascii="Times New Roman" w:eastAsia="標楷體" w:hAnsi="Times New Roman" w:cs="Times New Roman"/>
+          <w:b/>
+          <w:bCs/>
+          <w:color w:val="00B0F0"/>
+          <w:sz w:val="36"/>
+          <w:szCs w:val="36"/>
+        </w:rPr>
+      </w:pPr>
+      <w:r>
+        <w:rPr>
+          <w:rFonts w:ascii="Times New Roman" w:eastAsia="標楷體" w:hAnsi="Times New Roman" w:cs="Times New Roman" w:hint="eastAsia"/>
+          <w:b/>
+          <w:bCs/>
+          <w:color w:val="00B0F0"/>
+          <w:sz w:val="36"/>
+          <w:szCs w:val="36"/>
+        </w:rPr>
+        <w:t xml:space="preserve">4.2 </w:t>
+      </w:r>
+      <w:r>
+        <w:rPr>
+          <w:rFonts w:ascii="Times New Roman" w:eastAsia="標楷體" w:hAnsi="Times New Roman" w:cs="Times New Roman" w:hint="eastAsia"/>
+          <w:b/>
+          <w:bCs/>
+          <w:color w:val="00B0F0"/>
+          <w:sz w:val="36"/>
+          <w:szCs w:val="36"/>
+        </w:rPr>
+        <w:t>評估基準</w:t>
+      </w:r>
+    </w:p>
+    <w:p>
+      <w:pPr>
+        <w:widowControl/>
+        <w:rPr>
+          <w:rFonts w:ascii="Times New Roman" w:eastAsia="標楷體" w:hAnsi="Times New Roman" w:cs="Times New Roman"/>
+          <w:color w:val="00B0F0"/>
+        </w:rPr>
+      </w:pPr>
+      <w:r>
+        <w:rPr>
+          <w:rFonts w:ascii="Times New Roman" w:eastAsia="標楷體" w:hAnsi="Times New Roman" w:cs="Times New Roman"/>
+          <w:color w:val="00B0F0"/>
+        </w:rPr>
+        <w:tab/>
+      </w:r>
+    </w:p>
+    <w:p>
+      <w:pPr>
+        <w:widowControl/>
+        <w:rPr>
+          <w:rFonts w:ascii="Times New Roman" w:eastAsia="標楷體" w:hAnsi="Times New Roman" w:cs="Times New Roman"/>
+          <w:color w:val="00B0F0"/>
+        </w:rPr>
+      </w:pPr>
+    </w:p>
+    <w:p>
+      <w:pPr>
+        <w:widowControl/>
+        <w:outlineLvl w:val="0"/>
+        <w:rPr>
+          <w:rFonts w:ascii="Times New Roman" w:eastAsia="標楷體" w:hAnsi="Times New Roman" w:cs="Times New Roman"/>
+          <w:b/>
+          <w:bCs/>
+          <w:color w:val="00B0F0"/>
+          <w:sz w:val="36"/>
+          <w:szCs w:val="36"/>
+        </w:rPr>
+      </w:pPr>
+      <w:r>
+        <w:rPr>
+          <w:rFonts w:ascii="Times New Roman" w:eastAsia="標楷體" w:hAnsi="Times New Roman" w:cs="Times New Roman" w:hint="eastAsia"/>
+          <w:b/>
+          <w:bCs/>
+          <w:color w:val="00B0F0"/>
+          <w:sz w:val="36"/>
+          <w:szCs w:val="36"/>
+        </w:rPr>
+        <w:t>4.</w:t>
+      </w:r>
+      <w:r>
+        <w:rPr>
+          <w:rFonts w:ascii="Times New Roman" w:eastAsia="標楷體" w:hAnsi="Times New Roman" w:cs="Times New Roman" w:hint="eastAsia"/>
+          <w:b/>
+          <w:bCs/>
+          <w:color w:val="00B0F0"/>
+          <w:sz w:val="36"/>
+          <w:szCs w:val="36"/>
+        </w:rPr>
+        <w:t>3</w:t>
+      </w:r>
+      <w:r>
+        <w:rPr>
+          <w:rFonts w:ascii="Times New Roman" w:eastAsia="標楷體" w:hAnsi="Times New Roman" w:cs="Times New Roman" w:hint="eastAsia"/>
+          <w:b/>
+          <w:bCs/>
+          <w:color w:val="00B0F0"/>
+          <w:sz w:val="36"/>
+          <w:szCs w:val="36"/>
+        </w:rPr>
+        <w:t xml:space="preserve"> </w:t>
+      </w:r>
+      <w:r>
+        <w:rPr>
+          <w:rFonts w:ascii="Times New Roman" w:eastAsia="標楷體" w:hAnsi="Times New Roman" w:cs="Times New Roman" w:hint="eastAsia"/>
+          <w:b/>
+          <w:bCs/>
+          <w:color w:val="00B0F0"/>
+          <w:sz w:val="36"/>
+          <w:szCs w:val="36"/>
+        </w:rPr>
+        <w:t>實驗方法</w:t>
+      </w:r>
+    </w:p>
+    <w:p>
+      <w:pPr>
+        <w:widowControl/>
+        <w:rPr>
+          <w:rFonts w:ascii="Times New Roman" w:eastAsia="標楷體" w:hAnsi="Times New Roman" w:cs="Times New Roman"/>
+          <w:color w:val="00B0F0"/>
+        </w:rPr>
+      </w:pPr>
+    </w:p>
+    <w:p>
+      <w:pPr>
+        <w:widowControl/>
+        <w:outlineLvl w:val="0"/>
+        <w:rPr>
+          <w:rFonts w:ascii="Times New Roman" w:eastAsia="標楷體" w:hAnsi="Times New Roman" w:cs="Times New Roman"/>
+          <w:b/>
+          <w:bCs/>
+          <w:color w:val="00B0F0"/>
+          <w:sz w:val="36"/>
+          <w:szCs w:val="36"/>
+        </w:rPr>
+      </w:pPr>
+      <w:r>
+        <w:rPr>
+          <w:rFonts w:ascii="Times New Roman" w:eastAsia="標楷體" w:hAnsi="Times New Roman" w:cs="Times New Roman" w:hint="eastAsia"/>
+          <w:b/>
+          <w:bCs/>
+          <w:color w:val="00B0F0"/>
+          <w:sz w:val="36"/>
+          <w:szCs w:val="36"/>
+        </w:rPr>
+        <w:t>4.</w:t>
+      </w:r>
+      <w:r>
+        <w:rPr>
+          <w:rFonts w:ascii="Times New Roman" w:eastAsia="標楷體" w:hAnsi="Times New Roman" w:cs="Times New Roman" w:hint="eastAsia"/>
+          <w:b/>
+          <w:bCs/>
+          <w:color w:val="00B0F0"/>
+          <w:sz w:val="36"/>
+          <w:szCs w:val="36"/>
+        </w:rPr>
+        <w:t>4</w:t>
+      </w:r>
+      <w:r>
+        <w:rPr>
+          <w:rFonts w:ascii="Times New Roman" w:eastAsia="標楷體" w:hAnsi="Times New Roman" w:cs="Times New Roman" w:hint="eastAsia"/>
+          <w:b/>
+          <w:bCs/>
+          <w:color w:val="00B0F0"/>
+          <w:sz w:val="36"/>
+          <w:szCs w:val="36"/>
+        </w:rPr>
+        <w:t xml:space="preserve"> </w:t>
+      </w:r>
+      <w:r>
+        <w:rPr>
+          <w:rFonts w:ascii="Times New Roman" w:eastAsia="標楷體" w:hAnsi="Times New Roman" w:cs="Times New Roman" w:hint="eastAsia"/>
+          <w:b/>
+          <w:bCs/>
+          <w:color w:val="00B0F0"/>
+          <w:sz w:val="36"/>
+          <w:szCs w:val="36"/>
+        </w:rPr>
+        <w:t>實驗</w:t>
+      </w:r>
+      <w:r>
+        <w:rPr>
+          <w:rFonts w:ascii="Times New Roman" w:eastAsia="標楷體" w:hAnsi="Times New Roman" w:cs="Times New Roman" w:hint="eastAsia"/>
+          <w:b/>
+          <w:bCs/>
+          <w:color w:val="00B0F0"/>
+          <w:sz w:val="36"/>
+          <w:szCs w:val="36"/>
+        </w:rPr>
+        <w:t>結果討論</w:t>
+      </w:r>
+    </w:p>
+    <w:p>
+      <w:pPr>
+        <w:widowControl/>
+        <w:rPr>
+          <w:rFonts w:ascii="Times New Roman" w:eastAsia="標楷體" w:hAnsi="Times New Roman" w:cs="Times New Roman"/>
         </w:rPr>
       </w:pPr>
     </w:p>
@@ -28219,7 +28609,7 @@
           <w:szCs w:val="40"/>
         </w:rPr>
       </w:pPr>
-      <w:bookmarkStart w:id="48" w:name="_Toc213505221"/>
+      <w:bookmarkStart w:id="50" w:name="_Toc213505221"/>
       <w:r>
         <w:rPr>
           <w:rFonts w:ascii="Times New Roman" w:eastAsia="標楷體" w:hAnsi="Times New Roman" w:cs="Times New Roman"/>
@@ -28251,7 +28641,7 @@
         </w:rPr>
         <w:t>結論與未來方向</w:t>
       </w:r>
-      <w:bookmarkEnd w:id="48"/>
+      <w:bookmarkEnd w:id="50"/>
     </w:p>
     <w:p>
       <w:pPr>
@@ -28294,8 +28684,8 @@
           <w:szCs w:val="40"/>
         </w:rPr>
       </w:pPr>
-      <w:bookmarkStart w:id="49" w:name="_Toc205218997"/>
-      <w:bookmarkStart w:id="50" w:name="_Toc213505222"/>
+      <w:bookmarkStart w:id="51" w:name="_Toc205218997"/>
+      <w:bookmarkStart w:id="52" w:name="_Toc213505222"/>
       <w:r>
         <w:rPr>
           <w:rFonts w:ascii="Times New Roman" w:eastAsia="標楷體" w:hAnsi="Times New Roman" w:cs="Times New Roman"/>
@@ -28307,14 +28697,14 @@
         <w:lastRenderedPageBreak/>
         <w:t>參考文獻</w:t>
       </w:r>
-      <w:bookmarkEnd w:id="49"/>
-      <w:bookmarkEnd w:id="50"/>
+      <w:bookmarkEnd w:id="51"/>
+      <w:bookmarkEnd w:id="52"/>
     </w:p>
     <w:p>
       <w:pPr>
         <w:ind w:left="480" w:hanging="480"/>
         <w:rPr>
-          <w:rFonts w:ascii="Times New Roman" w:eastAsia="標楷體" w:hAnsi="Times New Roman" w:cs="Times New Roman"/>
+          <w:rFonts w:ascii="Times New Roman" w:eastAsia="標楷體" w:hAnsi="Times New Roman" w:cs="Times New Roman" w:hint="eastAsia"/>
         </w:rPr>
       </w:pPr>
       <w:r>
@@ -28353,7 +28743,7 @@
     <w:p>
       <w:pPr>
         <w:rPr>
-          <w:rFonts w:ascii="Times New Roman" w:eastAsia="標楷體" w:hAnsi="Times New Roman" w:cs="Times New Roman"/>
+          <w:rFonts w:ascii="Times New Roman" w:eastAsia="標楷體" w:hAnsi="Times New Roman" w:cs="Times New Roman" w:hint="eastAsia"/>
           <w:b/>
           <w:bCs/>
         </w:rPr>
@@ -30549,7 +30939,7 @@
   <w:style w:type="paragraph" w:default="1" w:styleId="a">
     <w:name w:val="Normal"/>
     <w:qFormat/>
-    <w:rsid w:val="00D012B9"/>
+    <w:rsid w:val="009929FF"/>
     <w:pPr>
       <w:widowControl w:val="0"/>
     </w:pPr>
@@ -30755,7 +31145,6 @@
   <w:style w:type="character" w:default="1" w:styleId="a0">
     <w:name w:val="Default Paragraph Font"/>
     <w:uiPriority w:val="1"/>
-    <w:semiHidden/>
     <w:unhideWhenUsed/>
   </w:style>
   <w:style w:type="table" w:default="1" w:styleId="a1">

</xml_diff>